<commit_message>
docs: expand public analysis; state measured ban latency
Co-Authored-By: Claude Sonnet 5.5 <noreply@anthropic.com>
</commit_message>
<xml_diff>
--- a/docs/forensic/Zoraxy-Forensic-Network-Analysis-Oct2026-rev1.7-PUBLIC.docx
+++ b/docs/forensic/Zoraxy-Forensic-Network-Analysis-Oct2026-rev1.7-PUBLIC.docx
@@ -8195,6 +8195,3795 @@
     </w:p>
     <w:p>
       <w:pPr>
+        <w:pStyle w:val="Heading2"/>
+        <w:pBdr>
+          <w:bottom w:val="single" w:color="1F3864" w:sz="6"/>
+        </w:pBdr>
+        <w:spacing w:after="120" w:before="240"/>
+      </w:pPr>
+      <w:r>
+        <w:t xml:space="preserve">4.4 Where the banned addresses come from</w:t>
+      </w:r>
+    </w:p>
+    <w:p>
+      <w:pPr>
+        <w:spacing w:after="120"/>
+        <w:jc w:val="left"/>
+      </w:pPr>
+      <w:r>
+        <w:rPr>
+          <w:sz w:val="20"/>
+          <w:szCs w:val="20"/>
+        </w:rPr>
+        <w:t xml:space="preserve">Ninety-four distinct addresses were banned between 1 and 21 October (92 IPv4, 2 IPv6). Network registration was looked up from public routing data; it names the registered operator of the address, not who is behind it, and it is an inference about origin.</w:t>
+      </w:r>
+    </w:p>
+    <w:tbl>
+      <w:tblPr>
+        <w:tblW w:type="dxa" w:w="9500"/>
+        <w:tblBorders>
+          <w:top w:val="single" w:color="auto" w:sz="4"/>
+          <w:left w:val="single" w:color="auto" w:sz="4"/>
+          <w:bottom w:val="single" w:color="auto" w:sz="4"/>
+          <w:right w:val="single" w:color="auto" w:sz="4"/>
+          <w:insideH w:val="single" w:color="auto" w:sz="4"/>
+          <w:insideV w:val="single" w:color="auto" w:sz="4"/>
+        </w:tblBorders>
+        <w:tblLayout w:type="fixed"/>
+        <w:tblCellMar>
+          <w:top w:type="dxa" w:w="60"/>
+          <w:left w:type="dxa" w:w="80"/>
+          <w:bottom w:type="dxa" w:w="60"/>
+          <w:right w:type="dxa" w:w="80"/>
+        </w:tblCellMar>
+      </w:tblPr>
+      <w:tblGrid>
+        <w:gridCol w:w="6300"/>
+        <w:gridCol w:w="1600"/>
+        <w:gridCol w:w="1600"/>
+      </w:tblGrid>
+      <w:tr>
+        <w:trPr>
+          <w:tblHeader/>
+        </w:trPr>
+        <w:tc>
+          <w:tcPr>
+            <w:tcW w:w="6300" w:type="dxa"/>
+            <w:shd w:fill="1F3864" w:color="1F3864" w:val="solid"/>
+            <w:tcMar>
+              <w:top w:type="dxa" w:w="60"/>
+              <w:left w:type="dxa" w:w="80"/>
+              <w:bottom w:type="dxa" w:w="60"/>
+              <w:right w:type="dxa" w:w="80"/>
+            </w:tcMar>
+          </w:tcPr>
+          <w:p>
+            <w:pPr>
+              <w:jc w:val="center"/>
+            </w:pPr>
+            <w:r>
+              <w:rPr>
+                <w:b/>
+                <w:bCs/>
+                <w:color w:val="FFFFFF"/>
+                <w:sz w:val="18"/>
+                <w:szCs w:val="18"/>
+              </w:rPr>
+              <w:t xml:space="preserve">Network operator</w:t>
+            </w:r>
+          </w:p>
+        </w:tc>
+        <w:tc>
+          <w:tcPr>
+            <w:tcW w:w="1600" w:type="dxa"/>
+            <w:shd w:fill="1F3864" w:color="1F3864" w:val="solid"/>
+            <w:tcMar>
+              <w:top w:type="dxa" w:w="60"/>
+              <w:left w:type="dxa" w:w="80"/>
+              <w:bottom w:type="dxa" w:w="60"/>
+              <w:right w:type="dxa" w:w="80"/>
+            </w:tcMar>
+          </w:tcPr>
+          <w:p>
+            <w:pPr>
+              <w:jc w:val="center"/>
+            </w:pPr>
+            <w:r>
+              <w:rPr>
+                <w:b/>
+                <w:bCs/>
+                <w:color w:val="FFFFFF"/>
+                <w:sz w:val="18"/>
+                <w:szCs w:val="18"/>
+              </w:rPr>
+              <w:t xml:space="preserve">Addresses</w:t>
+            </w:r>
+          </w:p>
+        </w:tc>
+        <w:tc>
+          <w:tcPr>
+            <w:tcW w:w="1600" w:type="dxa"/>
+            <w:shd w:fill="1F3864" w:color="1F3864" w:val="solid"/>
+            <w:tcMar>
+              <w:top w:type="dxa" w:w="60"/>
+              <w:left w:type="dxa" w:w="80"/>
+              <w:bottom w:type="dxa" w:w="60"/>
+              <w:right w:type="dxa" w:w="80"/>
+            </w:tcMar>
+          </w:tcPr>
+          <w:p>
+            <w:pPr>
+              <w:jc w:val="center"/>
+            </w:pPr>
+            <w:r>
+              <w:rPr>
+                <w:b/>
+                <w:bCs/>
+                <w:color w:val="FFFFFF"/>
+                <w:sz w:val="18"/>
+                <w:szCs w:val="18"/>
+              </w:rPr>
+              <w:t xml:space="preserve">Share</w:t>
+            </w:r>
+          </w:p>
+        </w:tc>
+      </w:tr>
+      <w:tr>
+        <w:tc>
+          <w:tcPr>
+            <w:tcW w:w="6300" w:type="dxa"/>
+            <w:tcMar>
+              <w:top w:type="dxa" w:w="60"/>
+              <w:left w:type="dxa" w:w="80"/>
+              <w:bottom w:type="dxa" w:w="60"/>
+              <w:right w:type="dxa" w:w="80"/>
+            </w:tcMar>
+          </w:tcPr>
+          <w:p>
+            <w:pPr>
+              <w:jc w:val="left"/>
+            </w:pPr>
+            <w:r>
+              <w:rPr>
+                <w:b w:val="false"/>
+                <w:bCs w:val="false"/>
+                <w:sz w:val="18"/>
+                <w:szCs w:val="18"/>
+              </w:rPr>
+              <w:t xml:space="preserve">Google Cloud</w:t>
+            </w:r>
+          </w:p>
+        </w:tc>
+        <w:tc>
+          <w:tcPr>
+            <w:tcW w:w="1600" w:type="dxa"/>
+            <w:tcMar>
+              <w:top w:type="dxa" w:w="60"/>
+              <w:left w:type="dxa" w:w="80"/>
+              <w:bottom w:type="dxa" w:w="60"/>
+              <w:right w:type="dxa" w:w="80"/>
+            </w:tcMar>
+          </w:tcPr>
+          <w:p>
+            <w:pPr>
+              <w:jc w:val="right"/>
+            </w:pPr>
+            <w:r>
+              <w:rPr>
+                <w:b w:val="false"/>
+                <w:bCs w:val="false"/>
+                <w:sz w:val="18"/>
+                <w:szCs w:val="18"/>
+              </w:rPr>
+              <w:t xml:space="preserve">44</w:t>
+            </w:r>
+          </w:p>
+        </w:tc>
+        <w:tc>
+          <w:tcPr>
+            <w:tcW w:w="1600" w:type="dxa"/>
+            <w:tcMar>
+              <w:top w:type="dxa" w:w="60"/>
+              <w:left w:type="dxa" w:w="80"/>
+              <w:bottom w:type="dxa" w:w="60"/>
+              <w:right w:type="dxa" w:w="80"/>
+            </w:tcMar>
+          </w:tcPr>
+          <w:p>
+            <w:pPr>
+              <w:jc w:val="right"/>
+            </w:pPr>
+            <w:r>
+              <w:rPr>
+                <w:b w:val="false"/>
+                <w:bCs w:val="false"/>
+                <w:sz w:val="18"/>
+                <w:szCs w:val="18"/>
+              </w:rPr>
+              <w:t xml:space="preserve">47%</w:t>
+            </w:r>
+          </w:p>
+        </w:tc>
+      </w:tr>
+      <w:tr>
+        <w:tc>
+          <w:tcPr>
+            <w:tcW w:w="6300" w:type="dxa"/>
+            <w:tcMar>
+              <w:top w:type="dxa" w:w="60"/>
+              <w:left w:type="dxa" w:w="80"/>
+              <w:bottom w:type="dxa" w:w="60"/>
+              <w:right w:type="dxa" w:w="80"/>
+            </w:tcMar>
+          </w:tcPr>
+          <w:p>
+            <w:pPr>
+              <w:jc w:val="left"/>
+            </w:pPr>
+            <w:r>
+              <w:rPr>
+                <w:b w:val="false"/>
+                <w:bCs w:val="false"/>
+                <w:sz w:val="18"/>
+                <w:szCs w:val="18"/>
+              </w:rPr>
+              <w:t xml:space="preserve">DigitalOcean</w:t>
+            </w:r>
+          </w:p>
+        </w:tc>
+        <w:tc>
+          <w:tcPr>
+            <w:tcW w:w="1600" w:type="dxa"/>
+            <w:tcMar>
+              <w:top w:type="dxa" w:w="60"/>
+              <w:left w:type="dxa" w:w="80"/>
+              <w:bottom w:type="dxa" w:w="60"/>
+              <w:right w:type="dxa" w:w="80"/>
+            </w:tcMar>
+          </w:tcPr>
+          <w:p>
+            <w:pPr>
+              <w:jc w:val="right"/>
+            </w:pPr>
+            <w:r>
+              <w:rPr>
+                <w:b w:val="false"/>
+                <w:bCs w:val="false"/>
+                <w:sz w:val="18"/>
+                <w:szCs w:val="18"/>
+              </w:rPr>
+              <w:t xml:space="preserve">32</w:t>
+            </w:r>
+          </w:p>
+        </w:tc>
+        <w:tc>
+          <w:tcPr>
+            <w:tcW w:w="1600" w:type="dxa"/>
+            <w:tcMar>
+              <w:top w:type="dxa" w:w="60"/>
+              <w:left w:type="dxa" w:w="80"/>
+              <w:bottom w:type="dxa" w:w="60"/>
+              <w:right w:type="dxa" w:w="80"/>
+            </w:tcMar>
+          </w:tcPr>
+          <w:p>
+            <w:pPr>
+              <w:jc w:val="right"/>
+            </w:pPr>
+            <w:r>
+              <w:rPr>
+                <w:b w:val="false"/>
+                <w:bCs w:val="false"/>
+                <w:sz w:val="18"/>
+                <w:szCs w:val="18"/>
+              </w:rPr>
+              <w:t xml:space="preserve">34%</w:t>
+            </w:r>
+          </w:p>
+        </w:tc>
+      </w:tr>
+      <w:tr>
+        <w:tc>
+          <w:tcPr>
+            <w:tcW w:w="6300" w:type="dxa"/>
+            <w:tcMar>
+              <w:top w:type="dxa" w:w="60"/>
+              <w:left w:type="dxa" w:w="80"/>
+              <w:bottom w:type="dxa" w:w="60"/>
+              <w:right w:type="dxa" w:w="80"/>
+            </w:tcMar>
+          </w:tcPr>
+          <w:p>
+            <w:pPr>
+              <w:jc w:val="left"/>
+            </w:pPr>
+            <w:r>
+              <w:rPr>
+                <w:b w:val="false"/>
+                <w:bCs w:val="false"/>
+                <w:sz w:val="18"/>
+                <w:szCs w:val="18"/>
+              </w:rPr>
+              <w:t xml:space="preserve">A Hong Kong data-centre operator</w:t>
+            </w:r>
+          </w:p>
+        </w:tc>
+        <w:tc>
+          <w:tcPr>
+            <w:tcW w:w="1600" w:type="dxa"/>
+            <w:tcMar>
+              <w:top w:type="dxa" w:w="60"/>
+              <w:left w:type="dxa" w:w="80"/>
+              <w:bottom w:type="dxa" w:w="60"/>
+              <w:right w:type="dxa" w:w="80"/>
+            </w:tcMar>
+          </w:tcPr>
+          <w:p>
+            <w:pPr>
+              <w:jc w:val="right"/>
+            </w:pPr>
+            <w:r>
+              <w:rPr>
+                <w:b w:val="false"/>
+                <w:bCs w:val="false"/>
+                <w:sz w:val="18"/>
+                <w:szCs w:val="18"/>
+              </w:rPr>
+              <w:t xml:space="preserve">5</w:t>
+            </w:r>
+          </w:p>
+        </w:tc>
+        <w:tc>
+          <w:tcPr>
+            <w:tcW w:w="1600" w:type="dxa"/>
+            <w:tcMar>
+              <w:top w:type="dxa" w:w="60"/>
+              <w:left w:type="dxa" w:w="80"/>
+              <w:bottom w:type="dxa" w:w="60"/>
+              <w:right w:type="dxa" w:w="80"/>
+            </w:tcMar>
+          </w:tcPr>
+          <w:p>
+            <w:pPr>
+              <w:jc w:val="right"/>
+            </w:pPr>
+            <w:r>
+              <w:rPr>
+                <w:b w:val="false"/>
+                <w:bCs w:val="false"/>
+                <w:sz w:val="18"/>
+                <w:szCs w:val="18"/>
+              </w:rPr>
+              <w:t xml:space="preserve">5%</w:t>
+            </w:r>
+          </w:p>
+        </w:tc>
+      </w:tr>
+      <w:tr>
+        <w:tc>
+          <w:tcPr>
+            <w:tcW w:w="6300" w:type="dxa"/>
+            <w:tcMar>
+              <w:top w:type="dxa" w:w="60"/>
+              <w:left w:type="dxa" w:w="80"/>
+              <w:bottom w:type="dxa" w:w="60"/>
+              <w:right w:type="dxa" w:w="80"/>
+            </w:tcMar>
+          </w:tcPr>
+          <w:p>
+            <w:pPr>
+              <w:jc w:val="left"/>
+            </w:pPr>
+            <w:r>
+              <w:rPr>
+                <w:b w:val="false"/>
+                <w:bCs w:val="false"/>
+                <w:sz w:val="18"/>
+                <w:szCs w:val="18"/>
+              </w:rPr>
+              <w:t xml:space="preserve">A Chinese carrier backbone</w:t>
+            </w:r>
+          </w:p>
+        </w:tc>
+        <w:tc>
+          <w:tcPr>
+            <w:tcW w:w="1600" w:type="dxa"/>
+            <w:tcMar>
+              <w:top w:type="dxa" w:w="60"/>
+              <w:left w:type="dxa" w:w="80"/>
+              <w:bottom w:type="dxa" w:w="60"/>
+              <w:right w:type="dxa" w:w="80"/>
+            </w:tcMar>
+          </w:tcPr>
+          <w:p>
+            <w:pPr>
+              <w:jc w:val="right"/>
+            </w:pPr>
+            <w:r>
+              <w:rPr>
+                <w:b w:val="false"/>
+                <w:bCs w:val="false"/>
+                <w:sz w:val="18"/>
+                <w:szCs w:val="18"/>
+              </w:rPr>
+              <w:t xml:space="preserve">2</w:t>
+            </w:r>
+          </w:p>
+        </w:tc>
+        <w:tc>
+          <w:tcPr>
+            <w:tcW w:w="1600" w:type="dxa"/>
+            <w:tcMar>
+              <w:top w:type="dxa" w:w="60"/>
+              <w:left w:type="dxa" w:w="80"/>
+              <w:bottom w:type="dxa" w:w="60"/>
+              <w:right w:type="dxa" w:w="80"/>
+            </w:tcMar>
+          </w:tcPr>
+          <w:p>
+            <w:pPr>
+              <w:jc w:val="right"/>
+            </w:pPr>
+            <w:r>
+              <w:rPr>
+                <w:b w:val="false"/>
+                <w:bCs w:val="false"/>
+                <w:sz w:val="18"/>
+                <w:szCs w:val="18"/>
+              </w:rPr>
+              <w:t xml:space="preserve">2%</w:t>
+            </w:r>
+          </w:p>
+        </w:tc>
+      </w:tr>
+      <w:tr>
+        <w:tc>
+          <w:tcPr>
+            <w:tcW w:w="6300" w:type="dxa"/>
+            <w:tcMar>
+              <w:top w:type="dxa" w:w="60"/>
+              <w:left w:type="dxa" w:w="80"/>
+              <w:bottom w:type="dxa" w:w="60"/>
+              <w:right w:type="dxa" w:w="80"/>
+            </w:tcMar>
+          </w:tcPr>
+          <w:p>
+            <w:pPr>
+              <w:jc w:val="left"/>
+            </w:pPr>
+            <w:r>
+              <w:rPr>
+                <w:b w:val="false"/>
+                <w:bCs w:val="false"/>
+                <w:sz w:val="18"/>
+                <w:szCs w:val="18"/>
+              </w:rPr>
+              <w:t xml:space="preserve">Cloudflare’s consumer relay service (outside its edge ranges)</w:t>
+            </w:r>
+          </w:p>
+        </w:tc>
+        <w:tc>
+          <w:tcPr>
+            <w:tcW w:w="1600" w:type="dxa"/>
+            <w:tcMar>
+              <w:top w:type="dxa" w:w="60"/>
+              <w:left w:type="dxa" w:w="80"/>
+              <w:bottom w:type="dxa" w:w="60"/>
+              <w:right w:type="dxa" w:w="80"/>
+            </w:tcMar>
+          </w:tcPr>
+          <w:p>
+            <w:pPr>
+              <w:jc w:val="right"/>
+            </w:pPr>
+            <w:r>
+              <w:rPr>
+                <w:b w:val="false"/>
+                <w:bCs w:val="false"/>
+                <w:sz w:val="18"/>
+                <w:szCs w:val="18"/>
+              </w:rPr>
+              <w:t xml:space="preserve">2</w:t>
+            </w:r>
+          </w:p>
+        </w:tc>
+        <w:tc>
+          <w:tcPr>
+            <w:tcW w:w="1600" w:type="dxa"/>
+            <w:tcMar>
+              <w:top w:type="dxa" w:w="60"/>
+              <w:left w:type="dxa" w:w="80"/>
+              <w:bottom w:type="dxa" w:w="60"/>
+              <w:right w:type="dxa" w:w="80"/>
+            </w:tcMar>
+          </w:tcPr>
+          <w:p>
+            <w:pPr>
+              <w:jc w:val="right"/>
+            </w:pPr>
+            <w:r>
+              <w:rPr>
+                <w:b w:val="false"/>
+                <w:bCs w:val="false"/>
+                <w:sz w:val="18"/>
+                <w:szCs w:val="18"/>
+              </w:rPr>
+              <w:t xml:space="preserve">2%</w:t>
+            </w:r>
+          </w:p>
+        </w:tc>
+      </w:tr>
+      <w:tr>
+        <w:tc>
+          <w:tcPr>
+            <w:tcW w:w="6300" w:type="dxa"/>
+            <w:tcMar>
+              <w:top w:type="dxa" w:w="60"/>
+              <w:left w:type="dxa" w:w="80"/>
+              <w:bottom w:type="dxa" w:w="60"/>
+              <w:right w:type="dxa" w:w="80"/>
+            </w:tcMar>
+          </w:tcPr>
+          <w:p>
+            <w:pPr>
+              <w:jc w:val="left"/>
+            </w:pPr>
+            <w:r>
+              <w:rPr>
+                <w:b w:val="false"/>
+                <w:bCs w:val="false"/>
+                <w:sz w:val="18"/>
+                <w:szCs w:val="18"/>
+              </w:rPr>
+              <w:t xml:space="preserve">A US hosting provider</w:t>
+            </w:r>
+          </w:p>
+        </w:tc>
+        <w:tc>
+          <w:tcPr>
+            <w:tcW w:w="1600" w:type="dxa"/>
+            <w:tcMar>
+              <w:top w:type="dxa" w:w="60"/>
+              <w:left w:type="dxa" w:w="80"/>
+              <w:bottom w:type="dxa" w:w="60"/>
+              <w:right w:type="dxa" w:w="80"/>
+            </w:tcMar>
+          </w:tcPr>
+          <w:p>
+            <w:pPr>
+              <w:jc w:val="right"/>
+            </w:pPr>
+            <w:r>
+              <w:rPr>
+                <w:b w:val="false"/>
+                <w:bCs w:val="false"/>
+                <w:sz w:val="18"/>
+                <w:szCs w:val="18"/>
+              </w:rPr>
+              <w:t xml:space="preserve">2</w:t>
+            </w:r>
+          </w:p>
+        </w:tc>
+        <w:tc>
+          <w:tcPr>
+            <w:tcW w:w="1600" w:type="dxa"/>
+            <w:tcMar>
+              <w:top w:type="dxa" w:w="60"/>
+              <w:left w:type="dxa" w:w="80"/>
+              <w:bottom w:type="dxa" w:w="60"/>
+              <w:right w:type="dxa" w:w="80"/>
+            </w:tcMar>
+          </w:tcPr>
+          <w:p>
+            <w:pPr>
+              <w:jc w:val="right"/>
+            </w:pPr>
+            <w:r>
+              <w:rPr>
+                <w:b w:val="false"/>
+                <w:bCs w:val="false"/>
+                <w:sz w:val="18"/>
+                <w:szCs w:val="18"/>
+              </w:rPr>
+              <w:t xml:space="preserve">2%</w:t>
+            </w:r>
+          </w:p>
+        </w:tc>
+      </w:tr>
+      <w:tr>
+        <w:tc>
+          <w:tcPr>
+            <w:tcW w:w="6300" w:type="dxa"/>
+            <w:tcMar>
+              <w:top w:type="dxa" w:w="60"/>
+              <w:left w:type="dxa" w:w="80"/>
+              <w:bottom w:type="dxa" w:w="60"/>
+              <w:right w:type="dxa" w:w="80"/>
+            </w:tcMar>
+          </w:tcPr>
+          <w:p>
+            <w:pPr>
+              <w:jc w:val="left"/>
+            </w:pPr>
+            <w:r>
+              <w:rPr>
+                <w:b w:val="false"/>
+                <w:bCs w:val="false"/>
+                <w:sz w:val="18"/>
+                <w:szCs w:val="18"/>
+              </w:rPr>
+              <w:t xml:space="preserve">Seven other hosting providers, one address each (Tencent, and companies in the US, UK, Russia, Ukraine and the Seychelles)</w:t>
+            </w:r>
+          </w:p>
+        </w:tc>
+        <w:tc>
+          <w:tcPr>
+            <w:tcW w:w="1600" w:type="dxa"/>
+            <w:tcMar>
+              <w:top w:type="dxa" w:w="60"/>
+              <w:left w:type="dxa" w:w="80"/>
+              <w:bottom w:type="dxa" w:w="60"/>
+              <w:right w:type="dxa" w:w="80"/>
+            </w:tcMar>
+          </w:tcPr>
+          <w:p>
+            <w:pPr>
+              <w:jc w:val="right"/>
+            </w:pPr>
+            <w:r>
+              <w:rPr>
+                <w:b w:val="false"/>
+                <w:bCs w:val="false"/>
+                <w:sz w:val="18"/>
+                <w:szCs w:val="18"/>
+              </w:rPr>
+              <w:t xml:space="preserve">7</w:t>
+            </w:r>
+          </w:p>
+        </w:tc>
+        <w:tc>
+          <w:tcPr>
+            <w:tcW w:w="1600" w:type="dxa"/>
+            <w:tcMar>
+              <w:top w:type="dxa" w:w="60"/>
+              <w:left w:type="dxa" w:w="80"/>
+              <w:bottom w:type="dxa" w:w="60"/>
+              <w:right w:type="dxa" w:w="80"/>
+            </w:tcMar>
+          </w:tcPr>
+          <w:p>
+            <w:pPr>
+              <w:jc w:val="right"/>
+            </w:pPr>
+            <w:r>
+              <w:rPr>
+                <w:b w:val="false"/>
+                <w:bCs w:val="false"/>
+                <w:sz w:val="18"/>
+                <w:szCs w:val="18"/>
+              </w:rPr>
+              <w:t xml:space="preserve">7%</w:t>
+            </w:r>
+          </w:p>
+        </w:tc>
+      </w:tr>
+    </w:tbl>
+    <w:p>
+      <w:pPr>
+        <w:spacing w:after="60"/>
+      </w:pPr>
+    </w:p>
+    <w:p>
+      <w:pPr>
+        <w:spacing w:after="120"/>
+        <w:jc w:val="left"/>
+      </w:pPr>
+      <w:r>
+        <w:rPr>
+          <w:sz w:val="20"/>
+          <w:szCs w:val="20"/>
+        </w:rPr>
+        <w:t xml:space="preserve">Four in five come from two cloud providers, which is why a rule that challenges verified-bot claims from cloud ranges is cheap and effective. The two addresses from Cloudflare’s relay service are worth a note: they probed for version-control metadata, they are not part of Cloudflare’s published proxy ranges (which the plugin never bans), and a consumer relay is an easy way for a scanner to look like ordinary traffic.</w:t>
+      </w:r>
+    </w:p>
+    <w:p>
+      <w:pPr>
+        <w:pStyle w:val="Heading2"/>
+        <w:pBdr>
+          <w:bottom w:val="single" w:color="1F3864" w:sz="6"/>
+        </w:pBdr>
+        <w:spacing w:after="120" w:before="240"/>
+      </w:pPr>
+      <w:r>
+        <w:t xml:space="preserve">4.5 How fast a ban lands</w:t>
+      </w:r>
+    </w:p>
+    <w:p>
+      <w:pPr>
+        <w:spacing w:after="120"/>
+        <w:jc w:val="left"/>
+      </w:pPr>
+      <w:r>
+        <w:rPr>
+          <w:sz w:val="20"/>
+          <w:szCs w:val="20"/>
+        </w:rPr>
+        <w:t xml:space="preserve">Measured from the request that triggered the detector to the plugin’s ban, for the 77 banned addresses that have matching lines in the October access log (the rest were banned from earlier requests or by an event relayed from the proxy).</w:t>
+      </w:r>
+    </w:p>
+    <w:tbl>
+      <w:tblPr>
+        <w:tblW w:type="dxa" w:w="9500"/>
+        <w:tblBorders>
+          <w:top w:val="single" w:color="auto" w:sz="4"/>
+          <w:left w:val="single" w:color="auto" w:sz="4"/>
+          <w:bottom w:val="single" w:color="auto" w:sz="4"/>
+          <w:right w:val="single" w:color="auto" w:sz="4"/>
+          <w:insideH w:val="single" w:color="auto" w:sz="4"/>
+          <w:insideV w:val="single" w:color="auto" w:sz="4"/>
+        </w:tblBorders>
+        <w:tblLayout w:type="fixed"/>
+        <w:tblCellMar>
+          <w:top w:type="dxa" w:w="60"/>
+          <w:left w:type="dxa" w:w="80"/>
+          <w:bottom w:type="dxa" w:w="60"/>
+          <w:right w:type="dxa" w:w="80"/>
+        </w:tblCellMar>
+      </w:tblPr>
+      <w:tblGrid>
+        <w:gridCol w:w="4300"/>
+        <w:gridCol w:w="1000"/>
+        <w:gridCol w:w="1200"/>
+        <w:gridCol w:w="3000"/>
+      </w:tblGrid>
+      <w:tr>
+        <w:trPr>
+          <w:tblHeader/>
+        </w:trPr>
+        <w:tc>
+          <w:tcPr>
+            <w:tcW w:w="4300" w:type="dxa"/>
+            <w:shd w:fill="1F3864" w:color="1F3864" w:val="solid"/>
+            <w:tcMar>
+              <w:top w:type="dxa" w:w="60"/>
+              <w:left w:type="dxa" w:w="80"/>
+              <w:bottom w:type="dxa" w:w="60"/>
+              <w:right w:type="dxa" w:w="80"/>
+            </w:tcMar>
+          </w:tcPr>
+          <w:p>
+            <w:pPr>
+              <w:jc w:val="center"/>
+            </w:pPr>
+            <w:r>
+              <w:rPr>
+                <w:b/>
+                <w:bCs/>
+                <w:color w:val="FFFFFF"/>
+                <w:sz w:val="18"/>
+                <w:szCs w:val="18"/>
+              </w:rPr>
+              <w:t xml:space="preserve">Detector</w:t>
+            </w:r>
+          </w:p>
+        </w:tc>
+        <w:tc>
+          <w:tcPr>
+            <w:tcW w:w="1000" w:type="dxa"/>
+            <w:shd w:fill="1F3864" w:color="1F3864" w:val="solid"/>
+            <w:tcMar>
+              <w:top w:type="dxa" w:w="60"/>
+              <w:left w:type="dxa" w:w="80"/>
+              <w:bottom w:type="dxa" w:w="60"/>
+              <w:right w:type="dxa" w:w="80"/>
+            </w:tcMar>
+          </w:tcPr>
+          <w:p>
+            <w:pPr>
+              <w:jc w:val="center"/>
+            </w:pPr>
+            <w:r>
+              <w:rPr>
+                <w:b/>
+                <w:bCs/>
+                <w:color w:val="FFFFFF"/>
+                <w:sz w:val="18"/>
+                <w:szCs w:val="18"/>
+              </w:rPr>
+              <w:t xml:space="preserve">Bans</w:t>
+            </w:r>
+          </w:p>
+        </w:tc>
+        <w:tc>
+          <w:tcPr>
+            <w:tcW w:w="1200" w:type="dxa"/>
+            <w:shd w:fill="1F3864" w:color="1F3864" w:val="solid"/>
+            <w:tcMar>
+              <w:top w:type="dxa" w:w="60"/>
+              <w:left w:type="dxa" w:w="80"/>
+              <w:bottom w:type="dxa" w:w="60"/>
+              <w:right w:type="dxa" w:w="80"/>
+            </w:tcMar>
+          </w:tcPr>
+          <w:p>
+            <w:pPr>
+              <w:jc w:val="center"/>
+            </w:pPr>
+            <w:r>
+              <w:rPr>
+                <w:b/>
+                <w:bCs/>
+                <w:color w:val="FFFFFF"/>
+                <w:sz w:val="18"/>
+                <w:szCs w:val="18"/>
+              </w:rPr>
+              <w:t xml:space="preserve">Median</w:t>
+            </w:r>
+          </w:p>
+        </w:tc>
+        <w:tc>
+          <w:tcPr>
+            <w:tcW w:w="3000" w:type="dxa"/>
+            <w:shd w:fill="1F3864" w:color="1F3864" w:val="solid"/>
+            <w:tcMar>
+              <w:top w:type="dxa" w:w="60"/>
+              <w:left w:type="dxa" w:w="80"/>
+              <w:bottom w:type="dxa" w:w="60"/>
+              <w:right w:type="dxa" w:w="80"/>
+            </w:tcMar>
+          </w:tcPr>
+          <w:p>
+            <w:pPr>
+              <w:jc w:val="center"/>
+            </w:pPr>
+            <w:r>
+              <w:rPr>
+                <w:b/>
+                <w:bCs/>
+                <w:color w:val="FFFFFF"/>
+                <w:sz w:val="18"/>
+                <w:szCs w:val="18"/>
+              </w:rPr>
+              <w:t xml:space="preserve">Range</w:t>
+            </w:r>
+          </w:p>
+        </w:tc>
+      </w:tr>
+      <w:tr>
+        <w:tc>
+          <w:tcPr>
+            <w:tcW w:w="4300" w:type="dxa"/>
+            <w:tcMar>
+              <w:top w:type="dxa" w:w="60"/>
+              <w:left w:type="dxa" w:w="80"/>
+              <w:bottom w:type="dxa" w:w="60"/>
+              <w:right w:type="dxa" w:w="80"/>
+            </w:tcMar>
+          </w:tcPr>
+          <w:p>
+            <w:pPr>
+              <w:jc w:val="left"/>
+            </w:pPr>
+            <w:r>
+              <w:rPr>
+                <w:b w:val="false"/>
+                <w:bCs w:val="false"/>
+                <w:sz w:val="18"/>
+                <w:szCs w:val="18"/>
+              </w:rPr>
+              <w:t xml:space="preserve">Sensitive-path probe</w:t>
+            </w:r>
+          </w:p>
+        </w:tc>
+        <w:tc>
+          <w:tcPr>
+            <w:tcW w:w="1000" w:type="dxa"/>
+            <w:tcMar>
+              <w:top w:type="dxa" w:w="60"/>
+              <w:left w:type="dxa" w:w="80"/>
+              <w:bottom w:type="dxa" w:w="60"/>
+              <w:right w:type="dxa" w:w="80"/>
+            </w:tcMar>
+          </w:tcPr>
+          <w:p>
+            <w:pPr>
+              <w:jc w:val="right"/>
+            </w:pPr>
+            <w:r>
+              <w:rPr>
+                <w:b w:val="false"/>
+                <w:bCs w:val="false"/>
+                <w:sz w:val="18"/>
+                <w:szCs w:val="18"/>
+              </w:rPr>
+              <w:t xml:space="preserve">63</w:t>
+            </w:r>
+          </w:p>
+        </w:tc>
+        <w:tc>
+          <w:tcPr>
+            <w:tcW w:w="1200" w:type="dxa"/>
+            <w:tcMar>
+              <w:top w:type="dxa" w:w="60"/>
+              <w:left w:type="dxa" w:w="80"/>
+              <w:bottom w:type="dxa" w:w="60"/>
+              <w:right w:type="dxa" w:w="80"/>
+            </w:tcMar>
+          </w:tcPr>
+          <w:p>
+            <w:pPr>
+              <w:jc w:val="right"/>
+            </w:pPr>
+            <w:r>
+              <w:rPr>
+                <w:b w:val="false"/>
+                <w:bCs w:val="false"/>
+                <w:sz w:val="18"/>
+                <w:szCs w:val="18"/>
+              </w:rPr>
+              <w:t xml:space="preserve">2 s</w:t>
+            </w:r>
+          </w:p>
+        </w:tc>
+        <w:tc>
+          <w:tcPr>
+            <w:tcW w:w="3000" w:type="dxa"/>
+            <w:tcMar>
+              <w:top w:type="dxa" w:w="60"/>
+              <w:left w:type="dxa" w:w="80"/>
+              <w:bottom w:type="dxa" w:w="60"/>
+              <w:right w:type="dxa" w:w="80"/>
+            </w:tcMar>
+          </w:tcPr>
+          <w:p>
+            <w:pPr>
+              <w:jc w:val="left"/>
+            </w:pPr>
+            <w:r>
+              <w:rPr>
+                <w:b w:val="false"/>
+                <w:bCs w:val="false"/>
+                <w:sz w:val="18"/>
+                <w:szCs w:val="18"/>
+              </w:rPr>
+              <w:t xml:space="preserve">1 to 4 s</w:t>
+            </w:r>
+          </w:p>
+        </w:tc>
+      </w:tr>
+      <w:tr>
+        <w:tc>
+          <w:tcPr>
+            <w:tcW w:w="4300" w:type="dxa"/>
+            <w:tcMar>
+              <w:top w:type="dxa" w:w="60"/>
+              <w:left w:type="dxa" w:w="80"/>
+              <w:bottom w:type="dxa" w:w="60"/>
+              <w:right w:type="dxa" w:w="80"/>
+            </w:tcMar>
+          </w:tcPr>
+          <w:p>
+            <w:pPr>
+              <w:jc w:val="left"/>
+            </w:pPr>
+            <w:r>
+              <w:rPr>
+                <w:b w:val="false"/>
+                <w:bCs w:val="false"/>
+                <w:sz w:val="18"/>
+                <w:szCs w:val="18"/>
+              </w:rPr>
+              <w:t xml:space="preserve">Relayed from the proxy’s own blacklist</w:t>
+            </w:r>
+          </w:p>
+        </w:tc>
+        <w:tc>
+          <w:tcPr>
+            <w:tcW w:w="1000" w:type="dxa"/>
+            <w:tcMar>
+              <w:top w:type="dxa" w:w="60"/>
+              <w:left w:type="dxa" w:w="80"/>
+              <w:bottom w:type="dxa" w:w="60"/>
+              <w:right w:type="dxa" w:w="80"/>
+            </w:tcMar>
+          </w:tcPr>
+          <w:p>
+            <w:pPr>
+              <w:jc w:val="right"/>
+            </w:pPr>
+            <w:r>
+              <w:rPr>
+                <w:b w:val="false"/>
+                <w:bCs w:val="false"/>
+                <w:sz w:val="18"/>
+                <w:szCs w:val="18"/>
+              </w:rPr>
+              <w:t xml:space="preserve">4</w:t>
+            </w:r>
+          </w:p>
+        </w:tc>
+        <w:tc>
+          <w:tcPr>
+            <w:tcW w:w="1200" w:type="dxa"/>
+            <w:tcMar>
+              <w:top w:type="dxa" w:w="60"/>
+              <w:left w:type="dxa" w:w="80"/>
+              <w:bottom w:type="dxa" w:w="60"/>
+              <w:right w:type="dxa" w:w="80"/>
+            </w:tcMar>
+          </w:tcPr>
+          <w:p>
+            <w:pPr>
+              <w:jc w:val="right"/>
+            </w:pPr>
+            <w:r>
+              <w:rPr>
+                <w:b w:val="false"/>
+                <w:bCs w:val="false"/>
+                <w:sz w:val="18"/>
+                <w:szCs w:val="18"/>
+              </w:rPr>
+              <w:t xml:space="preserve">1 s</w:t>
+            </w:r>
+          </w:p>
+        </w:tc>
+        <w:tc>
+          <w:tcPr>
+            <w:tcW w:w="3000" w:type="dxa"/>
+            <w:tcMar>
+              <w:top w:type="dxa" w:w="60"/>
+              <w:left w:type="dxa" w:w="80"/>
+              <w:bottom w:type="dxa" w:w="60"/>
+              <w:right w:type="dxa" w:w="80"/>
+            </w:tcMar>
+          </w:tcPr>
+          <w:p>
+            <w:pPr>
+              <w:jc w:val="left"/>
+            </w:pPr>
+            <w:r>
+              <w:rPr>
+                <w:b w:val="false"/>
+                <w:bCs w:val="false"/>
+                <w:sz w:val="18"/>
+                <w:szCs w:val="18"/>
+              </w:rPr>
+              <w:t xml:space="preserve">1 to 2 s</w:t>
+            </w:r>
+          </w:p>
+        </w:tc>
+      </w:tr>
+      <w:tr>
+        <w:tc>
+          <w:tcPr>
+            <w:tcW w:w="4300" w:type="dxa"/>
+            <w:tcMar>
+              <w:top w:type="dxa" w:w="60"/>
+              <w:left w:type="dxa" w:w="80"/>
+              <w:bottom w:type="dxa" w:w="60"/>
+              <w:right w:type="dxa" w:w="80"/>
+            </w:tcMar>
+          </w:tcPr>
+          <w:p>
+            <w:pPr>
+              <w:jc w:val="left"/>
+            </w:pPr>
+            <w:r>
+              <w:rPr>
+                <w:b w:val="false"/>
+                <w:bCs w:val="false"/>
+                <w:sz w:val="18"/>
+                <w:szCs w:val="18"/>
+              </w:rPr>
+              <w:t xml:space="preserve">Error burst (more than 30 errors in 60 s, by design)</w:t>
+            </w:r>
+          </w:p>
+        </w:tc>
+        <w:tc>
+          <w:tcPr>
+            <w:tcW w:w="1000" w:type="dxa"/>
+            <w:tcMar>
+              <w:top w:type="dxa" w:w="60"/>
+              <w:left w:type="dxa" w:w="80"/>
+              <w:bottom w:type="dxa" w:w="60"/>
+              <w:right w:type="dxa" w:w="80"/>
+            </w:tcMar>
+          </w:tcPr>
+          <w:p>
+            <w:pPr>
+              <w:jc w:val="right"/>
+            </w:pPr>
+            <w:r>
+              <w:rPr>
+                <w:b w:val="false"/>
+                <w:bCs w:val="false"/>
+                <w:sz w:val="18"/>
+                <w:szCs w:val="18"/>
+              </w:rPr>
+              <w:t xml:space="preserve">9</w:t>
+            </w:r>
+          </w:p>
+        </w:tc>
+        <w:tc>
+          <w:tcPr>
+            <w:tcW w:w="1200" w:type="dxa"/>
+            <w:tcMar>
+              <w:top w:type="dxa" w:w="60"/>
+              <w:left w:type="dxa" w:w="80"/>
+              <w:bottom w:type="dxa" w:w="60"/>
+              <w:right w:type="dxa" w:w="80"/>
+            </w:tcMar>
+          </w:tcPr>
+          <w:p>
+            <w:pPr>
+              <w:jc w:val="right"/>
+            </w:pPr>
+            <w:r>
+              <w:rPr>
+                <w:b w:val="false"/>
+                <w:bCs w:val="false"/>
+                <w:sz w:val="18"/>
+                <w:szCs w:val="18"/>
+              </w:rPr>
+              <w:t xml:space="preserve">32 s</w:t>
+            </w:r>
+          </w:p>
+        </w:tc>
+        <w:tc>
+          <w:tcPr>
+            <w:tcW w:w="3000" w:type="dxa"/>
+            <w:tcMar>
+              <w:top w:type="dxa" w:w="60"/>
+              <w:left w:type="dxa" w:w="80"/>
+              <w:bottom w:type="dxa" w:w="60"/>
+              <w:right w:type="dxa" w:w="80"/>
+            </w:tcMar>
+          </w:tcPr>
+          <w:p>
+            <w:pPr>
+              <w:jc w:val="left"/>
+            </w:pPr>
+            <w:r>
+              <w:rPr>
+                <w:b w:val="false"/>
+                <w:bCs w:val="false"/>
+                <w:sz w:val="18"/>
+                <w:szCs w:val="18"/>
+              </w:rPr>
+              <w:t xml:space="preserve">3 to 46 s</w:t>
+            </w:r>
+          </w:p>
+        </w:tc>
+      </w:tr>
+      <w:tr>
+        <w:tc>
+          <w:tcPr>
+            <w:tcW w:w="4300" w:type="dxa"/>
+            <w:tcMar>
+              <w:top w:type="dxa" w:w="60"/>
+              <w:left w:type="dxa" w:w="80"/>
+              <w:bottom w:type="dxa" w:w="60"/>
+              <w:right w:type="dxa" w:w="80"/>
+            </w:tcMar>
+          </w:tcPr>
+          <w:p>
+            <w:pPr>
+              <w:jc w:val="left"/>
+            </w:pPr>
+            <w:r>
+              <w:rPr>
+                <w:b w:val="false"/>
+                <w:bCs w:val="false"/>
+                <w:sz w:val="18"/>
+                <w:szCs w:val="18"/>
+              </w:rPr>
+              <w:t xml:space="preserve">Exploit pattern</w:t>
+            </w:r>
+          </w:p>
+        </w:tc>
+        <w:tc>
+          <w:tcPr>
+            <w:tcW w:w="1000" w:type="dxa"/>
+            <w:tcMar>
+              <w:top w:type="dxa" w:w="60"/>
+              <w:left w:type="dxa" w:w="80"/>
+              <w:bottom w:type="dxa" w:w="60"/>
+              <w:right w:type="dxa" w:w="80"/>
+            </w:tcMar>
+          </w:tcPr>
+          <w:p>
+            <w:pPr>
+              <w:jc w:val="right"/>
+            </w:pPr>
+            <w:r>
+              <w:rPr>
+                <w:b w:val="false"/>
+                <w:bCs w:val="false"/>
+                <w:sz w:val="18"/>
+                <w:szCs w:val="18"/>
+              </w:rPr>
+              <w:t xml:space="preserve">1</w:t>
+            </w:r>
+          </w:p>
+        </w:tc>
+        <w:tc>
+          <w:tcPr>
+            <w:tcW w:w="1200" w:type="dxa"/>
+            <w:tcMar>
+              <w:top w:type="dxa" w:w="60"/>
+              <w:left w:type="dxa" w:w="80"/>
+              <w:bottom w:type="dxa" w:w="60"/>
+              <w:right w:type="dxa" w:w="80"/>
+            </w:tcMar>
+          </w:tcPr>
+          <w:p>
+            <w:pPr>
+              <w:jc w:val="right"/>
+            </w:pPr>
+            <w:r>
+              <w:rPr>
+                <w:b w:val="false"/>
+                <w:bCs w:val="false"/>
+                <w:sz w:val="18"/>
+                <w:szCs w:val="18"/>
+              </w:rPr>
+              <w:t xml:space="preserve">5 s</w:t>
+            </w:r>
+          </w:p>
+        </w:tc>
+        <w:tc>
+          <w:tcPr>
+            <w:tcW w:w="3000" w:type="dxa"/>
+            <w:tcMar>
+              <w:top w:type="dxa" w:w="60"/>
+              <w:left w:type="dxa" w:w="80"/>
+              <w:bottom w:type="dxa" w:w="60"/>
+              <w:right w:type="dxa" w:w="80"/>
+            </w:tcMar>
+          </w:tcPr>
+          <w:p>
+            <w:pPr>
+              <w:jc w:val="left"/>
+            </w:pPr>
+            <w:r>
+              <w:rPr>
+                <w:b w:val="false"/>
+                <w:bCs w:val="false"/>
+                <w:sz w:val="18"/>
+                <w:szCs w:val="18"/>
+              </w:rPr>
+              <w:t xml:space="preserve">5 s</w:t>
+            </w:r>
+          </w:p>
+        </w:tc>
+      </w:tr>
+      <w:tr>
+        <w:tc>
+          <w:tcPr>
+            <w:tcW w:w="4300" w:type="dxa"/>
+            <w:tcMar>
+              <w:top w:type="dxa" w:w="60"/>
+              <w:left w:type="dxa" w:w="80"/>
+              <w:bottom w:type="dxa" w:w="60"/>
+              <w:right w:type="dxa" w:w="80"/>
+            </w:tcMar>
+          </w:tcPr>
+          <w:p>
+            <w:pPr>
+              <w:jc w:val="left"/>
+            </w:pPr>
+            <w:r>
+              <w:rPr>
+                <w:b w:val="false"/>
+                <w:bCs w:val="false"/>
+                <w:sz w:val="18"/>
+                <w:szCs w:val="18"/>
+              </w:rPr>
+              <w:t xml:space="preserve">All</w:t>
+            </w:r>
+          </w:p>
+        </w:tc>
+        <w:tc>
+          <w:tcPr>
+            <w:tcW w:w="1000" w:type="dxa"/>
+            <w:tcMar>
+              <w:top w:type="dxa" w:w="60"/>
+              <w:left w:type="dxa" w:w="80"/>
+              <w:bottom w:type="dxa" w:w="60"/>
+              <w:right w:type="dxa" w:w="80"/>
+            </w:tcMar>
+          </w:tcPr>
+          <w:p>
+            <w:pPr>
+              <w:jc w:val="right"/>
+            </w:pPr>
+            <w:r>
+              <w:rPr>
+                <w:b w:val="false"/>
+                <w:bCs w:val="false"/>
+                <w:sz w:val="18"/>
+                <w:szCs w:val="18"/>
+              </w:rPr>
+              <w:t xml:space="preserve">77</w:t>
+            </w:r>
+          </w:p>
+        </w:tc>
+        <w:tc>
+          <w:tcPr>
+            <w:tcW w:w="1200" w:type="dxa"/>
+            <w:tcMar>
+              <w:top w:type="dxa" w:w="60"/>
+              <w:left w:type="dxa" w:w="80"/>
+              <w:bottom w:type="dxa" w:w="60"/>
+              <w:right w:type="dxa" w:w="80"/>
+            </w:tcMar>
+          </w:tcPr>
+          <w:p>
+            <w:pPr>
+              <w:jc w:val="right"/>
+            </w:pPr>
+            <w:r>
+              <w:rPr>
+                <w:b w:val="false"/>
+                <w:bCs w:val="false"/>
+                <w:sz w:val="18"/>
+                <w:szCs w:val="18"/>
+              </w:rPr>
+              <w:t xml:space="preserve">3 s</w:t>
+            </w:r>
+          </w:p>
+        </w:tc>
+        <w:tc>
+          <w:tcPr>
+            <w:tcW w:w="3000" w:type="dxa"/>
+            <w:tcMar>
+              <w:top w:type="dxa" w:w="60"/>
+              <w:left w:type="dxa" w:w="80"/>
+              <w:bottom w:type="dxa" w:w="60"/>
+              <w:right w:type="dxa" w:w="80"/>
+            </w:tcMar>
+          </w:tcPr>
+          <w:p>
+            <w:pPr>
+              <w:jc w:val="left"/>
+            </w:pPr>
+            <w:r>
+              <w:rPr>
+                <w:b w:val="false"/>
+                <w:bCs w:val="false"/>
+                <w:sz w:val="18"/>
+                <w:szCs w:val="18"/>
+              </w:rPr>
+              <w:t xml:space="preserve">71 of 77 within 5 s; 72 within 10 s</w:t>
+            </w:r>
+          </w:p>
+        </w:tc>
+      </w:tr>
+    </w:tbl>
+    <w:p>
+      <w:pPr>
+        <w:spacing w:after="60"/>
+      </w:pPr>
+    </w:p>
+    <w:p>
+      <w:pPr>
+        <w:spacing w:after="120"/>
+        <w:jc w:val="left"/>
+      </w:pPr>
+      <w:r>
+        <w:rPr>
+          <w:sz w:val="20"/>
+          <w:szCs w:val="20"/>
+        </w:rPr>
+        <w:t xml:space="preserve">The path detector is fast because it needs one request; the error detector has to wait for the evidence, which is the cost of avoiding false positives on a busy site. What matters is what happens next. While an address was banned, 581 of its requests still reached the proxy, and every one was refused by the proxy’s blacklist; none reached an application. Two addresses banned on 1 October returned on 16 and 18 October, after the 14-day expiry, and were banned again within seconds. The 60 requests they made in between reached applications; that is the cost of expiry, and the reason to keep it long enough to matter and short enough to avoid punishing recycled addresses.</w:t>
+      </w:r>
+    </w:p>
+    <w:p>
+      <w:pPr>
+        <w:pStyle w:val="Heading2"/>
+        <w:pBdr>
+          <w:bottom w:val="single" w:color="1F3864" w:sz="6"/>
+        </w:pBdr>
+        <w:spacing w:after="120" w:before="240"/>
+      </w:pPr>
+      <w:r>
+        <w:t xml:space="preserve">4.6 What the scanners ask for</w:t>
+      </w:r>
+    </w:p>
+    <w:p>
+      <w:pPr>
+        <w:spacing w:after="120"/>
+        <w:jc w:val="left"/>
+      </w:pPr>
+      <w:r>
+        <w:rPr>
+          <w:sz w:val="20"/>
+          <w:szCs w:val="20"/>
+        </w:rPr>
+        <w:t xml:space="preserve">The 77 banned addresses with log lines made 3,238 requests for 628 distinct paths. Grouped by the kind of data they are hunting:</w:t>
+      </w:r>
+    </w:p>
+    <w:tbl>
+      <w:tblPr>
+        <w:tblW w:type="dxa" w:w="9500"/>
+        <w:tblBorders>
+          <w:top w:val="single" w:color="auto" w:sz="4"/>
+          <w:left w:val="single" w:color="auto" w:sz="4"/>
+          <w:bottom w:val="single" w:color="auto" w:sz="4"/>
+          <w:right w:val="single" w:color="auto" w:sz="4"/>
+          <w:insideH w:val="single" w:color="auto" w:sz="4"/>
+          <w:insideV w:val="single" w:color="auto" w:sz="4"/>
+        </w:tblBorders>
+        <w:tblLayout w:type="fixed"/>
+        <w:tblCellMar>
+          <w:top w:type="dxa" w:w="60"/>
+          <w:left w:type="dxa" w:w="80"/>
+          <w:bottom w:type="dxa" w:w="60"/>
+          <w:right w:type="dxa" w:w="80"/>
+        </w:tblCellMar>
+      </w:tblPr>
+      <w:tblGrid>
+        <w:gridCol w:w="8000"/>
+        <w:gridCol w:w="1500"/>
+      </w:tblGrid>
+      <w:tr>
+        <w:trPr>
+          <w:tblHeader/>
+        </w:trPr>
+        <w:tc>
+          <w:tcPr>
+            <w:tcW w:w="8000" w:type="dxa"/>
+            <w:shd w:fill="1F3864" w:color="1F3864" w:val="solid"/>
+            <w:tcMar>
+              <w:top w:type="dxa" w:w="60"/>
+              <w:left w:type="dxa" w:w="80"/>
+              <w:bottom w:type="dxa" w:w="60"/>
+              <w:right w:type="dxa" w:w="80"/>
+            </w:tcMar>
+          </w:tcPr>
+          <w:p>
+            <w:pPr>
+              <w:jc w:val="center"/>
+            </w:pPr>
+            <w:r>
+              <w:rPr>
+                <w:b/>
+                <w:bCs/>
+                <w:color w:val="FFFFFF"/>
+                <w:sz w:val="18"/>
+                <w:szCs w:val="18"/>
+              </w:rPr>
+              <w:t xml:space="preserve">Family</w:t>
+            </w:r>
+          </w:p>
+        </w:tc>
+        <w:tc>
+          <w:tcPr>
+            <w:tcW w:w="1500" w:type="dxa"/>
+            <w:shd w:fill="1F3864" w:color="1F3864" w:val="solid"/>
+            <w:tcMar>
+              <w:top w:type="dxa" w:w="60"/>
+              <w:left w:type="dxa" w:w="80"/>
+              <w:bottom w:type="dxa" w:w="60"/>
+              <w:right w:type="dxa" w:w="80"/>
+            </w:tcMar>
+          </w:tcPr>
+          <w:p>
+            <w:pPr>
+              <w:jc w:val="center"/>
+            </w:pPr>
+            <w:r>
+              <w:rPr>
+                <w:b/>
+                <w:bCs/>
+                <w:color w:val="FFFFFF"/>
+                <w:sz w:val="18"/>
+                <w:szCs w:val="18"/>
+              </w:rPr>
+              <w:t xml:space="preserve">Requests</w:t>
+            </w:r>
+          </w:p>
+        </w:tc>
+      </w:tr>
+      <w:tr>
+        <w:tc>
+          <w:tcPr>
+            <w:tcW w:w="8000" w:type="dxa"/>
+            <w:tcMar>
+              <w:top w:type="dxa" w:w="60"/>
+              <w:left w:type="dxa" w:w="80"/>
+              <w:bottom w:type="dxa" w:w="60"/>
+              <w:right w:type="dxa" w:w="80"/>
+            </w:tcMar>
+          </w:tcPr>
+          <w:p>
+            <w:pPr>
+              <w:jc w:val="left"/>
+            </w:pPr>
+            <w:r>
+              <w:rPr>
+                <w:b w:val="false"/>
+                <w:bCs w:val="false"/>
+                <w:sz w:val="18"/>
+                <w:szCs w:val="18"/>
+              </w:rPr>
+              <w:t xml:space="preserve">Application configuration, CI and secret-bearing files (config.json, appsettings, docker-compose, CI workflows, env.js)</w:t>
+            </w:r>
+          </w:p>
+        </w:tc>
+        <w:tc>
+          <w:tcPr>
+            <w:tcW w:w="1500" w:type="dxa"/>
+            <w:tcMar>
+              <w:top w:type="dxa" w:w="60"/>
+              <w:left w:type="dxa" w:w="80"/>
+              <w:bottom w:type="dxa" w:w="60"/>
+              <w:right w:type="dxa" w:w="80"/>
+            </w:tcMar>
+          </w:tcPr>
+          <w:p>
+            <w:pPr>
+              <w:jc w:val="right"/>
+            </w:pPr>
+            <w:r>
+              <w:rPr>
+                <w:b w:val="false"/>
+                <w:bCs w:val="false"/>
+                <w:sz w:val="18"/>
+                <w:szCs w:val="18"/>
+              </w:rPr>
+              <w:t xml:space="preserve">718</w:t>
+            </w:r>
+          </w:p>
+        </w:tc>
+      </w:tr>
+      <w:tr>
+        <w:tc>
+          <w:tcPr>
+            <w:tcW w:w="8000" w:type="dxa"/>
+            <w:tcMar>
+              <w:top w:type="dxa" w:w="60"/>
+              <w:left w:type="dxa" w:w="80"/>
+              <w:bottom w:type="dxa" w:w="60"/>
+              <w:right w:type="dxa" w:w="80"/>
+            </w:tcMar>
+          </w:tcPr>
+          <w:p>
+            <w:pPr>
+              <w:jc w:val="left"/>
+            </w:pPr>
+            <w:r>
+              <w:rPr>
+                <w:b w:val="false"/>
+                <w:bCs w:val="false"/>
+                <w:sz w:val="18"/>
+                <w:szCs w:val="18"/>
+              </w:rPr>
+              <w:t xml:space="preserve">WordPress, PHP and control panels (wp-, xmlrpc, phpinfo, server-status, console, cPanel and WHM)</w:t>
+            </w:r>
+          </w:p>
+        </w:tc>
+        <w:tc>
+          <w:tcPr>
+            <w:tcW w:w="1500" w:type="dxa"/>
+            <w:tcMar>
+              <w:top w:type="dxa" w:w="60"/>
+              <w:left w:type="dxa" w:w="80"/>
+              <w:bottom w:type="dxa" w:w="60"/>
+              <w:right w:type="dxa" w:w="80"/>
+            </w:tcMar>
+          </w:tcPr>
+          <w:p>
+            <w:pPr>
+              <w:jc w:val="right"/>
+            </w:pPr>
+            <w:r>
+              <w:rPr>
+                <w:b w:val="false"/>
+                <w:bCs w:val="false"/>
+                <w:sz w:val="18"/>
+                <w:szCs w:val="18"/>
+              </w:rPr>
+              <w:t xml:space="preserve">561</w:t>
+            </w:r>
+          </w:p>
+        </w:tc>
+      </w:tr>
+      <w:tr>
+        <w:tc>
+          <w:tcPr>
+            <w:tcW w:w="8000" w:type="dxa"/>
+            <w:tcMar>
+              <w:top w:type="dxa" w:w="60"/>
+              <w:left w:type="dxa" w:w="80"/>
+              <w:bottom w:type="dxa" w:w="60"/>
+              <w:right w:type="dxa" w:w="80"/>
+            </w:tcMar>
+          </w:tcPr>
+          <w:p>
+            <w:pPr>
+              <w:jc w:val="left"/>
+            </w:pPr>
+            <w:r>
+              <w:rPr>
+                <w:b w:val="false"/>
+                <w:bCs w:val="false"/>
+                <w:sz w:val="18"/>
+                <w:szCs w:val="18"/>
+              </w:rPr>
+              <w:t xml:space="preserve">Scripts, data dumps and API endpoints (aws-exports.js, app.js, database.sql, env.txt, installed.json, GraphQL)</w:t>
+            </w:r>
+          </w:p>
+        </w:tc>
+        <w:tc>
+          <w:tcPr>
+            <w:tcW w:w="1500" w:type="dxa"/>
+            <w:tcMar>
+              <w:top w:type="dxa" w:w="60"/>
+              <w:left w:type="dxa" w:w="80"/>
+              <w:bottom w:type="dxa" w:w="60"/>
+              <w:right w:type="dxa" w:w="80"/>
+            </w:tcMar>
+          </w:tcPr>
+          <w:p>
+            <w:pPr>
+              <w:jc w:val="right"/>
+            </w:pPr>
+            <w:r>
+              <w:rPr>
+                <w:b w:val="false"/>
+                <w:bCs w:val="false"/>
+                <w:sz w:val="18"/>
+                <w:szCs w:val="18"/>
+              </w:rPr>
+              <w:t xml:space="preserve">344</w:t>
+            </w:r>
+          </w:p>
+        </w:tc>
+      </w:tr>
+      <w:tr>
+        <w:tc>
+          <w:tcPr>
+            <w:tcW w:w="8000" w:type="dxa"/>
+            <w:tcMar>
+              <w:top w:type="dxa" w:w="60"/>
+              <w:left w:type="dxa" w:w="80"/>
+              <w:bottom w:type="dxa" w:w="60"/>
+              <w:right w:type="dxa" w:w="80"/>
+            </w:tcMar>
+          </w:tcPr>
+          <w:p>
+            <w:pPr>
+              <w:jc w:val="left"/>
+            </w:pPr>
+            <w:r>
+              <w:rPr>
+                <w:b w:val="false"/>
+                <w:bCs w:val="false"/>
+                <w:sz w:val="18"/>
+                <w:szCs w:val="18"/>
+              </w:rPr>
+              <w:t xml:space="preserve">Cloud and tool credentials (provider and container configs, tfstate, credentials files, AI-tool settings)</w:t>
+            </w:r>
+          </w:p>
+        </w:tc>
+        <w:tc>
+          <w:tcPr>
+            <w:tcW w:w="1500" w:type="dxa"/>
+            <w:tcMar>
+              <w:top w:type="dxa" w:w="60"/>
+              <w:left w:type="dxa" w:w="80"/>
+              <w:bottom w:type="dxa" w:w="60"/>
+              <w:right w:type="dxa" w:w="80"/>
+            </w:tcMar>
+          </w:tcPr>
+          <w:p>
+            <w:pPr>
+              <w:jc w:val="right"/>
+            </w:pPr>
+            <w:r>
+              <w:rPr>
+                <w:b w:val="false"/>
+                <w:bCs w:val="false"/>
+                <w:sz w:val="18"/>
+                <w:szCs w:val="18"/>
+              </w:rPr>
+              <w:t xml:space="preserve">330</w:t>
+            </w:r>
+          </w:p>
+        </w:tc>
+      </w:tr>
+      <w:tr>
+        <w:tc>
+          <w:tcPr>
+            <w:tcW w:w="8000" w:type="dxa"/>
+            <w:tcMar>
+              <w:top w:type="dxa" w:w="60"/>
+              <w:left w:type="dxa" w:w="80"/>
+              <w:bottom w:type="dxa" w:w="60"/>
+              <w:right w:type="dxa" w:w="80"/>
+            </w:tcMar>
+          </w:tcPr>
+          <w:p>
+            <w:pPr>
+              <w:jc w:val="left"/>
+            </w:pPr>
+            <w:r>
+              <w:rPr>
+                <w:b w:val="false"/>
+                <w:bCs w:val="false"/>
+                <w:sz w:val="18"/>
+                <w:szCs w:val="18"/>
+              </w:rPr>
+              <w:t xml:space="preserve">Version control (.git, .svn, .hg)</w:t>
+            </w:r>
+          </w:p>
+        </w:tc>
+        <w:tc>
+          <w:tcPr>
+            <w:tcW w:w="1500" w:type="dxa"/>
+            <w:tcMar>
+              <w:top w:type="dxa" w:w="60"/>
+              <w:left w:type="dxa" w:w="80"/>
+              <w:bottom w:type="dxa" w:w="60"/>
+              <w:right w:type="dxa" w:w="80"/>
+            </w:tcMar>
+          </w:tcPr>
+          <w:p>
+            <w:pPr>
+              <w:jc w:val="right"/>
+            </w:pPr>
+            <w:r>
+              <w:rPr>
+                <w:b w:val="false"/>
+                <w:bCs w:val="false"/>
+                <w:sz w:val="18"/>
+                <w:szCs w:val="18"/>
+              </w:rPr>
+              <w:t xml:space="preserve">152</w:t>
+            </w:r>
+          </w:p>
+        </w:tc>
+      </w:tr>
+      <w:tr>
+        <w:tc>
+          <w:tcPr>
+            <w:tcW w:w="8000" w:type="dxa"/>
+            <w:tcMar>
+              <w:top w:type="dxa" w:w="60"/>
+              <w:left w:type="dxa" w:w="80"/>
+              <w:bottom w:type="dxa" w:w="60"/>
+              <w:right w:type="dxa" w:w="80"/>
+            </w:tcMar>
+          </w:tcPr>
+          <w:p>
+            <w:pPr>
+              <w:jc w:val="left"/>
+            </w:pPr>
+            <w:r>
+              <w:rPr>
+                <w:b w:val="false"/>
+                <w:bCs w:val="false"/>
+                <w:sz w:val="18"/>
+                <w:szCs w:val="18"/>
+              </w:rPr>
+              <w:t xml:space="preserve">SSH keys (id_rsa, id_ed25519) and shell or tool dotfiles (.netrc, .npmrc, .bash_history, .DS_Store)</w:t>
+            </w:r>
+          </w:p>
+        </w:tc>
+        <w:tc>
+          <w:tcPr>
+            <w:tcW w:w="1500" w:type="dxa"/>
+            <w:tcMar>
+              <w:top w:type="dxa" w:w="60"/>
+              <w:left w:type="dxa" w:w="80"/>
+              <w:bottom w:type="dxa" w:w="60"/>
+              <w:right w:type="dxa" w:w="80"/>
+            </w:tcMar>
+          </w:tcPr>
+          <w:p>
+            <w:pPr>
+              <w:jc w:val="right"/>
+            </w:pPr>
+            <w:r>
+              <w:rPr>
+                <w:b w:val="false"/>
+                <w:bCs w:val="false"/>
+                <w:sz w:val="18"/>
+                <w:szCs w:val="18"/>
+              </w:rPr>
+              <w:t xml:space="preserve">118</w:t>
+            </w:r>
+          </w:p>
+        </w:tc>
+      </w:tr>
+      <w:tr>
+        <w:tc>
+          <w:tcPr>
+            <w:tcW w:w="8000" w:type="dxa"/>
+            <w:tcMar>
+              <w:top w:type="dxa" w:w="60"/>
+              <w:left w:type="dxa" w:w="80"/>
+              <w:bottom w:type="dxa" w:w="60"/>
+              <w:right w:type="dxa" w:w="80"/>
+            </w:tcMar>
+          </w:tcPr>
+          <w:p>
+            <w:pPr>
+              <w:jc w:val="left"/>
+            </w:pPr>
+            <w:r>
+              <w:rPr>
+                <w:b w:val="false"/>
+                <w:bCs w:val="false"/>
+                <w:sz w:val="18"/>
+                <w:szCs w:val="18"/>
+              </w:rPr>
+              <w:t xml:space="preserve">The root page</w:t>
+            </w:r>
+          </w:p>
+        </w:tc>
+        <w:tc>
+          <w:tcPr>
+            <w:tcW w:w="1500" w:type="dxa"/>
+            <w:tcMar>
+              <w:top w:type="dxa" w:w="60"/>
+              <w:left w:type="dxa" w:w="80"/>
+              <w:bottom w:type="dxa" w:w="60"/>
+              <w:right w:type="dxa" w:w="80"/>
+            </w:tcMar>
+          </w:tcPr>
+          <w:p>
+            <w:pPr>
+              <w:jc w:val="right"/>
+            </w:pPr>
+            <w:r>
+              <w:rPr>
+                <w:b w:val="false"/>
+                <w:bCs w:val="false"/>
+                <w:sz w:val="18"/>
+                <w:szCs w:val="18"/>
+              </w:rPr>
+              <w:t xml:space="preserve">118</w:t>
+            </w:r>
+          </w:p>
+        </w:tc>
+      </w:tr>
+      <w:tr>
+        <w:tc>
+          <w:tcPr>
+            <w:tcW w:w="8000" w:type="dxa"/>
+            <w:tcMar>
+              <w:top w:type="dxa" w:w="60"/>
+              <w:left w:type="dxa" w:w="80"/>
+              <w:bottom w:type="dxa" w:w="60"/>
+              <w:right w:type="dxa" w:w="80"/>
+            </w:tcMar>
+          </w:tcPr>
+          <w:p>
+            <w:pPr>
+              <w:jc w:val="left"/>
+            </w:pPr>
+            <w:r>
+              <w:rPr>
+                <w:b w:val="false"/>
+                <w:bCs w:val="false"/>
+                <w:sz w:val="18"/>
+                <w:szCs w:val="18"/>
+              </w:rPr>
+              <w:t xml:space="preserve">Framework and registry endpoints (actuator, Vite, profiler, container registry catalog)</w:t>
+            </w:r>
+          </w:p>
+        </w:tc>
+        <w:tc>
+          <w:tcPr>
+            <w:tcW w:w="1500" w:type="dxa"/>
+            <w:tcMar>
+              <w:top w:type="dxa" w:w="60"/>
+              <w:left w:type="dxa" w:w="80"/>
+              <w:bottom w:type="dxa" w:w="60"/>
+              <w:right w:type="dxa" w:w="80"/>
+            </w:tcMar>
+          </w:tcPr>
+          <w:p>
+            <w:pPr>
+              <w:jc w:val="right"/>
+            </w:pPr>
+            <w:r>
+              <w:rPr>
+                <w:b w:val="false"/>
+                <w:bCs w:val="false"/>
+                <w:sz w:val="18"/>
+                <w:szCs w:val="18"/>
+              </w:rPr>
+              <w:t xml:space="preserve">95</w:t>
+            </w:r>
+          </w:p>
+        </w:tc>
+      </w:tr>
+      <w:tr>
+        <w:tc>
+          <w:tcPr>
+            <w:tcW w:w="8000" w:type="dxa"/>
+            <w:tcMar>
+              <w:top w:type="dxa" w:w="60"/>
+              <w:left w:type="dxa" w:w="80"/>
+              <w:bottom w:type="dxa" w:w="60"/>
+              <w:right w:type="dxa" w:w="80"/>
+            </w:tcMar>
+          </w:tcPr>
+          <w:p>
+            <w:pPr>
+              <w:jc w:val="left"/>
+            </w:pPr>
+            <w:r>
+              <w:rPr>
+                <w:b w:val="false"/>
+                <w:bCs w:val="false"/>
+                <w:sz w:val="18"/>
+                <w:szCs w:val="18"/>
+              </w:rPr>
+              <w:t xml:space="preserve">Path traversal and process environments</w:t>
+            </w:r>
+          </w:p>
+        </w:tc>
+        <w:tc>
+          <w:tcPr>
+            <w:tcW w:w="1500" w:type="dxa"/>
+            <w:tcMar>
+              <w:top w:type="dxa" w:w="60"/>
+              <w:left w:type="dxa" w:w="80"/>
+              <w:bottom w:type="dxa" w:w="60"/>
+              <w:right w:type="dxa" w:w="80"/>
+            </w:tcMar>
+          </w:tcPr>
+          <w:p>
+            <w:pPr>
+              <w:jc w:val="right"/>
+            </w:pPr>
+            <w:r>
+              <w:rPr>
+                <w:b w:val="false"/>
+                <w:bCs w:val="false"/>
+                <w:sz w:val="18"/>
+                <w:szCs w:val="18"/>
+              </w:rPr>
+              <w:t xml:space="preserve">53</w:t>
+            </w:r>
+          </w:p>
+        </w:tc>
+      </w:tr>
+      <w:tr>
+        <w:tc>
+          <w:tcPr>
+            <w:tcW w:w="8000" w:type="dxa"/>
+            <w:tcMar>
+              <w:top w:type="dxa" w:w="60"/>
+              <w:left w:type="dxa" w:w="80"/>
+              <w:bottom w:type="dxa" w:w="60"/>
+              <w:right w:type="dxa" w:w="80"/>
+            </w:tcMar>
+          </w:tcPr>
+          <w:p>
+            <w:pPr>
+              <w:jc w:val="left"/>
+            </w:pPr>
+            <w:r>
+              <w:rPr>
+                <w:b w:val="false"/>
+                <w:bCs w:val="false"/>
+                <w:sz w:val="18"/>
+                <w:szCs w:val="18"/>
+              </w:rPr>
+              <w:t xml:space="preserve">Environment files (.env and variants)</w:t>
+            </w:r>
+          </w:p>
+        </w:tc>
+        <w:tc>
+          <w:tcPr>
+            <w:tcW w:w="1500" w:type="dxa"/>
+            <w:tcMar>
+              <w:top w:type="dxa" w:w="60"/>
+              <w:left w:type="dxa" w:w="80"/>
+              <w:bottom w:type="dxa" w:w="60"/>
+              <w:right w:type="dxa" w:w="80"/>
+            </w:tcMar>
+          </w:tcPr>
+          <w:p>
+            <w:pPr>
+              <w:jc w:val="right"/>
+            </w:pPr>
+            <w:r>
+              <w:rPr>
+                <w:b w:val="false"/>
+                <w:bCs w:val="false"/>
+                <w:sz w:val="18"/>
+                <w:szCs w:val="18"/>
+              </w:rPr>
+              <w:t xml:space="preserve">31</w:t>
+            </w:r>
+          </w:p>
+        </w:tc>
+      </w:tr>
+      <w:tr>
+        <w:tc>
+          <w:tcPr>
+            <w:tcW w:w="8000" w:type="dxa"/>
+            <w:tcMar>
+              <w:top w:type="dxa" w:w="60"/>
+              <w:left w:type="dxa" w:w="80"/>
+              <w:bottom w:type="dxa" w:w="60"/>
+              <w:right w:type="dxa" w:w="80"/>
+            </w:tcMar>
+          </w:tcPr>
+          <w:p>
+            <w:pPr>
+              <w:jc w:val="left"/>
+            </w:pPr>
+            <w:r>
+              <w:rPr>
+                <w:b w:val="false"/>
+                <w:bCs w:val="false"/>
+                <w:sz w:val="18"/>
+                <w:szCs w:val="18"/>
+              </w:rPr>
+              <w:t xml:space="preserve">Everything else (service-account and manifest files, application-specific paths, one-offs)</w:t>
+            </w:r>
+          </w:p>
+        </w:tc>
+        <w:tc>
+          <w:tcPr>
+            <w:tcW w:w="1500" w:type="dxa"/>
+            <w:tcMar>
+              <w:top w:type="dxa" w:w="60"/>
+              <w:left w:type="dxa" w:w="80"/>
+              <w:bottom w:type="dxa" w:w="60"/>
+              <w:right w:type="dxa" w:w="80"/>
+            </w:tcMar>
+          </w:tcPr>
+          <w:p>
+            <w:pPr>
+              <w:jc w:val="right"/>
+            </w:pPr>
+            <w:r>
+              <w:rPr>
+                <w:b w:val="false"/>
+                <w:bCs w:val="false"/>
+                <w:sz w:val="18"/>
+                <w:szCs w:val="18"/>
+              </w:rPr>
+              <w:t xml:space="preserve">718</w:t>
+            </w:r>
+          </w:p>
+        </w:tc>
+      </w:tr>
+    </w:tbl>
+    <w:p>
+      <w:pPr>
+        <w:spacing w:after="60"/>
+      </w:pPr>
+    </w:p>
+    <w:p>
+      <w:pPr>
+        <w:spacing w:after="120"/>
+        <w:jc w:val="left"/>
+      </w:pPr>
+      <w:r>
+        <w:rPr>
+          <w:i/>
+          <w:iCs/>
+          <w:sz w:val="20"/>
+          <w:szCs w:val="20"/>
+        </w:rPr>
+        <w:t xml:space="preserve">The grouping is by keyword, so the boundaries are approximate; the point is the shape. Roughly one request in five is for a file that would hold a credential if the site were careless, and most of the rest is the same hunt through configuration files and scripts.</w:t>
+      </w:r>
+    </w:p>
+    <w:p>
+      <w:pPr>
+        <w:spacing w:after="120"/>
+        <w:jc w:val="left"/>
+      </w:pPr>
+      <w:r>
+        <w:rPr>
+          <w:sz w:val="20"/>
+          <w:szCs w:val="20"/>
+        </w:rPr>
+        <w:t xml:space="preserve">The most-requested paths, each from many addresses: /.gitlab-ci.yml (42), /.github/workflows/deploy.yml (37), /config.json (37), /info.php (36), /settings.json (35), /credentials.json (34), /appsettings.json and its Production and Development variants (31, 31, 30), /secrets.json (30), /.boto (29), /docker-compose.yml (29), /phpinfo.php and /_profiler/phpinfo (29 each), /.docker/config.json (28), /.npmrc (28), /Dockerfile (28), /.s3cfg (28), /v2/_catalog (27), /___proxy_subdomain_whm/login (27), /console/ (26), and settings files for a popular AI coding assistant (24 each). The equal counts show one scanner script run against every host, not curiosity about any one of them.</w:t>
+      </w:r>
+    </w:p>
+    <w:p>
+      <w:pPr>
+        <w:spacing w:after="120"/>
+        <w:jc w:val="left"/>
+      </w:pPr>
+      <w:r>
+        <w:rPr>
+          <w:sz w:val="20"/>
+          <w:szCs w:val="20"/>
+        </w:rPr>
+        <w:t xml:space="preserve">Who they say they are. 1,756 of the 3,238 requests (54%) carried one generic desktop-browser string; 608 (19%) named a crawler or AI agent; 406 (13%) identified themselves as scanners, such as l9scan, a scanner whose user-agent carries a link to its operator; 15 of the 77 addresses rotated through five or more different user-agents. A named crawler is not evidence of a crawler, and a generic browser string is not evidence of a person.</w:t>
+      </w:r>
+    </w:p>
+    <w:p>
+      <w:pPr>
+        <w:pStyle w:val="Heading2"/>
+        <w:pBdr>
+          <w:bottom w:val="single" w:color="1F3864" w:sz="6"/>
+        </w:pBdr>
+        <w:spacing w:after="120" w:before="240"/>
+      </w:pPr>
+      <w:r>
+        <w:t xml:space="preserve">4.7 Anatomy of two bursts</w:t>
+      </w:r>
+    </w:p>
+    <w:p>
+      <w:pPr>
+        <w:spacing w:after="120"/>
+        <w:jc w:val="left"/>
+      </w:pPr>
+      <w:r>
+        <w:rPr>
+          <w:sz w:val="20"/>
+          <w:szCs w:val="20"/>
+        </w:rPr>
+        <w:t xml:space="preserve">Both bursts were stopped without reaching an application beyond the first few seconds; the difference is the detector.</w:t>
+      </w:r>
+    </w:p>
+    <w:tbl>
+      <w:tblPr>
+        <w:tblW w:type="dxa" w:w="9500"/>
+        <w:tblBorders>
+          <w:top w:val="single" w:color="auto" w:sz="4"/>
+          <w:left w:val="single" w:color="auto" w:sz="4"/>
+          <w:bottom w:val="single" w:color="auto" w:sz="4"/>
+          <w:right w:val="single" w:color="auto" w:sz="4"/>
+          <w:insideH w:val="single" w:color="auto" w:sz="4"/>
+          <w:insideV w:val="single" w:color="auto" w:sz="4"/>
+        </w:tblBorders>
+        <w:tblLayout w:type="fixed"/>
+        <w:tblCellMar>
+          <w:top w:type="dxa" w:w="60"/>
+          <w:left w:type="dxa" w:w="80"/>
+          <w:bottom w:type="dxa" w:w="60"/>
+          <w:right w:type="dxa" w:w="80"/>
+        </w:tblCellMar>
+      </w:tblPr>
+      <w:tblGrid>
+        <w:gridCol w:w="2800"/>
+        <w:gridCol w:w="3350"/>
+        <w:gridCol w:w="3350"/>
+      </w:tblGrid>
+      <w:tr>
+        <w:trPr>
+          <w:tblHeader/>
+        </w:trPr>
+        <w:tc>
+          <w:tcPr>
+            <w:tcW w:w="2800" w:type="dxa"/>
+            <w:shd w:fill="1F3864" w:color="1F3864" w:val="solid"/>
+            <w:tcMar>
+              <w:top w:type="dxa" w:w="60"/>
+              <w:left w:type="dxa" w:w="80"/>
+              <w:bottom w:type="dxa" w:w="60"/>
+              <w:right w:type="dxa" w:w="80"/>
+            </w:tcMar>
+          </w:tcPr>
+          <w:p>
+            <w:pPr>
+              <w:jc w:val="center"/>
+            </w:pPr>
+            <w:r>
+              <w:rPr>
+                <w:b/>
+                <w:bCs/>
+                <w:color w:val="FFFFFF"/>
+                <w:sz w:val="18"/>
+                <w:szCs w:val="18"/>
+              </w:rPr>
+              <w:t xml:space="preserve"/>
+            </w:r>
+          </w:p>
+        </w:tc>
+        <w:tc>
+          <w:tcPr>
+            <w:tcW w:w="3350" w:type="dxa"/>
+            <w:shd w:fill="1F3864" w:color="1F3864" w:val="solid"/>
+            <w:tcMar>
+              <w:top w:type="dxa" w:w="60"/>
+              <w:left w:type="dxa" w:w="80"/>
+              <w:bottom w:type="dxa" w:w="60"/>
+              <w:right w:type="dxa" w:w="80"/>
+            </w:tcMar>
+          </w:tcPr>
+          <w:p>
+            <w:pPr>
+              <w:jc w:val="center"/>
+            </w:pPr>
+            <w:r>
+              <w:rPr>
+                <w:b/>
+                <w:bCs/>
+                <w:color w:val="FFFFFF"/>
+                <w:sz w:val="18"/>
+                <w:szCs w:val="18"/>
+              </w:rPr>
+              <w:t xml:space="preserve">16 October, 34.104.188.100 (nettools)</w:t>
+            </w:r>
+          </w:p>
+        </w:tc>
+        <w:tc>
+          <w:tcPr>
+            <w:tcW w:w="3350" w:type="dxa"/>
+            <w:shd w:fill="1F3864" w:color="1F3864" w:val="solid"/>
+            <w:tcMar>
+              <w:top w:type="dxa" w:w="60"/>
+              <w:left w:type="dxa" w:w="80"/>
+              <w:bottom w:type="dxa" w:w="60"/>
+              <w:right w:type="dxa" w:w="80"/>
+            </w:tcMar>
+          </w:tcPr>
+          <w:p>
+            <w:pPr>
+              <w:jc w:val="center"/>
+            </w:pPr>
+            <w:r>
+              <w:rPr>
+                <w:b/>
+                <w:bCs/>
+                <w:color w:val="FFFFFF"/>
+                <w:sz w:val="18"/>
+                <w:szCs w:val="18"/>
+              </w:rPr>
+              <w:t xml:space="preserve">18 October, 34.89.214.5 (bentopdf)</w:t>
+            </w:r>
+          </w:p>
+        </w:tc>
+      </w:tr>
+      <w:tr>
+        <w:tc>
+          <w:tcPr>
+            <w:tcW w:w="2800" w:type="dxa"/>
+            <w:tcMar>
+              <w:top w:type="dxa" w:w="60"/>
+              <w:left w:type="dxa" w:w="80"/>
+              <w:bottom w:type="dxa" w:w="60"/>
+              <w:right w:type="dxa" w:w="80"/>
+            </w:tcMar>
+          </w:tcPr>
+          <w:p>
+            <w:pPr>
+              <w:jc w:val="left"/>
+            </w:pPr>
+            <w:r>
+              <w:rPr>
+                <w:b w:val="false"/>
+                <w:bCs w:val="false"/>
+                <w:sz w:val="18"/>
+                <w:szCs w:val="18"/>
+              </w:rPr>
+              <w:t xml:space="preserve">Detector</w:t>
+            </w:r>
+          </w:p>
+        </w:tc>
+        <w:tc>
+          <w:tcPr>
+            <w:tcW w:w="3350" w:type="dxa"/>
+            <w:tcMar>
+              <w:top w:type="dxa" w:w="60"/>
+              <w:left w:type="dxa" w:w="80"/>
+              <w:bottom w:type="dxa" w:w="60"/>
+              <w:right w:type="dxa" w:w="80"/>
+            </w:tcMar>
+          </w:tcPr>
+          <w:p>
+            <w:pPr>
+              <w:jc w:val="left"/>
+            </w:pPr>
+            <w:r>
+              <w:rPr>
+                <w:b w:val="false"/>
+                <w:bCs w:val="false"/>
+                <w:sz w:val="18"/>
+                <w:szCs w:val="18"/>
+              </w:rPr>
+              <w:t xml:space="preserve">Error burst: more than 30 errors in 60 seconds</w:t>
+            </w:r>
+          </w:p>
+        </w:tc>
+        <w:tc>
+          <w:tcPr>
+            <w:tcW w:w="3350" w:type="dxa"/>
+            <w:tcMar>
+              <w:top w:type="dxa" w:w="60"/>
+              <w:left w:type="dxa" w:w="80"/>
+              <w:bottom w:type="dxa" w:w="60"/>
+              <w:right w:type="dxa" w:w="80"/>
+            </w:tcMar>
+          </w:tcPr>
+          <w:p>
+            <w:pPr>
+              <w:jc w:val="left"/>
+            </w:pPr>
+            <w:r>
+              <w:rPr>
+                <w:b w:val="false"/>
+                <w:bCs w:val="false"/>
+                <w:sz w:val="18"/>
+                <w:szCs w:val="18"/>
+              </w:rPr>
+              <w:t xml:space="preserve">Sensitive-path probe: a private-key file name</w:t>
+            </w:r>
+          </w:p>
+        </w:tc>
+      </w:tr>
+      <w:tr>
+        <w:tc>
+          <w:tcPr>
+            <w:tcW w:w="2800" w:type="dxa"/>
+            <w:tcMar>
+              <w:top w:type="dxa" w:w="60"/>
+              <w:left w:type="dxa" w:w="80"/>
+              <w:bottom w:type="dxa" w:w="60"/>
+              <w:right w:type="dxa" w:w="80"/>
+            </w:tcMar>
+          </w:tcPr>
+          <w:p>
+            <w:pPr>
+              <w:jc w:val="left"/>
+            </w:pPr>
+            <w:r>
+              <w:rPr>
+                <w:b w:val="false"/>
+                <w:bCs w:val="false"/>
+                <w:sz w:val="18"/>
+                <w:szCs w:val="18"/>
+              </w:rPr>
+              <w:t xml:space="preserve">Total requests</w:t>
+            </w:r>
+          </w:p>
+        </w:tc>
+        <w:tc>
+          <w:tcPr>
+            <w:tcW w:w="3350" w:type="dxa"/>
+            <w:tcMar>
+              <w:top w:type="dxa" w:w="60"/>
+              <w:left w:type="dxa" w:w="80"/>
+              <w:bottom w:type="dxa" w:w="60"/>
+              <w:right w:type="dxa" w:w="80"/>
+            </w:tcMar>
+          </w:tcPr>
+          <w:p>
+            <w:pPr>
+              <w:jc w:val="left"/>
+            </w:pPr>
+            <w:r>
+              <w:rPr>
+                <w:b w:val="false"/>
+                <w:bCs w:val="false"/>
+                <w:sz w:val="18"/>
+                <w:szCs w:val="18"/>
+              </w:rPr>
+              <w:t xml:space="preserve">221</w:t>
+            </w:r>
+          </w:p>
+        </w:tc>
+        <w:tc>
+          <w:tcPr>
+            <w:tcW w:w="3350" w:type="dxa"/>
+            <w:tcMar>
+              <w:top w:type="dxa" w:w="60"/>
+              <w:left w:type="dxa" w:w="80"/>
+              <w:bottom w:type="dxa" w:w="60"/>
+              <w:right w:type="dxa" w:w="80"/>
+            </w:tcMar>
+          </w:tcPr>
+          <w:p>
+            <w:pPr>
+              <w:jc w:val="left"/>
+            </w:pPr>
+            <w:r>
+              <w:rPr>
+                <w:b w:val="false"/>
+                <w:bCs w:val="false"/>
+                <w:sz w:val="18"/>
+                <w:szCs w:val="18"/>
+              </w:rPr>
+              <w:t xml:space="preserve">144</w:t>
+            </w:r>
+          </w:p>
+        </w:tc>
+      </w:tr>
+      <w:tr>
+        <w:tc>
+          <w:tcPr>
+            <w:tcW w:w="2800" w:type="dxa"/>
+            <w:tcMar>
+              <w:top w:type="dxa" w:w="60"/>
+              <w:left w:type="dxa" w:w="80"/>
+              <w:bottom w:type="dxa" w:w="60"/>
+              <w:right w:type="dxa" w:w="80"/>
+            </w:tcMar>
+          </w:tcPr>
+          <w:p>
+            <w:pPr>
+              <w:jc w:val="left"/>
+            </w:pPr>
+            <w:r>
+              <w:rPr>
+                <w:b w:val="false"/>
+                <w:bCs w:val="false"/>
+                <w:sz w:val="18"/>
+                <w:szCs w:val="18"/>
+              </w:rPr>
+              <w:t xml:space="preserve">First request to ban</w:t>
+            </w:r>
+          </w:p>
+        </w:tc>
+        <w:tc>
+          <w:tcPr>
+            <w:tcW w:w="3350" w:type="dxa"/>
+            <w:tcMar>
+              <w:top w:type="dxa" w:w="60"/>
+              <w:left w:type="dxa" w:w="80"/>
+              <w:bottom w:type="dxa" w:w="60"/>
+              <w:right w:type="dxa" w:w="80"/>
+            </w:tcMar>
+          </w:tcPr>
+          <w:p>
+            <w:pPr>
+              <w:jc w:val="left"/>
+            </w:pPr>
+            <w:r>
+              <w:rPr>
+                <w:b w:val="false"/>
+                <w:bCs w:val="false"/>
+                <w:sz w:val="18"/>
+                <w:szCs w:val="18"/>
+              </w:rPr>
+              <w:t xml:space="preserve">10 seconds</w:t>
+            </w:r>
+          </w:p>
+        </w:tc>
+        <w:tc>
+          <w:tcPr>
+            <w:tcW w:w="3350" w:type="dxa"/>
+            <w:tcMar>
+              <w:top w:type="dxa" w:w="60"/>
+              <w:left w:type="dxa" w:w="80"/>
+              <w:bottom w:type="dxa" w:w="60"/>
+              <w:right w:type="dxa" w:w="80"/>
+            </w:tcMar>
+          </w:tcPr>
+          <w:p>
+            <w:pPr>
+              <w:jc w:val="left"/>
+            </w:pPr>
+            <w:r>
+              <w:rPr>
+                <w:b w:val="false"/>
+                <w:bCs w:val="false"/>
+                <w:sz w:val="18"/>
+                <w:szCs w:val="18"/>
+              </w:rPr>
+              <w:t xml:space="preserve">7 seconds</w:t>
+            </w:r>
+          </w:p>
+        </w:tc>
+      </w:tr>
+      <w:tr>
+        <w:tc>
+          <w:tcPr>
+            <w:tcW w:w="2800" w:type="dxa"/>
+            <w:tcMar>
+              <w:top w:type="dxa" w:w="60"/>
+              <w:left w:type="dxa" w:w="80"/>
+              <w:bottom w:type="dxa" w:w="60"/>
+              <w:right w:type="dxa" w:w="80"/>
+            </w:tcMar>
+          </w:tcPr>
+          <w:p>
+            <w:pPr>
+              <w:jc w:val="left"/>
+            </w:pPr>
+            <w:r>
+              <w:rPr>
+                <w:b w:val="false"/>
+                <w:bCs w:val="false"/>
+                <w:sz w:val="18"/>
+                <w:szCs w:val="18"/>
+              </w:rPr>
+              <w:t xml:space="preserve">Reached an application before the ban</w:t>
+            </w:r>
+          </w:p>
+        </w:tc>
+        <w:tc>
+          <w:tcPr>
+            <w:tcW w:w="3350" w:type="dxa"/>
+            <w:tcMar>
+              <w:top w:type="dxa" w:w="60"/>
+              <w:left w:type="dxa" w:w="80"/>
+              <w:bottom w:type="dxa" w:w="60"/>
+              <w:right w:type="dxa" w:w="80"/>
+            </w:tcMar>
+          </w:tcPr>
+          <w:p>
+            <w:pPr>
+              <w:jc w:val="left"/>
+            </w:pPr>
+            <w:r>
+              <w:rPr>
+                <w:b w:val="false"/>
+                <w:bCs w:val="false"/>
+                <w:sz w:val="18"/>
+                <w:szCs w:val="18"/>
+              </w:rPr>
+              <w:t xml:space="preserve">38 (all 404s, 2 to 5 a second)</w:t>
+            </w:r>
+          </w:p>
+        </w:tc>
+        <w:tc>
+          <w:tcPr>
+            <w:tcW w:w="3350" w:type="dxa"/>
+            <w:tcMar>
+              <w:top w:type="dxa" w:w="60"/>
+              <w:left w:type="dxa" w:w="80"/>
+              <w:bottom w:type="dxa" w:w="60"/>
+              <w:right w:type="dxa" w:w="80"/>
+            </w:tcMar>
+          </w:tcPr>
+          <w:p>
+            <w:pPr>
+              <w:jc w:val="left"/>
+            </w:pPr>
+            <w:r>
+              <w:rPr>
+                <w:b w:val="false"/>
+                <w:bCs w:val="false"/>
+                <w:sz w:val="18"/>
+                <w:szCs w:val="18"/>
+              </w:rPr>
+              <w:t xml:space="preserve">53 (46 were 404s, 7 were 200s)</w:t>
+            </w:r>
+          </w:p>
+        </w:tc>
+      </w:tr>
+      <w:tr>
+        <w:tc>
+          <w:tcPr>
+            <w:tcW w:w="2800" w:type="dxa"/>
+            <w:tcMar>
+              <w:top w:type="dxa" w:w="60"/>
+              <w:left w:type="dxa" w:w="80"/>
+              <w:bottom w:type="dxa" w:w="60"/>
+              <w:right w:type="dxa" w:w="80"/>
+            </w:tcMar>
+          </w:tcPr>
+          <w:p>
+            <w:pPr>
+              <w:jc w:val="left"/>
+            </w:pPr>
+            <w:r>
+              <w:rPr>
+                <w:b w:val="false"/>
+                <w:bCs w:val="false"/>
+                <w:sz w:val="18"/>
+                <w:szCs w:val="18"/>
+              </w:rPr>
+              <w:t xml:space="preserve">Refused by the proxy’s exploit detection</w:t>
+            </w:r>
+          </w:p>
+        </w:tc>
+        <w:tc>
+          <w:tcPr>
+            <w:tcW w:w="3350" w:type="dxa"/>
+            <w:tcMar>
+              <w:top w:type="dxa" w:w="60"/>
+              <w:left w:type="dxa" w:w="80"/>
+              <w:bottom w:type="dxa" w:w="60"/>
+              <w:right w:type="dxa" w:w="80"/>
+            </w:tcMar>
+          </w:tcPr>
+          <w:p>
+            <w:pPr>
+              <w:jc w:val="left"/>
+            </w:pPr>
+            <w:r>
+              <w:rPr>
+                <w:b w:val="false"/>
+                <w:bCs w:val="false"/>
+                <w:sz w:val="18"/>
+                <w:szCs w:val="18"/>
+              </w:rPr>
+              <w:t xml:space="preserve">0</w:t>
+            </w:r>
+          </w:p>
+        </w:tc>
+        <w:tc>
+          <w:tcPr>
+            <w:tcW w:w="3350" w:type="dxa"/>
+            <w:tcMar>
+              <w:top w:type="dxa" w:w="60"/>
+              <w:left w:type="dxa" w:w="80"/>
+              <w:bottom w:type="dxa" w:w="60"/>
+              <w:right w:type="dxa" w:w="80"/>
+            </w:tcMar>
+          </w:tcPr>
+          <w:p>
+            <w:pPr>
+              <w:jc w:val="left"/>
+            </w:pPr>
+            <w:r>
+              <w:rPr>
+                <w:b w:val="false"/>
+                <w:bCs w:val="false"/>
+                <w:sz w:val="18"/>
+                <w:szCs w:val="18"/>
+              </w:rPr>
+              <w:t xml:space="preserve">60 (mostly in seconds 4 to 6)</w:t>
+            </w:r>
+          </w:p>
+        </w:tc>
+      </w:tr>
+      <w:tr>
+        <w:tc>
+          <w:tcPr>
+            <w:tcW w:w="2800" w:type="dxa"/>
+            <w:tcMar>
+              <w:top w:type="dxa" w:w="60"/>
+              <w:left w:type="dxa" w:w="80"/>
+              <w:bottom w:type="dxa" w:w="60"/>
+              <w:right w:type="dxa" w:w="80"/>
+            </w:tcMar>
+          </w:tcPr>
+          <w:p>
+            <w:pPr>
+              <w:jc w:val="left"/>
+            </w:pPr>
+            <w:r>
+              <w:rPr>
+                <w:b w:val="false"/>
+                <w:bCs w:val="false"/>
+                <w:sz w:val="18"/>
+                <w:szCs w:val="18"/>
+              </w:rPr>
+              <w:t xml:space="preserve">Refused by the proxy’s blacklist after the ban</w:t>
+            </w:r>
+          </w:p>
+        </w:tc>
+        <w:tc>
+          <w:tcPr>
+            <w:tcW w:w="3350" w:type="dxa"/>
+            <w:tcMar>
+              <w:top w:type="dxa" w:w="60"/>
+              <w:left w:type="dxa" w:w="80"/>
+              <w:bottom w:type="dxa" w:w="60"/>
+              <w:right w:type="dxa" w:w="80"/>
+            </w:tcMar>
+          </w:tcPr>
+          <w:p>
+            <w:pPr>
+              <w:jc w:val="left"/>
+            </w:pPr>
+            <w:r>
+              <w:rPr>
+                <w:b w:val="false"/>
+                <w:bCs w:val="false"/>
+                <w:sz w:val="18"/>
+                <w:szCs w:val="18"/>
+              </w:rPr>
+              <w:t xml:space="preserve">183 (4 to 7 a second, for 32 seconds, until the scanner gave up)</w:t>
+            </w:r>
+          </w:p>
+        </w:tc>
+        <w:tc>
+          <w:tcPr>
+            <w:tcW w:w="3350" w:type="dxa"/>
+            <w:tcMar>
+              <w:top w:type="dxa" w:w="60"/>
+              <w:left w:type="dxa" w:w="80"/>
+              <w:bottom w:type="dxa" w:w="60"/>
+              <w:right w:type="dxa" w:w="80"/>
+            </w:tcMar>
+          </w:tcPr>
+          <w:p>
+            <w:pPr>
+              <w:jc w:val="left"/>
+            </w:pPr>
+            <w:r>
+              <w:rPr>
+                <w:b w:val="false"/>
+                <w:bCs w:val="false"/>
+                <w:sz w:val="18"/>
+                <w:szCs w:val="18"/>
+              </w:rPr>
+              <w:t xml:space="preserve">31 (24 in the ban’s own second, 7 in the next)</w:t>
+            </w:r>
+          </w:p>
+        </w:tc>
+      </w:tr>
+      <w:tr>
+        <w:tc>
+          <w:tcPr>
+            <w:tcW w:w="2800" w:type="dxa"/>
+            <w:tcMar>
+              <w:top w:type="dxa" w:w="60"/>
+              <w:left w:type="dxa" w:w="80"/>
+              <w:bottom w:type="dxa" w:w="60"/>
+              <w:right w:type="dxa" w:w="80"/>
+            </w:tcMar>
+          </w:tcPr>
+          <w:p>
+            <w:pPr>
+              <w:jc w:val="left"/>
+            </w:pPr>
+            <w:r>
+              <w:rPr>
+                <w:b w:val="false"/>
+                <w:bCs w:val="false"/>
+                <w:sz w:val="18"/>
+                <w:szCs w:val="18"/>
+              </w:rPr>
+              <w:t xml:space="preserve">Reached an application after the ban</w:t>
+            </w:r>
+          </w:p>
+        </w:tc>
+        <w:tc>
+          <w:tcPr>
+            <w:tcW w:w="3350" w:type="dxa"/>
+            <w:tcMar>
+              <w:top w:type="dxa" w:w="60"/>
+              <w:left w:type="dxa" w:w="80"/>
+              <w:bottom w:type="dxa" w:w="60"/>
+              <w:right w:type="dxa" w:w="80"/>
+            </w:tcMar>
+          </w:tcPr>
+          <w:p>
+            <w:pPr>
+              <w:jc w:val="left"/>
+            </w:pPr>
+            <w:r>
+              <w:rPr>
+                <w:b w:val="false"/>
+                <w:bCs w:val="false"/>
+                <w:sz w:val="18"/>
+                <w:szCs w:val="18"/>
+              </w:rPr>
+              <w:t xml:space="preserve">0</w:t>
+            </w:r>
+          </w:p>
+        </w:tc>
+        <w:tc>
+          <w:tcPr>
+            <w:tcW w:w="3350" w:type="dxa"/>
+            <w:tcMar>
+              <w:top w:type="dxa" w:w="60"/>
+              <w:left w:type="dxa" w:w="80"/>
+              <w:bottom w:type="dxa" w:w="60"/>
+              <w:right w:type="dxa" w:w="80"/>
+            </w:tcMar>
+          </w:tcPr>
+          <w:p>
+            <w:pPr>
+              <w:jc w:val="left"/>
+            </w:pPr>
+            <w:r>
+              <w:rPr>
+                <w:b w:val="false"/>
+                <w:bCs w:val="false"/>
+                <w:sz w:val="18"/>
+                <w:szCs w:val="18"/>
+              </w:rPr>
+              <w:t xml:space="preserve">0</w:t>
+            </w:r>
+          </w:p>
+        </w:tc>
+      </w:tr>
+    </w:tbl>
+    <w:p>
+      <w:pPr>
+        <w:spacing w:after="60"/>
+      </w:pPr>
+    </w:p>
+    <w:p>
+      <w:pPr>
+        <w:spacing w:after="120"/>
+        <w:jc w:val="left"/>
+      </w:pPr>
+      <w:r>
+        <w:rPr>
+          <w:sz w:val="20"/>
+          <w:szCs w:val="20"/>
+        </w:rPr>
+        <w:t xml:space="preserve">The first burst shows the cost of an error-count rule: ten seconds of probing before the ban, because it had to wait for thirty errors. The second shows layering: the proxy’s built-in exploit detection refused 60 requests while the plugin was deciding, so the scanner was being blocked before it was banned.</w:t>
+      </w:r>
+    </w:p>
+    <w:p>
+      <w:pPr>
+        <w:pStyle w:val="Heading2"/>
+        <w:pBdr>
+          <w:bottom w:val="single" w:color="1F3864" w:sz="6"/>
+        </w:pBdr>
+        <w:spacing w:after="120" w:before="240"/>
+      </w:pPr>
+      <w:r>
+        <w:t xml:space="preserve">4.8 Waves, not a steady trickle</w:t>
+      </w:r>
+    </w:p>
+    <w:tbl>
+      <w:tblPr>
+        <w:tblW w:type="dxa" w:w="9500"/>
+        <w:tblBorders>
+          <w:top w:val="single" w:color="auto" w:sz="4"/>
+          <w:left w:val="single" w:color="auto" w:sz="4"/>
+          <w:bottom w:val="single" w:color="auto" w:sz="4"/>
+          <w:right w:val="single" w:color="auto" w:sz="4"/>
+          <w:insideH w:val="single" w:color="auto" w:sz="4"/>
+          <w:insideV w:val="single" w:color="auto" w:sz="4"/>
+        </w:tblBorders>
+        <w:tblLayout w:type="fixed"/>
+        <w:tblCellMar>
+          <w:top w:type="dxa" w:w="60"/>
+          <w:left w:type="dxa" w:w="80"/>
+          <w:bottom w:type="dxa" w:w="60"/>
+          <w:right w:type="dxa" w:w="80"/>
+        </w:tblCellMar>
+      </w:tblPr>
+      <w:tblGrid>
+        <w:gridCol w:w="1200"/>
+        <w:gridCol w:w="2000"/>
+        <w:gridCol w:w="1200"/>
+        <w:gridCol w:w="2000"/>
+        <w:gridCol w:w="1200"/>
+        <w:gridCol w:w="1900"/>
+      </w:tblGrid>
+      <w:tr>
+        <w:trPr>
+          <w:tblHeader/>
+        </w:trPr>
+        <w:tc>
+          <w:tcPr>
+            <w:tcW w:w="1200" w:type="dxa"/>
+            <w:shd w:fill="1F3864" w:color="1F3864" w:val="solid"/>
+            <w:tcMar>
+              <w:top w:type="dxa" w:w="60"/>
+              <w:left w:type="dxa" w:w="80"/>
+              <w:bottom w:type="dxa" w:w="60"/>
+              <w:right w:type="dxa" w:w="80"/>
+            </w:tcMar>
+          </w:tcPr>
+          <w:p>
+            <w:pPr>
+              <w:jc w:val="center"/>
+            </w:pPr>
+            <w:r>
+              <w:rPr>
+                <w:b/>
+                <w:bCs/>
+                <w:color w:val="FFFFFF"/>
+                <w:sz w:val="18"/>
+                <w:szCs w:val="18"/>
+              </w:rPr>
+              <w:t xml:space="preserve">Day</w:t>
+            </w:r>
+          </w:p>
+        </w:tc>
+        <w:tc>
+          <w:tcPr>
+            <w:tcW w:w="2000" w:type="dxa"/>
+            <w:shd w:fill="1F3864" w:color="1F3864" w:val="solid"/>
+            <w:tcMar>
+              <w:top w:type="dxa" w:w="60"/>
+              <w:left w:type="dxa" w:w="80"/>
+              <w:bottom w:type="dxa" w:w="60"/>
+              <w:right w:type="dxa" w:w="80"/>
+            </w:tcMar>
+          </w:tcPr>
+          <w:p>
+            <w:pPr>
+              <w:jc w:val="center"/>
+            </w:pPr>
+            <w:r>
+              <w:rPr>
+                <w:b/>
+                <w:bCs/>
+                <w:color w:val="FFFFFF"/>
+                <w:sz w:val="18"/>
+                <w:szCs w:val="18"/>
+              </w:rPr>
+              <w:t xml:space="preserve">Addresses banned</w:t>
+            </w:r>
+          </w:p>
+        </w:tc>
+        <w:tc>
+          <w:tcPr>
+            <w:tcW w:w="1200" w:type="dxa"/>
+            <w:shd w:fill="1F3864" w:color="1F3864" w:val="solid"/>
+            <w:tcMar>
+              <w:top w:type="dxa" w:w="60"/>
+              <w:left w:type="dxa" w:w="80"/>
+              <w:bottom w:type="dxa" w:w="60"/>
+              <w:right w:type="dxa" w:w="80"/>
+            </w:tcMar>
+          </w:tcPr>
+          <w:p>
+            <w:pPr>
+              <w:jc w:val="center"/>
+            </w:pPr>
+            <w:r>
+              <w:rPr>
+                <w:b/>
+                <w:bCs/>
+                <w:color w:val="FFFFFF"/>
+                <w:sz w:val="18"/>
+                <w:szCs w:val="18"/>
+              </w:rPr>
+              <w:t xml:space="preserve">Day</w:t>
+            </w:r>
+          </w:p>
+        </w:tc>
+        <w:tc>
+          <w:tcPr>
+            <w:tcW w:w="2000" w:type="dxa"/>
+            <w:shd w:fill="1F3864" w:color="1F3864" w:val="solid"/>
+            <w:tcMar>
+              <w:top w:type="dxa" w:w="60"/>
+              <w:left w:type="dxa" w:w="80"/>
+              <w:bottom w:type="dxa" w:w="60"/>
+              <w:right w:type="dxa" w:w="80"/>
+            </w:tcMar>
+          </w:tcPr>
+          <w:p>
+            <w:pPr>
+              <w:jc w:val="center"/>
+            </w:pPr>
+            <w:r>
+              <w:rPr>
+                <w:b/>
+                <w:bCs/>
+                <w:color w:val="FFFFFF"/>
+                <w:sz w:val="18"/>
+                <w:szCs w:val="18"/>
+              </w:rPr>
+              <w:t xml:space="preserve">Addresses banned</w:t>
+            </w:r>
+          </w:p>
+        </w:tc>
+        <w:tc>
+          <w:tcPr>
+            <w:tcW w:w="1200" w:type="dxa"/>
+            <w:shd w:fill="1F3864" w:color="1F3864" w:val="solid"/>
+            <w:tcMar>
+              <w:top w:type="dxa" w:w="60"/>
+              <w:left w:type="dxa" w:w="80"/>
+              <w:bottom w:type="dxa" w:w="60"/>
+              <w:right w:type="dxa" w:w="80"/>
+            </w:tcMar>
+          </w:tcPr>
+          <w:p>
+            <w:pPr>
+              <w:jc w:val="center"/>
+            </w:pPr>
+            <w:r>
+              <w:rPr>
+                <w:b/>
+                <w:bCs/>
+                <w:color w:val="FFFFFF"/>
+                <w:sz w:val="18"/>
+                <w:szCs w:val="18"/>
+              </w:rPr>
+              <w:t xml:space="preserve">Day</w:t>
+            </w:r>
+          </w:p>
+        </w:tc>
+        <w:tc>
+          <w:tcPr>
+            <w:tcW w:w="1900" w:type="dxa"/>
+            <w:shd w:fill="1F3864" w:color="1F3864" w:val="solid"/>
+            <w:tcMar>
+              <w:top w:type="dxa" w:w="60"/>
+              <w:left w:type="dxa" w:w="80"/>
+              <w:bottom w:type="dxa" w:w="60"/>
+              <w:right w:type="dxa" w:w="80"/>
+            </w:tcMar>
+          </w:tcPr>
+          <w:p>
+            <w:pPr>
+              <w:jc w:val="center"/>
+            </w:pPr>
+            <w:r>
+              <w:rPr>
+                <w:b/>
+                <w:bCs/>
+                <w:color w:val="FFFFFF"/>
+                <w:sz w:val="18"/>
+                <w:szCs w:val="18"/>
+              </w:rPr>
+              <w:t xml:space="preserve">Addresses banned</w:t>
+            </w:r>
+          </w:p>
+        </w:tc>
+      </w:tr>
+      <w:tr>
+        <w:tc>
+          <w:tcPr>
+            <w:tcW w:w="1200" w:type="dxa"/>
+            <w:tcMar>
+              <w:top w:type="dxa" w:w="60"/>
+              <w:left w:type="dxa" w:w="80"/>
+              <w:bottom w:type="dxa" w:w="60"/>
+              <w:right w:type="dxa" w:w="80"/>
+            </w:tcMar>
+          </w:tcPr>
+          <w:p>
+            <w:pPr>
+              <w:jc w:val="left"/>
+            </w:pPr>
+            <w:r>
+              <w:rPr>
+                <w:b w:val="false"/>
+                <w:bCs w:val="false"/>
+                <w:sz w:val="18"/>
+                <w:szCs w:val="18"/>
+              </w:rPr>
+              <w:t xml:space="preserve">1 Oct</w:t>
+            </w:r>
+          </w:p>
+        </w:tc>
+        <w:tc>
+          <w:tcPr>
+            <w:tcW w:w="2000" w:type="dxa"/>
+            <w:tcMar>
+              <w:top w:type="dxa" w:w="60"/>
+              <w:left w:type="dxa" w:w="80"/>
+              <w:bottom w:type="dxa" w:w="60"/>
+              <w:right w:type="dxa" w:w="80"/>
+            </w:tcMar>
+          </w:tcPr>
+          <w:p>
+            <w:pPr>
+              <w:jc w:val="right"/>
+            </w:pPr>
+            <w:r>
+              <w:rPr>
+                <w:b w:val="false"/>
+                <w:bCs w:val="false"/>
+                <w:sz w:val="18"/>
+                <w:szCs w:val="18"/>
+              </w:rPr>
+              <w:t xml:space="preserve">10</w:t>
+            </w:r>
+          </w:p>
+        </w:tc>
+        <w:tc>
+          <w:tcPr>
+            <w:tcW w:w="1200" w:type="dxa"/>
+            <w:tcMar>
+              <w:top w:type="dxa" w:w="60"/>
+              <w:left w:type="dxa" w:w="80"/>
+              <w:bottom w:type="dxa" w:w="60"/>
+              <w:right w:type="dxa" w:w="80"/>
+            </w:tcMar>
+          </w:tcPr>
+          <w:p>
+            <w:pPr>
+              <w:jc w:val="left"/>
+            </w:pPr>
+            <w:r>
+              <w:rPr>
+                <w:b w:val="false"/>
+                <w:bCs w:val="false"/>
+                <w:sz w:val="18"/>
+                <w:szCs w:val="18"/>
+              </w:rPr>
+              <w:t xml:space="preserve">9 Oct</w:t>
+            </w:r>
+          </w:p>
+        </w:tc>
+        <w:tc>
+          <w:tcPr>
+            <w:tcW w:w="2000" w:type="dxa"/>
+            <w:tcMar>
+              <w:top w:type="dxa" w:w="60"/>
+              <w:left w:type="dxa" w:w="80"/>
+              <w:bottom w:type="dxa" w:w="60"/>
+              <w:right w:type="dxa" w:w="80"/>
+            </w:tcMar>
+          </w:tcPr>
+          <w:p>
+            <w:pPr>
+              <w:jc w:val="right"/>
+            </w:pPr>
+            <w:r>
+              <w:rPr>
+                <w:b w:val="false"/>
+                <w:bCs w:val="false"/>
+                <w:sz w:val="18"/>
+                <w:szCs w:val="18"/>
+              </w:rPr>
+              <w:t xml:space="preserve">19</w:t>
+            </w:r>
+          </w:p>
+        </w:tc>
+        <w:tc>
+          <w:tcPr>
+            <w:tcW w:w="1200" w:type="dxa"/>
+            <w:tcMar>
+              <w:top w:type="dxa" w:w="60"/>
+              <w:left w:type="dxa" w:w="80"/>
+              <w:bottom w:type="dxa" w:w="60"/>
+              <w:right w:type="dxa" w:w="80"/>
+            </w:tcMar>
+          </w:tcPr>
+          <w:p>
+            <w:pPr>
+              <w:jc w:val="left"/>
+            </w:pPr>
+            <w:r>
+              <w:rPr>
+                <w:b w:val="false"/>
+                <w:bCs w:val="false"/>
+                <w:sz w:val="18"/>
+                <w:szCs w:val="18"/>
+              </w:rPr>
+              <w:t xml:space="preserve">17 Oct</w:t>
+            </w:r>
+          </w:p>
+        </w:tc>
+        <w:tc>
+          <w:tcPr>
+            <w:tcW w:w="1900" w:type="dxa"/>
+            <w:tcMar>
+              <w:top w:type="dxa" w:w="60"/>
+              <w:left w:type="dxa" w:w="80"/>
+              <w:bottom w:type="dxa" w:w="60"/>
+              <w:right w:type="dxa" w:w="80"/>
+            </w:tcMar>
+          </w:tcPr>
+          <w:p>
+            <w:pPr>
+              <w:jc w:val="right"/>
+            </w:pPr>
+            <w:r>
+              <w:rPr>
+                <w:b w:val="false"/>
+                <w:bCs w:val="false"/>
+                <w:sz w:val="18"/>
+                <w:szCs w:val="18"/>
+              </w:rPr>
+              <w:t xml:space="preserve">6</w:t>
+            </w:r>
+          </w:p>
+        </w:tc>
+      </w:tr>
+      <w:tr>
+        <w:tc>
+          <w:tcPr>
+            <w:tcW w:w="1200" w:type="dxa"/>
+            <w:tcMar>
+              <w:top w:type="dxa" w:w="60"/>
+              <w:left w:type="dxa" w:w="80"/>
+              <w:bottom w:type="dxa" w:w="60"/>
+              <w:right w:type="dxa" w:w="80"/>
+            </w:tcMar>
+          </w:tcPr>
+          <w:p>
+            <w:pPr>
+              <w:jc w:val="left"/>
+            </w:pPr>
+            <w:r>
+              <w:rPr>
+                <w:b w:val="false"/>
+                <w:bCs w:val="false"/>
+                <w:sz w:val="18"/>
+                <w:szCs w:val="18"/>
+              </w:rPr>
+              <w:t xml:space="preserve">2 Oct</w:t>
+            </w:r>
+          </w:p>
+        </w:tc>
+        <w:tc>
+          <w:tcPr>
+            <w:tcW w:w="2000" w:type="dxa"/>
+            <w:tcMar>
+              <w:top w:type="dxa" w:w="60"/>
+              <w:left w:type="dxa" w:w="80"/>
+              <w:bottom w:type="dxa" w:w="60"/>
+              <w:right w:type="dxa" w:w="80"/>
+            </w:tcMar>
+          </w:tcPr>
+          <w:p>
+            <w:pPr>
+              <w:jc w:val="right"/>
+            </w:pPr>
+            <w:r>
+              <w:rPr>
+                <w:b w:val="false"/>
+                <w:bCs w:val="false"/>
+                <w:sz w:val="18"/>
+                <w:szCs w:val="18"/>
+              </w:rPr>
+              <w:t xml:space="preserve">10</w:t>
+            </w:r>
+          </w:p>
+        </w:tc>
+        <w:tc>
+          <w:tcPr>
+            <w:tcW w:w="1200" w:type="dxa"/>
+            <w:tcMar>
+              <w:top w:type="dxa" w:w="60"/>
+              <w:left w:type="dxa" w:w="80"/>
+              <w:bottom w:type="dxa" w:w="60"/>
+              <w:right w:type="dxa" w:w="80"/>
+            </w:tcMar>
+          </w:tcPr>
+          <w:p>
+            <w:pPr>
+              <w:jc w:val="left"/>
+            </w:pPr>
+            <w:r>
+              <w:rPr>
+                <w:b w:val="false"/>
+                <w:bCs w:val="false"/>
+                <w:sz w:val="18"/>
+                <w:szCs w:val="18"/>
+              </w:rPr>
+              <w:t xml:space="preserve">10 Oct</w:t>
+            </w:r>
+          </w:p>
+        </w:tc>
+        <w:tc>
+          <w:tcPr>
+            <w:tcW w:w="2000" w:type="dxa"/>
+            <w:tcMar>
+              <w:top w:type="dxa" w:w="60"/>
+              <w:left w:type="dxa" w:w="80"/>
+              <w:bottom w:type="dxa" w:w="60"/>
+              <w:right w:type="dxa" w:w="80"/>
+            </w:tcMar>
+          </w:tcPr>
+          <w:p>
+            <w:pPr>
+              <w:jc w:val="right"/>
+            </w:pPr>
+            <w:r>
+              <w:rPr>
+                <w:b w:val="false"/>
+                <w:bCs w:val="false"/>
+                <w:sz w:val="18"/>
+                <w:szCs w:val="18"/>
+              </w:rPr>
+              <w:t xml:space="preserve">4</w:t>
+            </w:r>
+          </w:p>
+        </w:tc>
+        <w:tc>
+          <w:tcPr>
+            <w:tcW w:w="1200" w:type="dxa"/>
+            <w:tcMar>
+              <w:top w:type="dxa" w:w="60"/>
+              <w:left w:type="dxa" w:w="80"/>
+              <w:bottom w:type="dxa" w:w="60"/>
+              <w:right w:type="dxa" w:w="80"/>
+            </w:tcMar>
+          </w:tcPr>
+          <w:p>
+            <w:pPr>
+              <w:jc w:val="left"/>
+            </w:pPr>
+            <w:r>
+              <w:rPr>
+                <w:b w:val="false"/>
+                <w:bCs w:val="false"/>
+                <w:sz w:val="18"/>
+                <w:szCs w:val="18"/>
+              </w:rPr>
+              <w:t xml:space="preserve">18 Oct</w:t>
+            </w:r>
+          </w:p>
+        </w:tc>
+        <w:tc>
+          <w:tcPr>
+            <w:tcW w:w="1900" w:type="dxa"/>
+            <w:tcMar>
+              <w:top w:type="dxa" w:w="60"/>
+              <w:left w:type="dxa" w:w="80"/>
+              <w:bottom w:type="dxa" w:w="60"/>
+              <w:right w:type="dxa" w:w="80"/>
+            </w:tcMar>
+          </w:tcPr>
+          <w:p>
+            <w:pPr>
+              <w:jc w:val="right"/>
+            </w:pPr>
+            <w:r>
+              <w:rPr>
+                <w:b w:val="false"/>
+                <w:bCs w:val="false"/>
+                <w:sz w:val="18"/>
+                <w:szCs w:val="18"/>
+              </w:rPr>
+              <w:t xml:space="preserve">3</w:t>
+            </w:r>
+          </w:p>
+        </w:tc>
+      </w:tr>
+      <w:tr>
+        <w:tc>
+          <w:tcPr>
+            <w:tcW w:w="1200" w:type="dxa"/>
+            <w:tcMar>
+              <w:top w:type="dxa" w:w="60"/>
+              <w:left w:type="dxa" w:w="80"/>
+              <w:bottom w:type="dxa" w:w="60"/>
+              <w:right w:type="dxa" w:w="80"/>
+            </w:tcMar>
+          </w:tcPr>
+          <w:p>
+            <w:pPr>
+              <w:jc w:val="left"/>
+            </w:pPr>
+            <w:r>
+              <w:rPr>
+                <w:b w:val="false"/>
+                <w:bCs w:val="false"/>
+                <w:sz w:val="18"/>
+                <w:szCs w:val="18"/>
+              </w:rPr>
+              <w:t xml:space="preserve">3 Oct</w:t>
+            </w:r>
+          </w:p>
+        </w:tc>
+        <w:tc>
+          <w:tcPr>
+            <w:tcW w:w="2000" w:type="dxa"/>
+            <w:tcMar>
+              <w:top w:type="dxa" w:w="60"/>
+              <w:left w:type="dxa" w:w="80"/>
+              <w:bottom w:type="dxa" w:w="60"/>
+              <w:right w:type="dxa" w:w="80"/>
+            </w:tcMar>
+          </w:tcPr>
+          <w:p>
+            <w:pPr>
+              <w:jc w:val="right"/>
+            </w:pPr>
+            <w:r>
+              <w:rPr>
+                <w:b w:val="false"/>
+                <w:bCs w:val="false"/>
+                <w:sz w:val="18"/>
+                <w:szCs w:val="18"/>
+              </w:rPr>
+              <w:t xml:space="preserve">6</w:t>
+            </w:r>
+          </w:p>
+        </w:tc>
+        <w:tc>
+          <w:tcPr>
+            <w:tcW w:w="1200" w:type="dxa"/>
+            <w:tcMar>
+              <w:top w:type="dxa" w:w="60"/>
+              <w:left w:type="dxa" w:w="80"/>
+              <w:bottom w:type="dxa" w:w="60"/>
+              <w:right w:type="dxa" w:w="80"/>
+            </w:tcMar>
+          </w:tcPr>
+          <w:p>
+            <w:pPr>
+              <w:jc w:val="left"/>
+            </w:pPr>
+            <w:r>
+              <w:rPr>
+                <w:b w:val="false"/>
+                <w:bCs w:val="false"/>
+                <w:sz w:val="18"/>
+                <w:szCs w:val="18"/>
+              </w:rPr>
+              <w:t xml:space="preserve">11 Oct</w:t>
+            </w:r>
+          </w:p>
+        </w:tc>
+        <w:tc>
+          <w:tcPr>
+            <w:tcW w:w="2000" w:type="dxa"/>
+            <w:tcMar>
+              <w:top w:type="dxa" w:w="60"/>
+              <w:left w:type="dxa" w:w="80"/>
+              <w:bottom w:type="dxa" w:w="60"/>
+              <w:right w:type="dxa" w:w="80"/>
+            </w:tcMar>
+          </w:tcPr>
+          <w:p>
+            <w:pPr>
+              <w:jc w:val="right"/>
+            </w:pPr>
+            <w:r>
+              <w:rPr>
+                <w:b w:val="false"/>
+                <w:bCs w:val="false"/>
+                <w:sz w:val="18"/>
+                <w:szCs w:val="18"/>
+              </w:rPr>
+              <w:t xml:space="preserve">4</w:t>
+            </w:r>
+          </w:p>
+        </w:tc>
+        <w:tc>
+          <w:tcPr>
+            <w:tcW w:w="1200" w:type="dxa"/>
+            <w:tcMar>
+              <w:top w:type="dxa" w:w="60"/>
+              <w:left w:type="dxa" w:w="80"/>
+              <w:bottom w:type="dxa" w:w="60"/>
+              <w:right w:type="dxa" w:w="80"/>
+            </w:tcMar>
+          </w:tcPr>
+          <w:p>
+            <w:pPr>
+              <w:jc w:val="left"/>
+            </w:pPr>
+            <w:r>
+              <w:rPr>
+                <w:b w:val="false"/>
+                <w:bCs w:val="false"/>
+                <w:sz w:val="18"/>
+                <w:szCs w:val="18"/>
+              </w:rPr>
+              <w:t xml:space="preserve">19 Oct</w:t>
+            </w:r>
+          </w:p>
+        </w:tc>
+        <w:tc>
+          <w:tcPr>
+            <w:tcW w:w="1900" w:type="dxa"/>
+            <w:tcMar>
+              <w:top w:type="dxa" w:w="60"/>
+              <w:left w:type="dxa" w:w="80"/>
+              <w:bottom w:type="dxa" w:w="60"/>
+              <w:right w:type="dxa" w:w="80"/>
+            </w:tcMar>
+          </w:tcPr>
+          <w:p>
+            <w:pPr>
+              <w:jc w:val="right"/>
+            </w:pPr>
+            <w:r>
+              <w:rPr>
+                <w:b w:val="false"/>
+                <w:bCs w:val="false"/>
+                <w:sz w:val="18"/>
+                <w:szCs w:val="18"/>
+              </w:rPr>
+              <w:t xml:space="preserve">2</w:t>
+            </w:r>
+          </w:p>
+        </w:tc>
+      </w:tr>
+      <w:tr>
+        <w:tc>
+          <w:tcPr>
+            <w:tcW w:w="1200" w:type="dxa"/>
+            <w:tcMar>
+              <w:top w:type="dxa" w:w="60"/>
+              <w:left w:type="dxa" w:w="80"/>
+              <w:bottom w:type="dxa" w:w="60"/>
+              <w:right w:type="dxa" w:w="80"/>
+            </w:tcMar>
+          </w:tcPr>
+          <w:p>
+            <w:pPr>
+              <w:jc w:val="left"/>
+            </w:pPr>
+            <w:r>
+              <w:rPr>
+                <w:b w:val="false"/>
+                <w:bCs w:val="false"/>
+                <w:sz w:val="18"/>
+                <w:szCs w:val="18"/>
+              </w:rPr>
+              <w:t xml:space="preserve">4 Oct</w:t>
+            </w:r>
+          </w:p>
+        </w:tc>
+        <w:tc>
+          <w:tcPr>
+            <w:tcW w:w="2000" w:type="dxa"/>
+            <w:tcMar>
+              <w:top w:type="dxa" w:w="60"/>
+              <w:left w:type="dxa" w:w="80"/>
+              <w:bottom w:type="dxa" w:w="60"/>
+              <w:right w:type="dxa" w:w="80"/>
+            </w:tcMar>
+          </w:tcPr>
+          <w:p>
+            <w:pPr>
+              <w:jc w:val="right"/>
+            </w:pPr>
+            <w:r>
+              <w:rPr>
+                <w:b w:val="false"/>
+                <w:bCs w:val="false"/>
+                <w:sz w:val="18"/>
+                <w:szCs w:val="18"/>
+              </w:rPr>
+              <w:t xml:space="preserve">3</w:t>
+            </w:r>
+          </w:p>
+        </w:tc>
+        <w:tc>
+          <w:tcPr>
+            <w:tcW w:w="1200" w:type="dxa"/>
+            <w:tcMar>
+              <w:top w:type="dxa" w:w="60"/>
+              <w:left w:type="dxa" w:w="80"/>
+              <w:bottom w:type="dxa" w:w="60"/>
+              <w:right w:type="dxa" w:w="80"/>
+            </w:tcMar>
+          </w:tcPr>
+          <w:p>
+            <w:pPr>
+              <w:jc w:val="left"/>
+            </w:pPr>
+            <w:r>
+              <w:rPr>
+                <w:b w:val="false"/>
+                <w:bCs w:val="false"/>
+                <w:sz w:val="18"/>
+                <w:szCs w:val="18"/>
+              </w:rPr>
+              <w:t xml:space="preserve">13 Oct</w:t>
+            </w:r>
+          </w:p>
+        </w:tc>
+        <w:tc>
+          <w:tcPr>
+            <w:tcW w:w="2000" w:type="dxa"/>
+            <w:tcMar>
+              <w:top w:type="dxa" w:w="60"/>
+              <w:left w:type="dxa" w:w="80"/>
+              <w:bottom w:type="dxa" w:w="60"/>
+              <w:right w:type="dxa" w:w="80"/>
+            </w:tcMar>
+          </w:tcPr>
+          <w:p>
+            <w:pPr>
+              <w:jc w:val="right"/>
+            </w:pPr>
+            <w:r>
+              <w:rPr>
+                <w:b w:val="false"/>
+                <w:bCs w:val="false"/>
+                <w:sz w:val="18"/>
+                <w:szCs w:val="18"/>
+              </w:rPr>
+              <w:t xml:space="preserve">8</w:t>
+            </w:r>
+          </w:p>
+        </w:tc>
+        <w:tc>
+          <w:tcPr>
+            <w:tcW w:w="1200" w:type="dxa"/>
+            <w:tcMar>
+              <w:top w:type="dxa" w:w="60"/>
+              <w:left w:type="dxa" w:w="80"/>
+              <w:bottom w:type="dxa" w:w="60"/>
+              <w:right w:type="dxa" w:w="80"/>
+            </w:tcMar>
+          </w:tcPr>
+          <w:p>
+            <w:pPr>
+              <w:jc w:val="left"/>
+            </w:pPr>
+            <w:r>
+              <w:rPr>
+                <w:b w:val="false"/>
+                <w:bCs w:val="false"/>
+                <w:sz w:val="18"/>
+                <w:szCs w:val="18"/>
+              </w:rPr>
+              <w:t xml:space="preserve">20 Oct</w:t>
+            </w:r>
+          </w:p>
+        </w:tc>
+        <w:tc>
+          <w:tcPr>
+            <w:tcW w:w="1900" w:type="dxa"/>
+            <w:tcMar>
+              <w:top w:type="dxa" w:w="60"/>
+              <w:left w:type="dxa" w:w="80"/>
+              <w:bottom w:type="dxa" w:w="60"/>
+              <w:right w:type="dxa" w:w="80"/>
+            </w:tcMar>
+          </w:tcPr>
+          <w:p>
+            <w:pPr>
+              <w:jc w:val="right"/>
+            </w:pPr>
+            <w:r>
+              <w:rPr>
+                <w:b w:val="false"/>
+                <w:bCs w:val="false"/>
+                <w:sz w:val="18"/>
+                <w:szCs w:val="18"/>
+              </w:rPr>
+              <w:t xml:space="preserve">2</w:t>
+            </w:r>
+          </w:p>
+        </w:tc>
+      </w:tr>
+      <w:tr>
+        <w:tc>
+          <w:tcPr>
+            <w:tcW w:w="1200" w:type="dxa"/>
+            <w:tcMar>
+              <w:top w:type="dxa" w:w="60"/>
+              <w:left w:type="dxa" w:w="80"/>
+              <w:bottom w:type="dxa" w:w="60"/>
+              <w:right w:type="dxa" w:w="80"/>
+            </w:tcMar>
+          </w:tcPr>
+          <w:p>
+            <w:pPr>
+              <w:jc w:val="left"/>
+            </w:pPr>
+            <w:r>
+              <w:rPr>
+                <w:b w:val="false"/>
+                <w:bCs w:val="false"/>
+                <w:sz w:val="18"/>
+                <w:szCs w:val="18"/>
+              </w:rPr>
+              <w:t xml:space="preserve">5 Oct</w:t>
+            </w:r>
+          </w:p>
+        </w:tc>
+        <w:tc>
+          <w:tcPr>
+            <w:tcW w:w="2000" w:type="dxa"/>
+            <w:tcMar>
+              <w:top w:type="dxa" w:w="60"/>
+              <w:left w:type="dxa" w:w="80"/>
+              <w:bottom w:type="dxa" w:w="60"/>
+              <w:right w:type="dxa" w:w="80"/>
+            </w:tcMar>
+          </w:tcPr>
+          <w:p>
+            <w:pPr>
+              <w:jc w:val="right"/>
+            </w:pPr>
+            <w:r>
+              <w:rPr>
+                <w:b w:val="false"/>
+                <w:bCs w:val="false"/>
+                <w:sz w:val="18"/>
+                <w:szCs w:val="18"/>
+              </w:rPr>
+              <w:t xml:space="preserve">6</w:t>
+            </w:r>
+          </w:p>
+        </w:tc>
+        <w:tc>
+          <w:tcPr>
+            <w:tcW w:w="1200" w:type="dxa"/>
+            <w:tcMar>
+              <w:top w:type="dxa" w:w="60"/>
+              <w:left w:type="dxa" w:w="80"/>
+              <w:bottom w:type="dxa" w:w="60"/>
+              <w:right w:type="dxa" w:w="80"/>
+            </w:tcMar>
+          </w:tcPr>
+          <w:p>
+            <w:pPr>
+              <w:jc w:val="left"/>
+            </w:pPr>
+            <w:r>
+              <w:rPr>
+                <w:b w:val="false"/>
+                <w:bCs w:val="false"/>
+                <w:sz w:val="18"/>
+                <w:szCs w:val="18"/>
+              </w:rPr>
+              <w:t xml:space="preserve">16 Oct</w:t>
+            </w:r>
+          </w:p>
+        </w:tc>
+        <w:tc>
+          <w:tcPr>
+            <w:tcW w:w="2000" w:type="dxa"/>
+            <w:tcMar>
+              <w:top w:type="dxa" w:w="60"/>
+              <w:left w:type="dxa" w:w="80"/>
+              <w:bottom w:type="dxa" w:w="60"/>
+              <w:right w:type="dxa" w:w="80"/>
+            </w:tcMar>
+          </w:tcPr>
+          <w:p>
+            <w:pPr>
+              <w:jc w:val="right"/>
+            </w:pPr>
+            <w:r>
+              <w:rPr>
+                <w:b w:val="false"/>
+                <w:bCs w:val="false"/>
+                <w:sz w:val="18"/>
+                <w:szCs w:val="18"/>
+              </w:rPr>
+              <w:t xml:space="preserve">10</w:t>
+            </w:r>
+          </w:p>
+        </w:tc>
+        <w:tc>
+          <w:tcPr>
+            <w:tcW w:w="1200" w:type="dxa"/>
+            <w:tcMar>
+              <w:top w:type="dxa" w:w="60"/>
+              <w:left w:type="dxa" w:w="80"/>
+              <w:bottom w:type="dxa" w:w="60"/>
+              <w:right w:type="dxa" w:w="80"/>
+            </w:tcMar>
+          </w:tcPr>
+          <w:p>
+            <w:pPr>
+              <w:jc w:val="left"/>
+            </w:pPr>
+            <w:r>
+              <w:rPr>
+                <w:b w:val="false"/>
+                <w:bCs w:val="false"/>
+                <w:sz w:val="18"/>
+                <w:szCs w:val="18"/>
+              </w:rPr>
+              <w:t xml:space="preserve">21 Oct</w:t>
+            </w:r>
+          </w:p>
+        </w:tc>
+        <w:tc>
+          <w:tcPr>
+            <w:tcW w:w="1900" w:type="dxa"/>
+            <w:tcMar>
+              <w:top w:type="dxa" w:w="60"/>
+              <w:left w:type="dxa" w:w="80"/>
+              <w:bottom w:type="dxa" w:w="60"/>
+              <w:right w:type="dxa" w:w="80"/>
+            </w:tcMar>
+          </w:tcPr>
+          <w:p>
+            <w:pPr>
+              <w:jc w:val="right"/>
+            </w:pPr>
+            <w:r>
+              <w:rPr>
+                <w:b w:val="false"/>
+                <w:bCs w:val="false"/>
+                <w:sz w:val="18"/>
+                <w:szCs w:val="18"/>
+              </w:rPr>
+              <w:t xml:space="preserve">1</w:t>
+            </w:r>
+          </w:p>
+        </w:tc>
+      </w:tr>
+    </w:tbl>
+    <w:p>
+      <w:pPr>
+        <w:spacing w:after="60"/>
+      </w:pPr>
+    </w:p>
+    <w:p>
+      <w:pPr>
+        <w:spacing w:after="120"/>
+        <w:jc w:val="left"/>
+      </w:pPr>
+      <w:r>
+        <w:rPr>
+          <w:sz w:val="20"/>
+          <w:szCs w:val="20"/>
+        </w:rPr>
+        <w:t xml:space="preserve">Days not listed (6 to 8, 12, 14 and 15 October) had no new bans. The busiest day, 9 October, accounted for 19 of the 94. Bans are spread across 22 of the 24 hours of the day with no working-hours pattern, which fits automation rather than people.</w:t>
+      </w:r>
+    </w:p>
+    <w:p>
+      <w:pPr>
         <w:pStyle w:val="Heading1"/>
         <w:shd w:fill="1F3864" w:color="1F3864" w:val="solid"/>
         <w:spacing w:after="160" w:before="320"/>
@@ -9204,7 +12993,7 @@
           <w:sz w:val="20"/>
           <w:szCs w:val="20"/>
         </w:rPr>
-        <w:t xml:space="preserve">In production the plugin made 97 ban actions: 81 from sensitive-path probes, 10 from error bursts, 5 relayed from the proxy’s own blacklist and 1 from an exploit pattern; the ban typically landed within one to two seconds of the first probe. Source and test notes are in the plugin repository.</w:t>
+        <w:t xml:space="preserve">In production the plugin made 97 ban actions: 81 from sensitive-path probes, 10 from error bursts, 5 relayed from the proxy’s own blacklist and 1 from an exploit pattern. From the triggering request to the ban the median was 3 seconds, and 1 to 4 seconds for the path detector, which does most of the work (Section 4.5). Source and test notes are in the plugin repository.</w:t>
       </w:r>
     </w:p>
     <w:p>
@@ -9623,7 +13412,154 @@
         </w:rPr>
       </w:pPr>
       <w:r>
-        <w:t xml:space="preserve">8. Method and limits</w:t>
+        <w:t xml:space="preserve">8. Questions administrators ask</w:t>
+      </w:r>
+    </w:p>
+    <w:p>
+      <w:pPr>
+        <w:spacing w:after="120"/>
+        <w:jc w:val="left"/>
+      </w:pPr>
+      <w:r>
+        <w:rPr>
+          <w:b/>
+          <w:bCs/>
+          <w:sz w:val="20"/>
+          <w:szCs w:val="20"/>
+        </w:rPr>
+        <w:t xml:space="preserve">Is the edge not enough on its own? </w:t>
+      </w:r>
+      <w:r>
+        <w:rPr>
+          <w:sz w:val="20"/>
+          <w:szCs w:val="20"/>
+        </w:rPr>
+        <w:t xml:space="preserve">It stops most of it, but it never sees your application’s own logs, so it cannot react to what a scanner does once a request gets through. The proxy sees that, and acting on it at the edge is the point of the plugin.</w:t>
+      </w:r>
+    </w:p>
+    <w:p>
+      <w:pPr>
+        <w:spacing w:after="120"/>
+        <w:jc w:val="left"/>
+      </w:pPr>
+      <w:r>
+        <w:rPr>
+          <w:b/>
+          <w:bCs/>
+          <w:sz w:val="20"/>
+          <w:szCs w:val="20"/>
+        </w:rPr>
+        <w:t xml:space="preserve">Why not ban anything that returns a 404? </w:t>
+      </w:r>
+      <w:r>
+        <w:rPr>
+          <w:sz w:val="20"/>
+          <w:szCs w:val="20"/>
+        </w:rPr>
+        <w:t xml:space="preserve">Because legitimate clients get 404s too, and a ban on one locks someone out. The detectors look for requests only a scanner makes, or for a sustained burst of errors.</w:t>
+      </w:r>
+    </w:p>
+    <w:p>
+      <w:pPr>
+        <w:spacing w:after="120"/>
+        <w:jc w:val="left"/>
+      </w:pPr>
+      <w:r>
+        <w:rPr>
+          <w:b/>
+          <w:bCs/>
+          <w:sz w:val="20"/>
+          <w:szCs w:val="20"/>
+        </w:rPr>
+        <w:t xml:space="preserve">Why do bans expire? </w:t>
+      </w:r>
+      <w:r>
+        <w:rPr>
+          <w:sz w:val="20"/>
+          <w:szCs w:val="20"/>
+        </w:rPr>
+        <w:t xml:space="preserve">Cloud and relay addresses are recycled. A permanent list slowly fills with innocent tenants, and the free plan’s list quota is small. Fourteen days has worked; two addresses did come back after expiry and were caught again within seconds.</w:t>
+      </w:r>
+    </w:p>
+    <w:p>
+      <w:pPr>
+        <w:spacing w:after="120"/>
+        <w:jc w:val="left"/>
+      </w:pPr>
+      <w:r>
+        <w:rPr>
+          <w:b/>
+          <w:bCs/>
+          <w:sz w:val="20"/>
+          <w:szCs w:val="20"/>
+        </w:rPr>
+        <w:t xml:space="preserve">Did it ever ban something it should not have? </w:t>
+      </w:r>
+      <w:r>
+        <w:rPr>
+          <w:sz w:val="20"/>
+          <w:szCs w:val="20"/>
+        </w:rPr>
+        <w:t xml:space="preserve">Not that we found. One application’s own front-end file looks like a credential probe and would have banned its own users; it is allow-listed by exact path, with tests that lookalikes are still flagged.</w:t>
+      </w:r>
+    </w:p>
+    <w:p>
+      <w:pPr>
+        <w:spacing w:after="120"/>
+        <w:jc w:val="left"/>
+      </w:pPr>
+      <w:r>
+        <w:rPr>
+          <w:b/>
+          <w:bCs/>
+          <w:sz w:val="20"/>
+          <w:szCs w:val="20"/>
+        </w:rPr>
+        <w:t xml:space="preserve">Can I do this without Cloudflare? </w:t>
+      </w:r>
+      <w:r>
+        <w:rPr>
+          <w:sz w:val="20"/>
+          <w:szCs w:val="20"/>
+        </w:rPr>
+        <w:t xml:space="preserve">The proxy-side layer works on its own (the plugin can run with only Zoraxy’s blacklist), but you lose the earlier edge block and the free reputation-based rules.</w:t>
+      </w:r>
+    </w:p>
+    <w:p>
+      <w:pPr>
+        <w:spacing w:after="120"/>
+        <w:jc w:val="left"/>
+      </w:pPr>
+      <w:r>
+        <w:rPr>
+          <w:b/>
+          <w:bCs/>
+          <w:sz w:val="20"/>
+          <w:szCs w:val="20"/>
+        </w:rPr>
+        <w:t xml:space="preserve">Is my own traffic at risk? </w:t>
+      </w:r>
+      <w:r>
+        <w:rPr>
+          <w:sz w:val="20"/>
+          <w:szCs w:val="20"/>
+        </w:rPr>
+        <w:t xml:space="preserve">Private, loopback and Cloudflare’s published proxy addresses are never banned. Start in dry run for a day or two and compare what it would do with your own logs before you let it act.</w:t>
+      </w:r>
+    </w:p>
+    <w:p>
+      <w:pPr>
+        <w:pStyle w:val="Heading1"/>
+        <w:shd w:fill="1F3864" w:color="1F3864" w:val="solid"/>
+        <w:spacing w:after="160" w:before="320"/>
+        <w:rPr>
+          <w:b/>
+          <w:bCs/>
+          <w:color w:val="FFFFFF"/>
+        </w:rPr>
+      </w:pPr>
+      <w:r>
+        <w:t xml:space="preserve">9. Method and limits</w:t>
       </w:r>
     </w:p>
     <w:p>
@@ -9636,7 +13572,7 @@
           <w:sz w:val="20"/>
           <w:szCs w:val="20"/>
         </w:rPr>
-        <w:t xml:space="preserve">Source: Zoraxy’s monthly access log summarised by a weekly script (October from the scheduled run of 18 October 23:00; April to September from re-runs of the complete monthly logs). Request totals exclude a few user-interface noise patterns. “Outside” counts every address outside the private networks. The ban counts come from the plugin’s journal.</w:t>
+        <w:t xml:space="preserve">Source: Zoraxy’s monthly access log summarised by a weekly script (October from the scheduled run of 18 October 23:00; April to September from re-runs of the complete monthly logs). Request totals exclude a few user-interface noise patterns. “Outside” counts every address outside the private networks. The ban counts and ban times come from the plugin’s journal. Latency in Section 4.5 is from the triggering request in the access log to the plugin’s ban time (both in local time, one-second resolution); network operators in Section 4.4 come from public routing data.</w:t>
       </w:r>
     </w:p>
     <w:p>

</xml_diff>

<commit_message>
docs: expanded public analysis; measured ban latency (#12)
* docs: expand public analysis; state measured ban latency

Co-Authored-By: Claude Sonnet 5.5 <noreply@anthropic.com>

* docs: README states measured ban latency

Co-Authored-By: Claude Sonnet 5.5 <noreply@anthropic.com>

* docs: forensic README and changelog for the expanded analysis

Co-Authored-By: Claude Sonnet 5.5 <noreply@anthropic.com>

---------

Co-authored-by: Claude Sonnet 5.5 <noreply@anthropic.com>
</commit_message>
<xml_diff>
--- a/docs/forensic/Zoraxy-Forensic-Network-Analysis-Oct2026-rev1.7-PUBLIC.docx
+++ b/docs/forensic/Zoraxy-Forensic-Network-Analysis-Oct2026-rev1.7-PUBLIC.docx
@@ -8195,6 +8195,3795 @@
     </w:p>
     <w:p>
       <w:pPr>
+        <w:pStyle w:val="Heading2"/>
+        <w:pBdr>
+          <w:bottom w:val="single" w:color="1F3864" w:sz="6"/>
+        </w:pBdr>
+        <w:spacing w:after="120" w:before="240"/>
+      </w:pPr>
+      <w:r>
+        <w:t xml:space="preserve">4.4 Where the banned addresses come from</w:t>
+      </w:r>
+    </w:p>
+    <w:p>
+      <w:pPr>
+        <w:spacing w:after="120"/>
+        <w:jc w:val="left"/>
+      </w:pPr>
+      <w:r>
+        <w:rPr>
+          <w:sz w:val="20"/>
+          <w:szCs w:val="20"/>
+        </w:rPr>
+        <w:t xml:space="preserve">Ninety-four distinct addresses were banned between 1 and 21 October (92 IPv4, 2 IPv6). Network registration was looked up from public routing data; it names the registered operator of the address, not who is behind it, and it is an inference about origin.</w:t>
+      </w:r>
+    </w:p>
+    <w:tbl>
+      <w:tblPr>
+        <w:tblW w:type="dxa" w:w="9500"/>
+        <w:tblBorders>
+          <w:top w:val="single" w:color="auto" w:sz="4"/>
+          <w:left w:val="single" w:color="auto" w:sz="4"/>
+          <w:bottom w:val="single" w:color="auto" w:sz="4"/>
+          <w:right w:val="single" w:color="auto" w:sz="4"/>
+          <w:insideH w:val="single" w:color="auto" w:sz="4"/>
+          <w:insideV w:val="single" w:color="auto" w:sz="4"/>
+        </w:tblBorders>
+        <w:tblLayout w:type="fixed"/>
+        <w:tblCellMar>
+          <w:top w:type="dxa" w:w="60"/>
+          <w:left w:type="dxa" w:w="80"/>
+          <w:bottom w:type="dxa" w:w="60"/>
+          <w:right w:type="dxa" w:w="80"/>
+        </w:tblCellMar>
+      </w:tblPr>
+      <w:tblGrid>
+        <w:gridCol w:w="6300"/>
+        <w:gridCol w:w="1600"/>
+        <w:gridCol w:w="1600"/>
+      </w:tblGrid>
+      <w:tr>
+        <w:trPr>
+          <w:tblHeader/>
+        </w:trPr>
+        <w:tc>
+          <w:tcPr>
+            <w:tcW w:w="6300" w:type="dxa"/>
+            <w:shd w:fill="1F3864" w:color="1F3864" w:val="solid"/>
+            <w:tcMar>
+              <w:top w:type="dxa" w:w="60"/>
+              <w:left w:type="dxa" w:w="80"/>
+              <w:bottom w:type="dxa" w:w="60"/>
+              <w:right w:type="dxa" w:w="80"/>
+            </w:tcMar>
+          </w:tcPr>
+          <w:p>
+            <w:pPr>
+              <w:jc w:val="center"/>
+            </w:pPr>
+            <w:r>
+              <w:rPr>
+                <w:b/>
+                <w:bCs/>
+                <w:color w:val="FFFFFF"/>
+                <w:sz w:val="18"/>
+                <w:szCs w:val="18"/>
+              </w:rPr>
+              <w:t xml:space="preserve">Network operator</w:t>
+            </w:r>
+          </w:p>
+        </w:tc>
+        <w:tc>
+          <w:tcPr>
+            <w:tcW w:w="1600" w:type="dxa"/>
+            <w:shd w:fill="1F3864" w:color="1F3864" w:val="solid"/>
+            <w:tcMar>
+              <w:top w:type="dxa" w:w="60"/>
+              <w:left w:type="dxa" w:w="80"/>
+              <w:bottom w:type="dxa" w:w="60"/>
+              <w:right w:type="dxa" w:w="80"/>
+            </w:tcMar>
+          </w:tcPr>
+          <w:p>
+            <w:pPr>
+              <w:jc w:val="center"/>
+            </w:pPr>
+            <w:r>
+              <w:rPr>
+                <w:b/>
+                <w:bCs/>
+                <w:color w:val="FFFFFF"/>
+                <w:sz w:val="18"/>
+                <w:szCs w:val="18"/>
+              </w:rPr>
+              <w:t xml:space="preserve">Addresses</w:t>
+            </w:r>
+          </w:p>
+        </w:tc>
+        <w:tc>
+          <w:tcPr>
+            <w:tcW w:w="1600" w:type="dxa"/>
+            <w:shd w:fill="1F3864" w:color="1F3864" w:val="solid"/>
+            <w:tcMar>
+              <w:top w:type="dxa" w:w="60"/>
+              <w:left w:type="dxa" w:w="80"/>
+              <w:bottom w:type="dxa" w:w="60"/>
+              <w:right w:type="dxa" w:w="80"/>
+            </w:tcMar>
+          </w:tcPr>
+          <w:p>
+            <w:pPr>
+              <w:jc w:val="center"/>
+            </w:pPr>
+            <w:r>
+              <w:rPr>
+                <w:b/>
+                <w:bCs/>
+                <w:color w:val="FFFFFF"/>
+                <w:sz w:val="18"/>
+                <w:szCs w:val="18"/>
+              </w:rPr>
+              <w:t xml:space="preserve">Share</w:t>
+            </w:r>
+          </w:p>
+        </w:tc>
+      </w:tr>
+      <w:tr>
+        <w:tc>
+          <w:tcPr>
+            <w:tcW w:w="6300" w:type="dxa"/>
+            <w:tcMar>
+              <w:top w:type="dxa" w:w="60"/>
+              <w:left w:type="dxa" w:w="80"/>
+              <w:bottom w:type="dxa" w:w="60"/>
+              <w:right w:type="dxa" w:w="80"/>
+            </w:tcMar>
+          </w:tcPr>
+          <w:p>
+            <w:pPr>
+              <w:jc w:val="left"/>
+            </w:pPr>
+            <w:r>
+              <w:rPr>
+                <w:b w:val="false"/>
+                <w:bCs w:val="false"/>
+                <w:sz w:val="18"/>
+                <w:szCs w:val="18"/>
+              </w:rPr>
+              <w:t xml:space="preserve">Google Cloud</w:t>
+            </w:r>
+          </w:p>
+        </w:tc>
+        <w:tc>
+          <w:tcPr>
+            <w:tcW w:w="1600" w:type="dxa"/>
+            <w:tcMar>
+              <w:top w:type="dxa" w:w="60"/>
+              <w:left w:type="dxa" w:w="80"/>
+              <w:bottom w:type="dxa" w:w="60"/>
+              <w:right w:type="dxa" w:w="80"/>
+            </w:tcMar>
+          </w:tcPr>
+          <w:p>
+            <w:pPr>
+              <w:jc w:val="right"/>
+            </w:pPr>
+            <w:r>
+              <w:rPr>
+                <w:b w:val="false"/>
+                <w:bCs w:val="false"/>
+                <w:sz w:val="18"/>
+                <w:szCs w:val="18"/>
+              </w:rPr>
+              <w:t xml:space="preserve">44</w:t>
+            </w:r>
+          </w:p>
+        </w:tc>
+        <w:tc>
+          <w:tcPr>
+            <w:tcW w:w="1600" w:type="dxa"/>
+            <w:tcMar>
+              <w:top w:type="dxa" w:w="60"/>
+              <w:left w:type="dxa" w:w="80"/>
+              <w:bottom w:type="dxa" w:w="60"/>
+              <w:right w:type="dxa" w:w="80"/>
+            </w:tcMar>
+          </w:tcPr>
+          <w:p>
+            <w:pPr>
+              <w:jc w:val="right"/>
+            </w:pPr>
+            <w:r>
+              <w:rPr>
+                <w:b w:val="false"/>
+                <w:bCs w:val="false"/>
+                <w:sz w:val="18"/>
+                <w:szCs w:val="18"/>
+              </w:rPr>
+              <w:t xml:space="preserve">47%</w:t>
+            </w:r>
+          </w:p>
+        </w:tc>
+      </w:tr>
+      <w:tr>
+        <w:tc>
+          <w:tcPr>
+            <w:tcW w:w="6300" w:type="dxa"/>
+            <w:tcMar>
+              <w:top w:type="dxa" w:w="60"/>
+              <w:left w:type="dxa" w:w="80"/>
+              <w:bottom w:type="dxa" w:w="60"/>
+              <w:right w:type="dxa" w:w="80"/>
+            </w:tcMar>
+          </w:tcPr>
+          <w:p>
+            <w:pPr>
+              <w:jc w:val="left"/>
+            </w:pPr>
+            <w:r>
+              <w:rPr>
+                <w:b w:val="false"/>
+                <w:bCs w:val="false"/>
+                <w:sz w:val="18"/>
+                <w:szCs w:val="18"/>
+              </w:rPr>
+              <w:t xml:space="preserve">DigitalOcean</w:t>
+            </w:r>
+          </w:p>
+        </w:tc>
+        <w:tc>
+          <w:tcPr>
+            <w:tcW w:w="1600" w:type="dxa"/>
+            <w:tcMar>
+              <w:top w:type="dxa" w:w="60"/>
+              <w:left w:type="dxa" w:w="80"/>
+              <w:bottom w:type="dxa" w:w="60"/>
+              <w:right w:type="dxa" w:w="80"/>
+            </w:tcMar>
+          </w:tcPr>
+          <w:p>
+            <w:pPr>
+              <w:jc w:val="right"/>
+            </w:pPr>
+            <w:r>
+              <w:rPr>
+                <w:b w:val="false"/>
+                <w:bCs w:val="false"/>
+                <w:sz w:val="18"/>
+                <w:szCs w:val="18"/>
+              </w:rPr>
+              <w:t xml:space="preserve">32</w:t>
+            </w:r>
+          </w:p>
+        </w:tc>
+        <w:tc>
+          <w:tcPr>
+            <w:tcW w:w="1600" w:type="dxa"/>
+            <w:tcMar>
+              <w:top w:type="dxa" w:w="60"/>
+              <w:left w:type="dxa" w:w="80"/>
+              <w:bottom w:type="dxa" w:w="60"/>
+              <w:right w:type="dxa" w:w="80"/>
+            </w:tcMar>
+          </w:tcPr>
+          <w:p>
+            <w:pPr>
+              <w:jc w:val="right"/>
+            </w:pPr>
+            <w:r>
+              <w:rPr>
+                <w:b w:val="false"/>
+                <w:bCs w:val="false"/>
+                <w:sz w:val="18"/>
+                <w:szCs w:val="18"/>
+              </w:rPr>
+              <w:t xml:space="preserve">34%</w:t>
+            </w:r>
+          </w:p>
+        </w:tc>
+      </w:tr>
+      <w:tr>
+        <w:tc>
+          <w:tcPr>
+            <w:tcW w:w="6300" w:type="dxa"/>
+            <w:tcMar>
+              <w:top w:type="dxa" w:w="60"/>
+              <w:left w:type="dxa" w:w="80"/>
+              <w:bottom w:type="dxa" w:w="60"/>
+              <w:right w:type="dxa" w:w="80"/>
+            </w:tcMar>
+          </w:tcPr>
+          <w:p>
+            <w:pPr>
+              <w:jc w:val="left"/>
+            </w:pPr>
+            <w:r>
+              <w:rPr>
+                <w:b w:val="false"/>
+                <w:bCs w:val="false"/>
+                <w:sz w:val="18"/>
+                <w:szCs w:val="18"/>
+              </w:rPr>
+              <w:t xml:space="preserve">A Hong Kong data-centre operator</w:t>
+            </w:r>
+          </w:p>
+        </w:tc>
+        <w:tc>
+          <w:tcPr>
+            <w:tcW w:w="1600" w:type="dxa"/>
+            <w:tcMar>
+              <w:top w:type="dxa" w:w="60"/>
+              <w:left w:type="dxa" w:w="80"/>
+              <w:bottom w:type="dxa" w:w="60"/>
+              <w:right w:type="dxa" w:w="80"/>
+            </w:tcMar>
+          </w:tcPr>
+          <w:p>
+            <w:pPr>
+              <w:jc w:val="right"/>
+            </w:pPr>
+            <w:r>
+              <w:rPr>
+                <w:b w:val="false"/>
+                <w:bCs w:val="false"/>
+                <w:sz w:val="18"/>
+                <w:szCs w:val="18"/>
+              </w:rPr>
+              <w:t xml:space="preserve">5</w:t>
+            </w:r>
+          </w:p>
+        </w:tc>
+        <w:tc>
+          <w:tcPr>
+            <w:tcW w:w="1600" w:type="dxa"/>
+            <w:tcMar>
+              <w:top w:type="dxa" w:w="60"/>
+              <w:left w:type="dxa" w:w="80"/>
+              <w:bottom w:type="dxa" w:w="60"/>
+              <w:right w:type="dxa" w:w="80"/>
+            </w:tcMar>
+          </w:tcPr>
+          <w:p>
+            <w:pPr>
+              <w:jc w:val="right"/>
+            </w:pPr>
+            <w:r>
+              <w:rPr>
+                <w:b w:val="false"/>
+                <w:bCs w:val="false"/>
+                <w:sz w:val="18"/>
+                <w:szCs w:val="18"/>
+              </w:rPr>
+              <w:t xml:space="preserve">5%</w:t>
+            </w:r>
+          </w:p>
+        </w:tc>
+      </w:tr>
+      <w:tr>
+        <w:tc>
+          <w:tcPr>
+            <w:tcW w:w="6300" w:type="dxa"/>
+            <w:tcMar>
+              <w:top w:type="dxa" w:w="60"/>
+              <w:left w:type="dxa" w:w="80"/>
+              <w:bottom w:type="dxa" w:w="60"/>
+              <w:right w:type="dxa" w:w="80"/>
+            </w:tcMar>
+          </w:tcPr>
+          <w:p>
+            <w:pPr>
+              <w:jc w:val="left"/>
+            </w:pPr>
+            <w:r>
+              <w:rPr>
+                <w:b w:val="false"/>
+                <w:bCs w:val="false"/>
+                <w:sz w:val="18"/>
+                <w:szCs w:val="18"/>
+              </w:rPr>
+              <w:t xml:space="preserve">A Chinese carrier backbone</w:t>
+            </w:r>
+          </w:p>
+        </w:tc>
+        <w:tc>
+          <w:tcPr>
+            <w:tcW w:w="1600" w:type="dxa"/>
+            <w:tcMar>
+              <w:top w:type="dxa" w:w="60"/>
+              <w:left w:type="dxa" w:w="80"/>
+              <w:bottom w:type="dxa" w:w="60"/>
+              <w:right w:type="dxa" w:w="80"/>
+            </w:tcMar>
+          </w:tcPr>
+          <w:p>
+            <w:pPr>
+              <w:jc w:val="right"/>
+            </w:pPr>
+            <w:r>
+              <w:rPr>
+                <w:b w:val="false"/>
+                <w:bCs w:val="false"/>
+                <w:sz w:val="18"/>
+                <w:szCs w:val="18"/>
+              </w:rPr>
+              <w:t xml:space="preserve">2</w:t>
+            </w:r>
+          </w:p>
+        </w:tc>
+        <w:tc>
+          <w:tcPr>
+            <w:tcW w:w="1600" w:type="dxa"/>
+            <w:tcMar>
+              <w:top w:type="dxa" w:w="60"/>
+              <w:left w:type="dxa" w:w="80"/>
+              <w:bottom w:type="dxa" w:w="60"/>
+              <w:right w:type="dxa" w:w="80"/>
+            </w:tcMar>
+          </w:tcPr>
+          <w:p>
+            <w:pPr>
+              <w:jc w:val="right"/>
+            </w:pPr>
+            <w:r>
+              <w:rPr>
+                <w:b w:val="false"/>
+                <w:bCs w:val="false"/>
+                <w:sz w:val="18"/>
+                <w:szCs w:val="18"/>
+              </w:rPr>
+              <w:t xml:space="preserve">2%</w:t>
+            </w:r>
+          </w:p>
+        </w:tc>
+      </w:tr>
+      <w:tr>
+        <w:tc>
+          <w:tcPr>
+            <w:tcW w:w="6300" w:type="dxa"/>
+            <w:tcMar>
+              <w:top w:type="dxa" w:w="60"/>
+              <w:left w:type="dxa" w:w="80"/>
+              <w:bottom w:type="dxa" w:w="60"/>
+              <w:right w:type="dxa" w:w="80"/>
+            </w:tcMar>
+          </w:tcPr>
+          <w:p>
+            <w:pPr>
+              <w:jc w:val="left"/>
+            </w:pPr>
+            <w:r>
+              <w:rPr>
+                <w:b w:val="false"/>
+                <w:bCs w:val="false"/>
+                <w:sz w:val="18"/>
+                <w:szCs w:val="18"/>
+              </w:rPr>
+              <w:t xml:space="preserve">Cloudflare’s consumer relay service (outside its edge ranges)</w:t>
+            </w:r>
+          </w:p>
+        </w:tc>
+        <w:tc>
+          <w:tcPr>
+            <w:tcW w:w="1600" w:type="dxa"/>
+            <w:tcMar>
+              <w:top w:type="dxa" w:w="60"/>
+              <w:left w:type="dxa" w:w="80"/>
+              <w:bottom w:type="dxa" w:w="60"/>
+              <w:right w:type="dxa" w:w="80"/>
+            </w:tcMar>
+          </w:tcPr>
+          <w:p>
+            <w:pPr>
+              <w:jc w:val="right"/>
+            </w:pPr>
+            <w:r>
+              <w:rPr>
+                <w:b w:val="false"/>
+                <w:bCs w:val="false"/>
+                <w:sz w:val="18"/>
+                <w:szCs w:val="18"/>
+              </w:rPr>
+              <w:t xml:space="preserve">2</w:t>
+            </w:r>
+          </w:p>
+        </w:tc>
+        <w:tc>
+          <w:tcPr>
+            <w:tcW w:w="1600" w:type="dxa"/>
+            <w:tcMar>
+              <w:top w:type="dxa" w:w="60"/>
+              <w:left w:type="dxa" w:w="80"/>
+              <w:bottom w:type="dxa" w:w="60"/>
+              <w:right w:type="dxa" w:w="80"/>
+            </w:tcMar>
+          </w:tcPr>
+          <w:p>
+            <w:pPr>
+              <w:jc w:val="right"/>
+            </w:pPr>
+            <w:r>
+              <w:rPr>
+                <w:b w:val="false"/>
+                <w:bCs w:val="false"/>
+                <w:sz w:val="18"/>
+                <w:szCs w:val="18"/>
+              </w:rPr>
+              <w:t xml:space="preserve">2%</w:t>
+            </w:r>
+          </w:p>
+        </w:tc>
+      </w:tr>
+      <w:tr>
+        <w:tc>
+          <w:tcPr>
+            <w:tcW w:w="6300" w:type="dxa"/>
+            <w:tcMar>
+              <w:top w:type="dxa" w:w="60"/>
+              <w:left w:type="dxa" w:w="80"/>
+              <w:bottom w:type="dxa" w:w="60"/>
+              <w:right w:type="dxa" w:w="80"/>
+            </w:tcMar>
+          </w:tcPr>
+          <w:p>
+            <w:pPr>
+              <w:jc w:val="left"/>
+            </w:pPr>
+            <w:r>
+              <w:rPr>
+                <w:b w:val="false"/>
+                <w:bCs w:val="false"/>
+                <w:sz w:val="18"/>
+                <w:szCs w:val="18"/>
+              </w:rPr>
+              <w:t xml:space="preserve">A US hosting provider</w:t>
+            </w:r>
+          </w:p>
+        </w:tc>
+        <w:tc>
+          <w:tcPr>
+            <w:tcW w:w="1600" w:type="dxa"/>
+            <w:tcMar>
+              <w:top w:type="dxa" w:w="60"/>
+              <w:left w:type="dxa" w:w="80"/>
+              <w:bottom w:type="dxa" w:w="60"/>
+              <w:right w:type="dxa" w:w="80"/>
+            </w:tcMar>
+          </w:tcPr>
+          <w:p>
+            <w:pPr>
+              <w:jc w:val="right"/>
+            </w:pPr>
+            <w:r>
+              <w:rPr>
+                <w:b w:val="false"/>
+                <w:bCs w:val="false"/>
+                <w:sz w:val="18"/>
+                <w:szCs w:val="18"/>
+              </w:rPr>
+              <w:t xml:space="preserve">2</w:t>
+            </w:r>
+          </w:p>
+        </w:tc>
+        <w:tc>
+          <w:tcPr>
+            <w:tcW w:w="1600" w:type="dxa"/>
+            <w:tcMar>
+              <w:top w:type="dxa" w:w="60"/>
+              <w:left w:type="dxa" w:w="80"/>
+              <w:bottom w:type="dxa" w:w="60"/>
+              <w:right w:type="dxa" w:w="80"/>
+            </w:tcMar>
+          </w:tcPr>
+          <w:p>
+            <w:pPr>
+              <w:jc w:val="right"/>
+            </w:pPr>
+            <w:r>
+              <w:rPr>
+                <w:b w:val="false"/>
+                <w:bCs w:val="false"/>
+                <w:sz w:val="18"/>
+                <w:szCs w:val="18"/>
+              </w:rPr>
+              <w:t xml:space="preserve">2%</w:t>
+            </w:r>
+          </w:p>
+        </w:tc>
+      </w:tr>
+      <w:tr>
+        <w:tc>
+          <w:tcPr>
+            <w:tcW w:w="6300" w:type="dxa"/>
+            <w:tcMar>
+              <w:top w:type="dxa" w:w="60"/>
+              <w:left w:type="dxa" w:w="80"/>
+              <w:bottom w:type="dxa" w:w="60"/>
+              <w:right w:type="dxa" w:w="80"/>
+            </w:tcMar>
+          </w:tcPr>
+          <w:p>
+            <w:pPr>
+              <w:jc w:val="left"/>
+            </w:pPr>
+            <w:r>
+              <w:rPr>
+                <w:b w:val="false"/>
+                <w:bCs w:val="false"/>
+                <w:sz w:val="18"/>
+                <w:szCs w:val="18"/>
+              </w:rPr>
+              <w:t xml:space="preserve">Seven other hosting providers, one address each (Tencent, and companies in the US, UK, Russia, Ukraine and the Seychelles)</w:t>
+            </w:r>
+          </w:p>
+        </w:tc>
+        <w:tc>
+          <w:tcPr>
+            <w:tcW w:w="1600" w:type="dxa"/>
+            <w:tcMar>
+              <w:top w:type="dxa" w:w="60"/>
+              <w:left w:type="dxa" w:w="80"/>
+              <w:bottom w:type="dxa" w:w="60"/>
+              <w:right w:type="dxa" w:w="80"/>
+            </w:tcMar>
+          </w:tcPr>
+          <w:p>
+            <w:pPr>
+              <w:jc w:val="right"/>
+            </w:pPr>
+            <w:r>
+              <w:rPr>
+                <w:b w:val="false"/>
+                <w:bCs w:val="false"/>
+                <w:sz w:val="18"/>
+                <w:szCs w:val="18"/>
+              </w:rPr>
+              <w:t xml:space="preserve">7</w:t>
+            </w:r>
+          </w:p>
+        </w:tc>
+        <w:tc>
+          <w:tcPr>
+            <w:tcW w:w="1600" w:type="dxa"/>
+            <w:tcMar>
+              <w:top w:type="dxa" w:w="60"/>
+              <w:left w:type="dxa" w:w="80"/>
+              <w:bottom w:type="dxa" w:w="60"/>
+              <w:right w:type="dxa" w:w="80"/>
+            </w:tcMar>
+          </w:tcPr>
+          <w:p>
+            <w:pPr>
+              <w:jc w:val="right"/>
+            </w:pPr>
+            <w:r>
+              <w:rPr>
+                <w:b w:val="false"/>
+                <w:bCs w:val="false"/>
+                <w:sz w:val="18"/>
+                <w:szCs w:val="18"/>
+              </w:rPr>
+              <w:t xml:space="preserve">7%</w:t>
+            </w:r>
+          </w:p>
+        </w:tc>
+      </w:tr>
+    </w:tbl>
+    <w:p>
+      <w:pPr>
+        <w:spacing w:after="60"/>
+      </w:pPr>
+    </w:p>
+    <w:p>
+      <w:pPr>
+        <w:spacing w:after="120"/>
+        <w:jc w:val="left"/>
+      </w:pPr>
+      <w:r>
+        <w:rPr>
+          <w:sz w:val="20"/>
+          <w:szCs w:val="20"/>
+        </w:rPr>
+        <w:t xml:space="preserve">Four in five come from two cloud providers, which is why a rule that challenges verified-bot claims from cloud ranges is cheap and effective. The two addresses from Cloudflare’s relay service are worth a note: they probed for version-control metadata, they are not part of Cloudflare’s published proxy ranges (which the plugin never bans), and a consumer relay is an easy way for a scanner to look like ordinary traffic.</w:t>
+      </w:r>
+    </w:p>
+    <w:p>
+      <w:pPr>
+        <w:pStyle w:val="Heading2"/>
+        <w:pBdr>
+          <w:bottom w:val="single" w:color="1F3864" w:sz="6"/>
+        </w:pBdr>
+        <w:spacing w:after="120" w:before="240"/>
+      </w:pPr>
+      <w:r>
+        <w:t xml:space="preserve">4.5 How fast a ban lands</w:t>
+      </w:r>
+    </w:p>
+    <w:p>
+      <w:pPr>
+        <w:spacing w:after="120"/>
+        <w:jc w:val="left"/>
+      </w:pPr>
+      <w:r>
+        <w:rPr>
+          <w:sz w:val="20"/>
+          <w:szCs w:val="20"/>
+        </w:rPr>
+        <w:t xml:space="preserve">Measured from the request that triggered the detector to the plugin’s ban, for the 77 banned addresses that have matching lines in the October access log (the rest were banned from earlier requests or by an event relayed from the proxy).</w:t>
+      </w:r>
+    </w:p>
+    <w:tbl>
+      <w:tblPr>
+        <w:tblW w:type="dxa" w:w="9500"/>
+        <w:tblBorders>
+          <w:top w:val="single" w:color="auto" w:sz="4"/>
+          <w:left w:val="single" w:color="auto" w:sz="4"/>
+          <w:bottom w:val="single" w:color="auto" w:sz="4"/>
+          <w:right w:val="single" w:color="auto" w:sz="4"/>
+          <w:insideH w:val="single" w:color="auto" w:sz="4"/>
+          <w:insideV w:val="single" w:color="auto" w:sz="4"/>
+        </w:tblBorders>
+        <w:tblLayout w:type="fixed"/>
+        <w:tblCellMar>
+          <w:top w:type="dxa" w:w="60"/>
+          <w:left w:type="dxa" w:w="80"/>
+          <w:bottom w:type="dxa" w:w="60"/>
+          <w:right w:type="dxa" w:w="80"/>
+        </w:tblCellMar>
+      </w:tblPr>
+      <w:tblGrid>
+        <w:gridCol w:w="4300"/>
+        <w:gridCol w:w="1000"/>
+        <w:gridCol w:w="1200"/>
+        <w:gridCol w:w="3000"/>
+      </w:tblGrid>
+      <w:tr>
+        <w:trPr>
+          <w:tblHeader/>
+        </w:trPr>
+        <w:tc>
+          <w:tcPr>
+            <w:tcW w:w="4300" w:type="dxa"/>
+            <w:shd w:fill="1F3864" w:color="1F3864" w:val="solid"/>
+            <w:tcMar>
+              <w:top w:type="dxa" w:w="60"/>
+              <w:left w:type="dxa" w:w="80"/>
+              <w:bottom w:type="dxa" w:w="60"/>
+              <w:right w:type="dxa" w:w="80"/>
+            </w:tcMar>
+          </w:tcPr>
+          <w:p>
+            <w:pPr>
+              <w:jc w:val="center"/>
+            </w:pPr>
+            <w:r>
+              <w:rPr>
+                <w:b/>
+                <w:bCs/>
+                <w:color w:val="FFFFFF"/>
+                <w:sz w:val="18"/>
+                <w:szCs w:val="18"/>
+              </w:rPr>
+              <w:t xml:space="preserve">Detector</w:t>
+            </w:r>
+          </w:p>
+        </w:tc>
+        <w:tc>
+          <w:tcPr>
+            <w:tcW w:w="1000" w:type="dxa"/>
+            <w:shd w:fill="1F3864" w:color="1F3864" w:val="solid"/>
+            <w:tcMar>
+              <w:top w:type="dxa" w:w="60"/>
+              <w:left w:type="dxa" w:w="80"/>
+              <w:bottom w:type="dxa" w:w="60"/>
+              <w:right w:type="dxa" w:w="80"/>
+            </w:tcMar>
+          </w:tcPr>
+          <w:p>
+            <w:pPr>
+              <w:jc w:val="center"/>
+            </w:pPr>
+            <w:r>
+              <w:rPr>
+                <w:b/>
+                <w:bCs/>
+                <w:color w:val="FFFFFF"/>
+                <w:sz w:val="18"/>
+                <w:szCs w:val="18"/>
+              </w:rPr>
+              <w:t xml:space="preserve">Bans</w:t>
+            </w:r>
+          </w:p>
+        </w:tc>
+        <w:tc>
+          <w:tcPr>
+            <w:tcW w:w="1200" w:type="dxa"/>
+            <w:shd w:fill="1F3864" w:color="1F3864" w:val="solid"/>
+            <w:tcMar>
+              <w:top w:type="dxa" w:w="60"/>
+              <w:left w:type="dxa" w:w="80"/>
+              <w:bottom w:type="dxa" w:w="60"/>
+              <w:right w:type="dxa" w:w="80"/>
+            </w:tcMar>
+          </w:tcPr>
+          <w:p>
+            <w:pPr>
+              <w:jc w:val="center"/>
+            </w:pPr>
+            <w:r>
+              <w:rPr>
+                <w:b/>
+                <w:bCs/>
+                <w:color w:val="FFFFFF"/>
+                <w:sz w:val="18"/>
+                <w:szCs w:val="18"/>
+              </w:rPr>
+              <w:t xml:space="preserve">Median</w:t>
+            </w:r>
+          </w:p>
+        </w:tc>
+        <w:tc>
+          <w:tcPr>
+            <w:tcW w:w="3000" w:type="dxa"/>
+            <w:shd w:fill="1F3864" w:color="1F3864" w:val="solid"/>
+            <w:tcMar>
+              <w:top w:type="dxa" w:w="60"/>
+              <w:left w:type="dxa" w:w="80"/>
+              <w:bottom w:type="dxa" w:w="60"/>
+              <w:right w:type="dxa" w:w="80"/>
+            </w:tcMar>
+          </w:tcPr>
+          <w:p>
+            <w:pPr>
+              <w:jc w:val="center"/>
+            </w:pPr>
+            <w:r>
+              <w:rPr>
+                <w:b/>
+                <w:bCs/>
+                <w:color w:val="FFFFFF"/>
+                <w:sz w:val="18"/>
+                <w:szCs w:val="18"/>
+              </w:rPr>
+              <w:t xml:space="preserve">Range</w:t>
+            </w:r>
+          </w:p>
+        </w:tc>
+      </w:tr>
+      <w:tr>
+        <w:tc>
+          <w:tcPr>
+            <w:tcW w:w="4300" w:type="dxa"/>
+            <w:tcMar>
+              <w:top w:type="dxa" w:w="60"/>
+              <w:left w:type="dxa" w:w="80"/>
+              <w:bottom w:type="dxa" w:w="60"/>
+              <w:right w:type="dxa" w:w="80"/>
+            </w:tcMar>
+          </w:tcPr>
+          <w:p>
+            <w:pPr>
+              <w:jc w:val="left"/>
+            </w:pPr>
+            <w:r>
+              <w:rPr>
+                <w:b w:val="false"/>
+                <w:bCs w:val="false"/>
+                <w:sz w:val="18"/>
+                <w:szCs w:val="18"/>
+              </w:rPr>
+              <w:t xml:space="preserve">Sensitive-path probe</w:t>
+            </w:r>
+          </w:p>
+        </w:tc>
+        <w:tc>
+          <w:tcPr>
+            <w:tcW w:w="1000" w:type="dxa"/>
+            <w:tcMar>
+              <w:top w:type="dxa" w:w="60"/>
+              <w:left w:type="dxa" w:w="80"/>
+              <w:bottom w:type="dxa" w:w="60"/>
+              <w:right w:type="dxa" w:w="80"/>
+            </w:tcMar>
+          </w:tcPr>
+          <w:p>
+            <w:pPr>
+              <w:jc w:val="right"/>
+            </w:pPr>
+            <w:r>
+              <w:rPr>
+                <w:b w:val="false"/>
+                <w:bCs w:val="false"/>
+                <w:sz w:val="18"/>
+                <w:szCs w:val="18"/>
+              </w:rPr>
+              <w:t xml:space="preserve">63</w:t>
+            </w:r>
+          </w:p>
+        </w:tc>
+        <w:tc>
+          <w:tcPr>
+            <w:tcW w:w="1200" w:type="dxa"/>
+            <w:tcMar>
+              <w:top w:type="dxa" w:w="60"/>
+              <w:left w:type="dxa" w:w="80"/>
+              <w:bottom w:type="dxa" w:w="60"/>
+              <w:right w:type="dxa" w:w="80"/>
+            </w:tcMar>
+          </w:tcPr>
+          <w:p>
+            <w:pPr>
+              <w:jc w:val="right"/>
+            </w:pPr>
+            <w:r>
+              <w:rPr>
+                <w:b w:val="false"/>
+                <w:bCs w:val="false"/>
+                <w:sz w:val="18"/>
+                <w:szCs w:val="18"/>
+              </w:rPr>
+              <w:t xml:space="preserve">2 s</w:t>
+            </w:r>
+          </w:p>
+        </w:tc>
+        <w:tc>
+          <w:tcPr>
+            <w:tcW w:w="3000" w:type="dxa"/>
+            <w:tcMar>
+              <w:top w:type="dxa" w:w="60"/>
+              <w:left w:type="dxa" w:w="80"/>
+              <w:bottom w:type="dxa" w:w="60"/>
+              <w:right w:type="dxa" w:w="80"/>
+            </w:tcMar>
+          </w:tcPr>
+          <w:p>
+            <w:pPr>
+              <w:jc w:val="left"/>
+            </w:pPr>
+            <w:r>
+              <w:rPr>
+                <w:b w:val="false"/>
+                <w:bCs w:val="false"/>
+                <w:sz w:val="18"/>
+                <w:szCs w:val="18"/>
+              </w:rPr>
+              <w:t xml:space="preserve">1 to 4 s</w:t>
+            </w:r>
+          </w:p>
+        </w:tc>
+      </w:tr>
+      <w:tr>
+        <w:tc>
+          <w:tcPr>
+            <w:tcW w:w="4300" w:type="dxa"/>
+            <w:tcMar>
+              <w:top w:type="dxa" w:w="60"/>
+              <w:left w:type="dxa" w:w="80"/>
+              <w:bottom w:type="dxa" w:w="60"/>
+              <w:right w:type="dxa" w:w="80"/>
+            </w:tcMar>
+          </w:tcPr>
+          <w:p>
+            <w:pPr>
+              <w:jc w:val="left"/>
+            </w:pPr>
+            <w:r>
+              <w:rPr>
+                <w:b w:val="false"/>
+                <w:bCs w:val="false"/>
+                <w:sz w:val="18"/>
+                <w:szCs w:val="18"/>
+              </w:rPr>
+              <w:t xml:space="preserve">Relayed from the proxy’s own blacklist</w:t>
+            </w:r>
+          </w:p>
+        </w:tc>
+        <w:tc>
+          <w:tcPr>
+            <w:tcW w:w="1000" w:type="dxa"/>
+            <w:tcMar>
+              <w:top w:type="dxa" w:w="60"/>
+              <w:left w:type="dxa" w:w="80"/>
+              <w:bottom w:type="dxa" w:w="60"/>
+              <w:right w:type="dxa" w:w="80"/>
+            </w:tcMar>
+          </w:tcPr>
+          <w:p>
+            <w:pPr>
+              <w:jc w:val="right"/>
+            </w:pPr>
+            <w:r>
+              <w:rPr>
+                <w:b w:val="false"/>
+                <w:bCs w:val="false"/>
+                <w:sz w:val="18"/>
+                <w:szCs w:val="18"/>
+              </w:rPr>
+              <w:t xml:space="preserve">4</w:t>
+            </w:r>
+          </w:p>
+        </w:tc>
+        <w:tc>
+          <w:tcPr>
+            <w:tcW w:w="1200" w:type="dxa"/>
+            <w:tcMar>
+              <w:top w:type="dxa" w:w="60"/>
+              <w:left w:type="dxa" w:w="80"/>
+              <w:bottom w:type="dxa" w:w="60"/>
+              <w:right w:type="dxa" w:w="80"/>
+            </w:tcMar>
+          </w:tcPr>
+          <w:p>
+            <w:pPr>
+              <w:jc w:val="right"/>
+            </w:pPr>
+            <w:r>
+              <w:rPr>
+                <w:b w:val="false"/>
+                <w:bCs w:val="false"/>
+                <w:sz w:val="18"/>
+                <w:szCs w:val="18"/>
+              </w:rPr>
+              <w:t xml:space="preserve">1 s</w:t>
+            </w:r>
+          </w:p>
+        </w:tc>
+        <w:tc>
+          <w:tcPr>
+            <w:tcW w:w="3000" w:type="dxa"/>
+            <w:tcMar>
+              <w:top w:type="dxa" w:w="60"/>
+              <w:left w:type="dxa" w:w="80"/>
+              <w:bottom w:type="dxa" w:w="60"/>
+              <w:right w:type="dxa" w:w="80"/>
+            </w:tcMar>
+          </w:tcPr>
+          <w:p>
+            <w:pPr>
+              <w:jc w:val="left"/>
+            </w:pPr>
+            <w:r>
+              <w:rPr>
+                <w:b w:val="false"/>
+                <w:bCs w:val="false"/>
+                <w:sz w:val="18"/>
+                <w:szCs w:val="18"/>
+              </w:rPr>
+              <w:t xml:space="preserve">1 to 2 s</w:t>
+            </w:r>
+          </w:p>
+        </w:tc>
+      </w:tr>
+      <w:tr>
+        <w:tc>
+          <w:tcPr>
+            <w:tcW w:w="4300" w:type="dxa"/>
+            <w:tcMar>
+              <w:top w:type="dxa" w:w="60"/>
+              <w:left w:type="dxa" w:w="80"/>
+              <w:bottom w:type="dxa" w:w="60"/>
+              <w:right w:type="dxa" w:w="80"/>
+            </w:tcMar>
+          </w:tcPr>
+          <w:p>
+            <w:pPr>
+              <w:jc w:val="left"/>
+            </w:pPr>
+            <w:r>
+              <w:rPr>
+                <w:b w:val="false"/>
+                <w:bCs w:val="false"/>
+                <w:sz w:val="18"/>
+                <w:szCs w:val="18"/>
+              </w:rPr>
+              <w:t xml:space="preserve">Error burst (more than 30 errors in 60 s, by design)</w:t>
+            </w:r>
+          </w:p>
+        </w:tc>
+        <w:tc>
+          <w:tcPr>
+            <w:tcW w:w="1000" w:type="dxa"/>
+            <w:tcMar>
+              <w:top w:type="dxa" w:w="60"/>
+              <w:left w:type="dxa" w:w="80"/>
+              <w:bottom w:type="dxa" w:w="60"/>
+              <w:right w:type="dxa" w:w="80"/>
+            </w:tcMar>
+          </w:tcPr>
+          <w:p>
+            <w:pPr>
+              <w:jc w:val="right"/>
+            </w:pPr>
+            <w:r>
+              <w:rPr>
+                <w:b w:val="false"/>
+                <w:bCs w:val="false"/>
+                <w:sz w:val="18"/>
+                <w:szCs w:val="18"/>
+              </w:rPr>
+              <w:t xml:space="preserve">9</w:t>
+            </w:r>
+          </w:p>
+        </w:tc>
+        <w:tc>
+          <w:tcPr>
+            <w:tcW w:w="1200" w:type="dxa"/>
+            <w:tcMar>
+              <w:top w:type="dxa" w:w="60"/>
+              <w:left w:type="dxa" w:w="80"/>
+              <w:bottom w:type="dxa" w:w="60"/>
+              <w:right w:type="dxa" w:w="80"/>
+            </w:tcMar>
+          </w:tcPr>
+          <w:p>
+            <w:pPr>
+              <w:jc w:val="right"/>
+            </w:pPr>
+            <w:r>
+              <w:rPr>
+                <w:b w:val="false"/>
+                <w:bCs w:val="false"/>
+                <w:sz w:val="18"/>
+                <w:szCs w:val="18"/>
+              </w:rPr>
+              <w:t xml:space="preserve">32 s</w:t>
+            </w:r>
+          </w:p>
+        </w:tc>
+        <w:tc>
+          <w:tcPr>
+            <w:tcW w:w="3000" w:type="dxa"/>
+            <w:tcMar>
+              <w:top w:type="dxa" w:w="60"/>
+              <w:left w:type="dxa" w:w="80"/>
+              <w:bottom w:type="dxa" w:w="60"/>
+              <w:right w:type="dxa" w:w="80"/>
+            </w:tcMar>
+          </w:tcPr>
+          <w:p>
+            <w:pPr>
+              <w:jc w:val="left"/>
+            </w:pPr>
+            <w:r>
+              <w:rPr>
+                <w:b w:val="false"/>
+                <w:bCs w:val="false"/>
+                <w:sz w:val="18"/>
+                <w:szCs w:val="18"/>
+              </w:rPr>
+              <w:t xml:space="preserve">3 to 46 s</w:t>
+            </w:r>
+          </w:p>
+        </w:tc>
+      </w:tr>
+      <w:tr>
+        <w:tc>
+          <w:tcPr>
+            <w:tcW w:w="4300" w:type="dxa"/>
+            <w:tcMar>
+              <w:top w:type="dxa" w:w="60"/>
+              <w:left w:type="dxa" w:w="80"/>
+              <w:bottom w:type="dxa" w:w="60"/>
+              <w:right w:type="dxa" w:w="80"/>
+            </w:tcMar>
+          </w:tcPr>
+          <w:p>
+            <w:pPr>
+              <w:jc w:val="left"/>
+            </w:pPr>
+            <w:r>
+              <w:rPr>
+                <w:b w:val="false"/>
+                <w:bCs w:val="false"/>
+                <w:sz w:val="18"/>
+                <w:szCs w:val="18"/>
+              </w:rPr>
+              <w:t xml:space="preserve">Exploit pattern</w:t>
+            </w:r>
+          </w:p>
+        </w:tc>
+        <w:tc>
+          <w:tcPr>
+            <w:tcW w:w="1000" w:type="dxa"/>
+            <w:tcMar>
+              <w:top w:type="dxa" w:w="60"/>
+              <w:left w:type="dxa" w:w="80"/>
+              <w:bottom w:type="dxa" w:w="60"/>
+              <w:right w:type="dxa" w:w="80"/>
+            </w:tcMar>
+          </w:tcPr>
+          <w:p>
+            <w:pPr>
+              <w:jc w:val="right"/>
+            </w:pPr>
+            <w:r>
+              <w:rPr>
+                <w:b w:val="false"/>
+                <w:bCs w:val="false"/>
+                <w:sz w:val="18"/>
+                <w:szCs w:val="18"/>
+              </w:rPr>
+              <w:t xml:space="preserve">1</w:t>
+            </w:r>
+          </w:p>
+        </w:tc>
+        <w:tc>
+          <w:tcPr>
+            <w:tcW w:w="1200" w:type="dxa"/>
+            <w:tcMar>
+              <w:top w:type="dxa" w:w="60"/>
+              <w:left w:type="dxa" w:w="80"/>
+              <w:bottom w:type="dxa" w:w="60"/>
+              <w:right w:type="dxa" w:w="80"/>
+            </w:tcMar>
+          </w:tcPr>
+          <w:p>
+            <w:pPr>
+              <w:jc w:val="right"/>
+            </w:pPr>
+            <w:r>
+              <w:rPr>
+                <w:b w:val="false"/>
+                <w:bCs w:val="false"/>
+                <w:sz w:val="18"/>
+                <w:szCs w:val="18"/>
+              </w:rPr>
+              <w:t xml:space="preserve">5 s</w:t>
+            </w:r>
+          </w:p>
+        </w:tc>
+        <w:tc>
+          <w:tcPr>
+            <w:tcW w:w="3000" w:type="dxa"/>
+            <w:tcMar>
+              <w:top w:type="dxa" w:w="60"/>
+              <w:left w:type="dxa" w:w="80"/>
+              <w:bottom w:type="dxa" w:w="60"/>
+              <w:right w:type="dxa" w:w="80"/>
+            </w:tcMar>
+          </w:tcPr>
+          <w:p>
+            <w:pPr>
+              <w:jc w:val="left"/>
+            </w:pPr>
+            <w:r>
+              <w:rPr>
+                <w:b w:val="false"/>
+                <w:bCs w:val="false"/>
+                <w:sz w:val="18"/>
+                <w:szCs w:val="18"/>
+              </w:rPr>
+              <w:t xml:space="preserve">5 s</w:t>
+            </w:r>
+          </w:p>
+        </w:tc>
+      </w:tr>
+      <w:tr>
+        <w:tc>
+          <w:tcPr>
+            <w:tcW w:w="4300" w:type="dxa"/>
+            <w:tcMar>
+              <w:top w:type="dxa" w:w="60"/>
+              <w:left w:type="dxa" w:w="80"/>
+              <w:bottom w:type="dxa" w:w="60"/>
+              <w:right w:type="dxa" w:w="80"/>
+            </w:tcMar>
+          </w:tcPr>
+          <w:p>
+            <w:pPr>
+              <w:jc w:val="left"/>
+            </w:pPr>
+            <w:r>
+              <w:rPr>
+                <w:b w:val="false"/>
+                <w:bCs w:val="false"/>
+                <w:sz w:val="18"/>
+                <w:szCs w:val="18"/>
+              </w:rPr>
+              <w:t xml:space="preserve">All</w:t>
+            </w:r>
+          </w:p>
+        </w:tc>
+        <w:tc>
+          <w:tcPr>
+            <w:tcW w:w="1000" w:type="dxa"/>
+            <w:tcMar>
+              <w:top w:type="dxa" w:w="60"/>
+              <w:left w:type="dxa" w:w="80"/>
+              <w:bottom w:type="dxa" w:w="60"/>
+              <w:right w:type="dxa" w:w="80"/>
+            </w:tcMar>
+          </w:tcPr>
+          <w:p>
+            <w:pPr>
+              <w:jc w:val="right"/>
+            </w:pPr>
+            <w:r>
+              <w:rPr>
+                <w:b w:val="false"/>
+                <w:bCs w:val="false"/>
+                <w:sz w:val="18"/>
+                <w:szCs w:val="18"/>
+              </w:rPr>
+              <w:t xml:space="preserve">77</w:t>
+            </w:r>
+          </w:p>
+        </w:tc>
+        <w:tc>
+          <w:tcPr>
+            <w:tcW w:w="1200" w:type="dxa"/>
+            <w:tcMar>
+              <w:top w:type="dxa" w:w="60"/>
+              <w:left w:type="dxa" w:w="80"/>
+              <w:bottom w:type="dxa" w:w="60"/>
+              <w:right w:type="dxa" w:w="80"/>
+            </w:tcMar>
+          </w:tcPr>
+          <w:p>
+            <w:pPr>
+              <w:jc w:val="right"/>
+            </w:pPr>
+            <w:r>
+              <w:rPr>
+                <w:b w:val="false"/>
+                <w:bCs w:val="false"/>
+                <w:sz w:val="18"/>
+                <w:szCs w:val="18"/>
+              </w:rPr>
+              <w:t xml:space="preserve">3 s</w:t>
+            </w:r>
+          </w:p>
+        </w:tc>
+        <w:tc>
+          <w:tcPr>
+            <w:tcW w:w="3000" w:type="dxa"/>
+            <w:tcMar>
+              <w:top w:type="dxa" w:w="60"/>
+              <w:left w:type="dxa" w:w="80"/>
+              <w:bottom w:type="dxa" w:w="60"/>
+              <w:right w:type="dxa" w:w="80"/>
+            </w:tcMar>
+          </w:tcPr>
+          <w:p>
+            <w:pPr>
+              <w:jc w:val="left"/>
+            </w:pPr>
+            <w:r>
+              <w:rPr>
+                <w:b w:val="false"/>
+                <w:bCs w:val="false"/>
+                <w:sz w:val="18"/>
+                <w:szCs w:val="18"/>
+              </w:rPr>
+              <w:t xml:space="preserve">71 of 77 within 5 s; 72 within 10 s</w:t>
+            </w:r>
+          </w:p>
+        </w:tc>
+      </w:tr>
+    </w:tbl>
+    <w:p>
+      <w:pPr>
+        <w:spacing w:after="60"/>
+      </w:pPr>
+    </w:p>
+    <w:p>
+      <w:pPr>
+        <w:spacing w:after="120"/>
+        <w:jc w:val="left"/>
+      </w:pPr>
+      <w:r>
+        <w:rPr>
+          <w:sz w:val="20"/>
+          <w:szCs w:val="20"/>
+        </w:rPr>
+        <w:t xml:space="preserve">The path detector is fast because it needs one request; the error detector has to wait for the evidence, which is the cost of avoiding false positives on a busy site. What matters is what happens next. While an address was banned, 581 of its requests still reached the proxy, and every one was refused by the proxy’s blacklist; none reached an application. Two addresses banned on 1 October returned on 16 and 18 October, after the 14-day expiry, and were banned again within seconds. The 60 requests they made in between reached applications; that is the cost of expiry, and the reason to keep it long enough to matter and short enough to avoid punishing recycled addresses.</w:t>
+      </w:r>
+    </w:p>
+    <w:p>
+      <w:pPr>
+        <w:pStyle w:val="Heading2"/>
+        <w:pBdr>
+          <w:bottom w:val="single" w:color="1F3864" w:sz="6"/>
+        </w:pBdr>
+        <w:spacing w:after="120" w:before="240"/>
+      </w:pPr>
+      <w:r>
+        <w:t xml:space="preserve">4.6 What the scanners ask for</w:t>
+      </w:r>
+    </w:p>
+    <w:p>
+      <w:pPr>
+        <w:spacing w:after="120"/>
+        <w:jc w:val="left"/>
+      </w:pPr>
+      <w:r>
+        <w:rPr>
+          <w:sz w:val="20"/>
+          <w:szCs w:val="20"/>
+        </w:rPr>
+        <w:t xml:space="preserve">The 77 banned addresses with log lines made 3,238 requests for 628 distinct paths. Grouped by the kind of data they are hunting:</w:t>
+      </w:r>
+    </w:p>
+    <w:tbl>
+      <w:tblPr>
+        <w:tblW w:type="dxa" w:w="9500"/>
+        <w:tblBorders>
+          <w:top w:val="single" w:color="auto" w:sz="4"/>
+          <w:left w:val="single" w:color="auto" w:sz="4"/>
+          <w:bottom w:val="single" w:color="auto" w:sz="4"/>
+          <w:right w:val="single" w:color="auto" w:sz="4"/>
+          <w:insideH w:val="single" w:color="auto" w:sz="4"/>
+          <w:insideV w:val="single" w:color="auto" w:sz="4"/>
+        </w:tblBorders>
+        <w:tblLayout w:type="fixed"/>
+        <w:tblCellMar>
+          <w:top w:type="dxa" w:w="60"/>
+          <w:left w:type="dxa" w:w="80"/>
+          <w:bottom w:type="dxa" w:w="60"/>
+          <w:right w:type="dxa" w:w="80"/>
+        </w:tblCellMar>
+      </w:tblPr>
+      <w:tblGrid>
+        <w:gridCol w:w="8000"/>
+        <w:gridCol w:w="1500"/>
+      </w:tblGrid>
+      <w:tr>
+        <w:trPr>
+          <w:tblHeader/>
+        </w:trPr>
+        <w:tc>
+          <w:tcPr>
+            <w:tcW w:w="8000" w:type="dxa"/>
+            <w:shd w:fill="1F3864" w:color="1F3864" w:val="solid"/>
+            <w:tcMar>
+              <w:top w:type="dxa" w:w="60"/>
+              <w:left w:type="dxa" w:w="80"/>
+              <w:bottom w:type="dxa" w:w="60"/>
+              <w:right w:type="dxa" w:w="80"/>
+            </w:tcMar>
+          </w:tcPr>
+          <w:p>
+            <w:pPr>
+              <w:jc w:val="center"/>
+            </w:pPr>
+            <w:r>
+              <w:rPr>
+                <w:b/>
+                <w:bCs/>
+                <w:color w:val="FFFFFF"/>
+                <w:sz w:val="18"/>
+                <w:szCs w:val="18"/>
+              </w:rPr>
+              <w:t xml:space="preserve">Family</w:t>
+            </w:r>
+          </w:p>
+        </w:tc>
+        <w:tc>
+          <w:tcPr>
+            <w:tcW w:w="1500" w:type="dxa"/>
+            <w:shd w:fill="1F3864" w:color="1F3864" w:val="solid"/>
+            <w:tcMar>
+              <w:top w:type="dxa" w:w="60"/>
+              <w:left w:type="dxa" w:w="80"/>
+              <w:bottom w:type="dxa" w:w="60"/>
+              <w:right w:type="dxa" w:w="80"/>
+            </w:tcMar>
+          </w:tcPr>
+          <w:p>
+            <w:pPr>
+              <w:jc w:val="center"/>
+            </w:pPr>
+            <w:r>
+              <w:rPr>
+                <w:b/>
+                <w:bCs/>
+                <w:color w:val="FFFFFF"/>
+                <w:sz w:val="18"/>
+                <w:szCs w:val="18"/>
+              </w:rPr>
+              <w:t xml:space="preserve">Requests</w:t>
+            </w:r>
+          </w:p>
+        </w:tc>
+      </w:tr>
+      <w:tr>
+        <w:tc>
+          <w:tcPr>
+            <w:tcW w:w="8000" w:type="dxa"/>
+            <w:tcMar>
+              <w:top w:type="dxa" w:w="60"/>
+              <w:left w:type="dxa" w:w="80"/>
+              <w:bottom w:type="dxa" w:w="60"/>
+              <w:right w:type="dxa" w:w="80"/>
+            </w:tcMar>
+          </w:tcPr>
+          <w:p>
+            <w:pPr>
+              <w:jc w:val="left"/>
+            </w:pPr>
+            <w:r>
+              <w:rPr>
+                <w:b w:val="false"/>
+                <w:bCs w:val="false"/>
+                <w:sz w:val="18"/>
+                <w:szCs w:val="18"/>
+              </w:rPr>
+              <w:t xml:space="preserve">Application configuration, CI and secret-bearing files (config.json, appsettings, docker-compose, CI workflows, env.js)</w:t>
+            </w:r>
+          </w:p>
+        </w:tc>
+        <w:tc>
+          <w:tcPr>
+            <w:tcW w:w="1500" w:type="dxa"/>
+            <w:tcMar>
+              <w:top w:type="dxa" w:w="60"/>
+              <w:left w:type="dxa" w:w="80"/>
+              <w:bottom w:type="dxa" w:w="60"/>
+              <w:right w:type="dxa" w:w="80"/>
+            </w:tcMar>
+          </w:tcPr>
+          <w:p>
+            <w:pPr>
+              <w:jc w:val="right"/>
+            </w:pPr>
+            <w:r>
+              <w:rPr>
+                <w:b w:val="false"/>
+                <w:bCs w:val="false"/>
+                <w:sz w:val="18"/>
+                <w:szCs w:val="18"/>
+              </w:rPr>
+              <w:t xml:space="preserve">718</w:t>
+            </w:r>
+          </w:p>
+        </w:tc>
+      </w:tr>
+      <w:tr>
+        <w:tc>
+          <w:tcPr>
+            <w:tcW w:w="8000" w:type="dxa"/>
+            <w:tcMar>
+              <w:top w:type="dxa" w:w="60"/>
+              <w:left w:type="dxa" w:w="80"/>
+              <w:bottom w:type="dxa" w:w="60"/>
+              <w:right w:type="dxa" w:w="80"/>
+            </w:tcMar>
+          </w:tcPr>
+          <w:p>
+            <w:pPr>
+              <w:jc w:val="left"/>
+            </w:pPr>
+            <w:r>
+              <w:rPr>
+                <w:b w:val="false"/>
+                <w:bCs w:val="false"/>
+                <w:sz w:val="18"/>
+                <w:szCs w:val="18"/>
+              </w:rPr>
+              <w:t xml:space="preserve">WordPress, PHP and control panels (wp-, xmlrpc, phpinfo, server-status, console, cPanel and WHM)</w:t>
+            </w:r>
+          </w:p>
+        </w:tc>
+        <w:tc>
+          <w:tcPr>
+            <w:tcW w:w="1500" w:type="dxa"/>
+            <w:tcMar>
+              <w:top w:type="dxa" w:w="60"/>
+              <w:left w:type="dxa" w:w="80"/>
+              <w:bottom w:type="dxa" w:w="60"/>
+              <w:right w:type="dxa" w:w="80"/>
+            </w:tcMar>
+          </w:tcPr>
+          <w:p>
+            <w:pPr>
+              <w:jc w:val="right"/>
+            </w:pPr>
+            <w:r>
+              <w:rPr>
+                <w:b w:val="false"/>
+                <w:bCs w:val="false"/>
+                <w:sz w:val="18"/>
+                <w:szCs w:val="18"/>
+              </w:rPr>
+              <w:t xml:space="preserve">561</w:t>
+            </w:r>
+          </w:p>
+        </w:tc>
+      </w:tr>
+      <w:tr>
+        <w:tc>
+          <w:tcPr>
+            <w:tcW w:w="8000" w:type="dxa"/>
+            <w:tcMar>
+              <w:top w:type="dxa" w:w="60"/>
+              <w:left w:type="dxa" w:w="80"/>
+              <w:bottom w:type="dxa" w:w="60"/>
+              <w:right w:type="dxa" w:w="80"/>
+            </w:tcMar>
+          </w:tcPr>
+          <w:p>
+            <w:pPr>
+              <w:jc w:val="left"/>
+            </w:pPr>
+            <w:r>
+              <w:rPr>
+                <w:b w:val="false"/>
+                <w:bCs w:val="false"/>
+                <w:sz w:val="18"/>
+                <w:szCs w:val="18"/>
+              </w:rPr>
+              <w:t xml:space="preserve">Scripts, data dumps and API endpoints (aws-exports.js, app.js, database.sql, env.txt, installed.json, GraphQL)</w:t>
+            </w:r>
+          </w:p>
+        </w:tc>
+        <w:tc>
+          <w:tcPr>
+            <w:tcW w:w="1500" w:type="dxa"/>
+            <w:tcMar>
+              <w:top w:type="dxa" w:w="60"/>
+              <w:left w:type="dxa" w:w="80"/>
+              <w:bottom w:type="dxa" w:w="60"/>
+              <w:right w:type="dxa" w:w="80"/>
+            </w:tcMar>
+          </w:tcPr>
+          <w:p>
+            <w:pPr>
+              <w:jc w:val="right"/>
+            </w:pPr>
+            <w:r>
+              <w:rPr>
+                <w:b w:val="false"/>
+                <w:bCs w:val="false"/>
+                <w:sz w:val="18"/>
+                <w:szCs w:val="18"/>
+              </w:rPr>
+              <w:t xml:space="preserve">344</w:t>
+            </w:r>
+          </w:p>
+        </w:tc>
+      </w:tr>
+      <w:tr>
+        <w:tc>
+          <w:tcPr>
+            <w:tcW w:w="8000" w:type="dxa"/>
+            <w:tcMar>
+              <w:top w:type="dxa" w:w="60"/>
+              <w:left w:type="dxa" w:w="80"/>
+              <w:bottom w:type="dxa" w:w="60"/>
+              <w:right w:type="dxa" w:w="80"/>
+            </w:tcMar>
+          </w:tcPr>
+          <w:p>
+            <w:pPr>
+              <w:jc w:val="left"/>
+            </w:pPr>
+            <w:r>
+              <w:rPr>
+                <w:b w:val="false"/>
+                <w:bCs w:val="false"/>
+                <w:sz w:val="18"/>
+                <w:szCs w:val="18"/>
+              </w:rPr>
+              <w:t xml:space="preserve">Cloud and tool credentials (provider and container configs, tfstate, credentials files, AI-tool settings)</w:t>
+            </w:r>
+          </w:p>
+        </w:tc>
+        <w:tc>
+          <w:tcPr>
+            <w:tcW w:w="1500" w:type="dxa"/>
+            <w:tcMar>
+              <w:top w:type="dxa" w:w="60"/>
+              <w:left w:type="dxa" w:w="80"/>
+              <w:bottom w:type="dxa" w:w="60"/>
+              <w:right w:type="dxa" w:w="80"/>
+            </w:tcMar>
+          </w:tcPr>
+          <w:p>
+            <w:pPr>
+              <w:jc w:val="right"/>
+            </w:pPr>
+            <w:r>
+              <w:rPr>
+                <w:b w:val="false"/>
+                <w:bCs w:val="false"/>
+                <w:sz w:val="18"/>
+                <w:szCs w:val="18"/>
+              </w:rPr>
+              <w:t xml:space="preserve">330</w:t>
+            </w:r>
+          </w:p>
+        </w:tc>
+      </w:tr>
+      <w:tr>
+        <w:tc>
+          <w:tcPr>
+            <w:tcW w:w="8000" w:type="dxa"/>
+            <w:tcMar>
+              <w:top w:type="dxa" w:w="60"/>
+              <w:left w:type="dxa" w:w="80"/>
+              <w:bottom w:type="dxa" w:w="60"/>
+              <w:right w:type="dxa" w:w="80"/>
+            </w:tcMar>
+          </w:tcPr>
+          <w:p>
+            <w:pPr>
+              <w:jc w:val="left"/>
+            </w:pPr>
+            <w:r>
+              <w:rPr>
+                <w:b w:val="false"/>
+                <w:bCs w:val="false"/>
+                <w:sz w:val="18"/>
+                <w:szCs w:val="18"/>
+              </w:rPr>
+              <w:t xml:space="preserve">Version control (.git, .svn, .hg)</w:t>
+            </w:r>
+          </w:p>
+        </w:tc>
+        <w:tc>
+          <w:tcPr>
+            <w:tcW w:w="1500" w:type="dxa"/>
+            <w:tcMar>
+              <w:top w:type="dxa" w:w="60"/>
+              <w:left w:type="dxa" w:w="80"/>
+              <w:bottom w:type="dxa" w:w="60"/>
+              <w:right w:type="dxa" w:w="80"/>
+            </w:tcMar>
+          </w:tcPr>
+          <w:p>
+            <w:pPr>
+              <w:jc w:val="right"/>
+            </w:pPr>
+            <w:r>
+              <w:rPr>
+                <w:b w:val="false"/>
+                <w:bCs w:val="false"/>
+                <w:sz w:val="18"/>
+                <w:szCs w:val="18"/>
+              </w:rPr>
+              <w:t xml:space="preserve">152</w:t>
+            </w:r>
+          </w:p>
+        </w:tc>
+      </w:tr>
+      <w:tr>
+        <w:tc>
+          <w:tcPr>
+            <w:tcW w:w="8000" w:type="dxa"/>
+            <w:tcMar>
+              <w:top w:type="dxa" w:w="60"/>
+              <w:left w:type="dxa" w:w="80"/>
+              <w:bottom w:type="dxa" w:w="60"/>
+              <w:right w:type="dxa" w:w="80"/>
+            </w:tcMar>
+          </w:tcPr>
+          <w:p>
+            <w:pPr>
+              <w:jc w:val="left"/>
+            </w:pPr>
+            <w:r>
+              <w:rPr>
+                <w:b w:val="false"/>
+                <w:bCs w:val="false"/>
+                <w:sz w:val="18"/>
+                <w:szCs w:val="18"/>
+              </w:rPr>
+              <w:t xml:space="preserve">SSH keys (id_rsa, id_ed25519) and shell or tool dotfiles (.netrc, .npmrc, .bash_history, .DS_Store)</w:t>
+            </w:r>
+          </w:p>
+        </w:tc>
+        <w:tc>
+          <w:tcPr>
+            <w:tcW w:w="1500" w:type="dxa"/>
+            <w:tcMar>
+              <w:top w:type="dxa" w:w="60"/>
+              <w:left w:type="dxa" w:w="80"/>
+              <w:bottom w:type="dxa" w:w="60"/>
+              <w:right w:type="dxa" w:w="80"/>
+            </w:tcMar>
+          </w:tcPr>
+          <w:p>
+            <w:pPr>
+              <w:jc w:val="right"/>
+            </w:pPr>
+            <w:r>
+              <w:rPr>
+                <w:b w:val="false"/>
+                <w:bCs w:val="false"/>
+                <w:sz w:val="18"/>
+                <w:szCs w:val="18"/>
+              </w:rPr>
+              <w:t xml:space="preserve">118</w:t>
+            </w:r>
+          </w:p>
+        </w:tc>
+      </w:tr>
+      <w:tr>
+        <w:tc>
+          <w:tcPr>
+            <w:tcW w:w="8000" w:type="dxa"/>
+            <w:tcMar>
+              <w:top w:type="dxa" w:w="60"/>
+              <w:left w:type="dxa" w:w="80"/>
+              <w:bottom w:type="dxa" w:w="60"/>
+              <w:right w:type="dxa" w:w="80"/>
+            </w:tcMar>
+          </w:tcPr>
+          <w:p>
+            <w:pPr>
+              <w:jc w:val="left"/>
+            </w:pPr>
+            <w:r>
+              <w:rPr>
+                <w:b w:val="false"/>
+                <w:bCs w:val="false"/>
+                <w:sz w:val="18"/>
+                <w:szCs w:val="18"/>
+              </w:rPr>
+              <w:t xml:space="preserve">The root page</w:t>
+            </w:r>
+          </w:p>
+        </w:tc>
+        <w:tc>
+          <w:tcPr>
+            <w:tcW w:w="1500" w:type="dxa"/>
+            <w:tcMar>
+              <w:top w:type="dxa" w:w="60"/>
+              <w:left w:type="dxa" w:w="80"/>
+              <w:bottom w:type="dxa" w:w="60"/>
+              <w:right w:type="dxa" w:w="80"/>
+            </w:tcMar>
+          </w:tcPr>
+          <w:p>
+            <w:pPr>
+              <w:jc w:val="right"/>
+            </w:pPr>
+            <w:r>
+              <w:rPr>
+                <w:b w:val="false"/>
+                <w:bCs w:val="false"/>
+                <w:sz w:val="18"/>
+                <w:szCs w:val="18"/>
+              </w:rPr>
+              <w:t xml:space="preserve">118</w:t>
+            </w:r>
+          </w:p>
+        </w:tc>
+      </w:tr>
+      <w:tr>
+        <w:tc>
+          <w:tcPr>
+            <w:tcW w:w="8000" w:type="dxa"/>
+            <w:tcMar>
+              <w:top w:type="dxa" w:w="60"/>
+              <w:left w:type="dxa" w:w="80"/>
+              <w:bottom w:type="dxa" w:w="60"/>
+              <w:right w:type="dxa" w:w="80"/>
+            </w:tcMar>
+          </w:tcPr>
+          <w:p>
+            <w:pPr>
+              <w:jc w:val="left"/>
+            </w:pPr>
+            <w:r>
+              <w:rPr>
+                <w:b w:val="false"/>
+                <w:bCs w:val="false"/>
+                <w:sz w:val="18"/>
+                <w:szCs w:val="18"/>
+              </w:rPr>
+              <w:t xml:space="preserve">Framework and registry endpoints (actuator, Vite, profiler, container registry catalog)</w:t>
+            </w:r>
+          </w:p>
+        </w:tc>
+        <w:tc>
+          <w:tcPr>
+            <w:tcW w:w="1500" w:type="dxa"/>
+            <w:tcMar>
+              <w:top w:type="dxa" w:w="60"/>
+              <w:left w:type="dxa" w:w="80"/>
+              <w:bottom w:type="dxa" w:w="60"/>
+              <w:right w:type="dxa" w:w="80"/>
+            </w:tcMar>
+          </w:tcPr>
+          <w:p>
+            <w:pPr>
+              <w:jc w:val="right"/>
+            </w:pPr>
+            <w:r>
+              <w:rPr>
+                <w:b w:val="false"/>
+                <w:bCs w:val="false"/>
+                <w:sz w:val="18"/>
+                <w:szCs w:val="18"/>
+              </w:rPr>
+              <w:t xml:space="preserve">95</w:t>
+            </w:r>
+          </w:p>
+        </w:tc>
+      </w:tr>
+      <w:tr>
+        <w:tc>
+          <w:tcPr>
+            <w:tcW w:w="8000" w:type="dxa"/>
+            <w:tcMar>
+              <w:top w:type="dxa" w:w="60"/>
+              <w:left w:type="dxa" w:w="80"/>
+              <w:bottom w:type="dxa" w:w="60"/>
+              <w:right w:type="dxa" w:w="80"/>
+            </w:tcMar>
+          </w:tcPr>
+          <w:p>
+            <w:pPr>
+              <w:jc w:val="left"/>
+            </w:pPr>
+            <w:r>
+              <w:rPr>
+                <w:b w:val="false"/>
+                <w:bCs w:val="false"/>
+                <w:sz w:val="18"/>
+                <w:szCs w:val="18"/>
+              </w:rPr>
+              <w:t xml:space="preserve">Path traversal and process environments</w:t>
+            </w:r>
+          </w:p>
+        </w:tc>
+        <w:tc>
+          <w:tcPr>
+            <w:tcW w:w="1500" w:type="dxa"/>
+            <w:tcMar>
+              <w:top w:type="dxa" w:w="60"/>
+              <w:left w:type="dxa" w:w="80"/>
+              <w:bottom w:type="dxa" w:w="60"/>
+              <w:right w:type="dxa" w:w="80"/>
+            </w:tcMar>
+          </w:tcPr>
+          <w:p>
+            <w:pPr>
+              <w:jc w:val="right"/>
+            </w:pPr>
+            <w:r>
+              <w:rPr>
+                <w:b w:val="false"/>
+                <w:bCs w:val="false"/>
+                <w:sz w:val="18"/>
+                <w:szCs w:val="18"/>
+              </w:rPr>
+              <w:t xml:space="preserve">53</w:t>
+            </w:r>
+          </w:p>
+        </w:tc>
+      </w:tr>
+      <w:tr>
+        <w:tc>
+          <w:tcPr>
+            <w:tcW w:w="8000" w:type="dxa"/>
+            <w:tcMar>
+              <w:top w:type="dxa" w:w="60"/>
+              <w:left w:type="dxa" w:w="80"/>
+              <w:bottom w:type="dxa" w:w="60"/>
+              <w:right w:type="dxa" w:w="80"/>
+            </w:tcMar>
+          </w:tcPr>
+          <w:p>
+            <w:pPr>
+              <w:jc w:val="left"/>
+            </w:pPr>
+            <w:r>
+              <w:rPr>
+                <w:b w:val="false"/>
+                <w:bCs w:val="false"/>
+                <w:sz w:val="18"/>
+                <w:szCs w:val="18"/>
+              </w:rPr>
+              <w:t xml:space="preserve">Environment files (.env and variants)</w:t>
+            </w:r>
+          </w:p>
+        </w:tc>
+        <w:tc>
+          <w:tcPr>
+            <w:tcW w:w="1500" w:type="dxa"/>
+            <w:tcMar>
+              <w:top w:type="dxa" w:w="60"/>
+              <w:left w:type="dxa" w:w="80"/>
+              <w:bottom w:type="dxa" w:w="60"/>
+              <w:right w:type="dxa" w:w="80"/>
+            </w:tcMar>
+          </w:tcPr>
+          <w:p>
+            <w:pPr>
+              <w:jc w:val="right"/>
+            </w:pPr>
+            <w:r>
+              <w:rPr>
+                <w:b w:val="false"/>
+                <w:bCs w:val="false"/>
+                <w:sz w:val="18"/>
+                <w:szCs w:val="18"/>
+              </w:rPr>
+              <w:t xml:space="preserve">31</w:t>
+            </w:r>
+          </w:p>
+        </w:tc>
+      </w:tr>
+      <w:tr>
+        <w:tc>
+          <w:tcPr>
+            <w:tcW w:w="8000" w:type="dxa"/>
+            <w:tcMar>
+              <w:top w:type="dxa" w:w="60"/>
+              <w:left w:type="dxa" w:w="80"/>
+              <w:bottom w:type="dxa" w:w="60"/>
+              <w:right w:type="dxa" w:w="80"/>
+            </w:tcMar>
+          </w:tcPr>
+          <w:p>
+            <w:pPr>
+              <w:jc w:val="left"/>
+            </w:pPr>
+            <w:r>
+              <w:rPr>
+                <w:b w:val="false"/>
+                <w:bCs w:val="false"/>
+                <w:sz w:val="18"/>
+                <w:szCs w:val="18"/>
+              </w:rPr>
+              <w:t xml:space="preserve">Everything else (service-account and manifest files, application-specific paths, one-offs)</w:t>
+            </w:r>
+          </w:p>
+        </w:tc>
+        <w:tc>
+          <w:tcPr>
+            <w:tcW w:w="1500" w:type="dxa"/>
+            <w:tcMar>
+              <w:top w:type="dxa" w:w="60"/>
+              <w:left w:type="dxa" w:w="80"/>
+              <w:bottom w:type="dxa" w:w="60"/>
+              <w:right w:type="dxa" w:w="80"/>
+            </w:tcMar>
+          </w:tcPr>
+          <w:p>
+            <w:pPr>
+              <w:jc w:val="right"/>
+            </w:pPr>
+            <w:r>
+              <w:rPr>
+                <w:b w:val="false"/>
+                <w:bCs w:val="false"/>
+                <w:sz w:val="18"/>
+                <w:szCs w:val="18"/>
+              </w:rPr>
+              <w:t xml:space="preserve">718</w:t>
+            </w:r>
+          </w:p>
+        </w:tc>
+      </w:tr>
+    </w:tbl>
+    <w:p>
+      <w:pPr>
+        <w:spacing w:after="60"/>
+      </w:pPr>
+    </w:p>
+    <w:p>
+      <w:pPr>
+        <w:spacing w:after="120"/>
+        <w:jc w:val="left"/>
+      </w:pPr>
+      <w:r>
+        <w:rPr>
+          <w:i/>
+          <w:iCs/>
+          <w:sz w:val="20"/>
+          <w:szCs w:val="20"/>
+        </w:rPr>
+        <w:t xml:space="preserve">The grouping is by keyword, so the boundaries are approximate; the point is the shape. Roughly one request in five is for a file that would hold a credential if the site were careless, and most of the rest is the same hunt through configuration files and scripts.</w:t>
+      </w:r>
+    </w:p>
+    <w:p>
+      <w:pPr>
+        <w:spacing w:after="120"/>
+        <w:jc w:val="left"/>
+      </w:pPr>
+      <w:r>
+        <w:rPr>
+          <w:sz w:val="20"/>
+          <w:szCs w:val="20"/>
+        </w:rPr>
+        <w:t xml:space="preserve">The most-requested paths, each from many addresses: /.gitlab-ci.yml (42), /.github/workflows/deploy.yml (37), /config.json (37), /info.php (36), /settings.json (35), /credentials.json (34), /appsettings.json and its Production and Development variants (31, 31, 30), /secrets.json (30), /.boto (29), /docker-compose.yml (29), /phpinfo.php and /_profiler/phpinfo (29 each), /.docker/config.json (28), /.npmrc (28), /Dockerfile (28), /.s3cfg (28), /v2/_catalog (27), /___proxy_subdomain_whm/login (27), /console/ (26), and settings files for a popular AI coding assistant (24 each). The equal counts show one scanner script run against every host, not curiosity about any one of them.</w:t>
+      </w:r>
+    </w:p>
+    <w:p>
+      <w:pPr>
+        <w:spacing w:after="120"/>
+        <w:jc w:val="left"/>
+      </w:pPr>
+      <w:r>
+        <w:rPr>
+          <w:sz w:val="20"/>
+          <w:szCs w:val="20"/>
+        </w:rPr>
+        <w:t xml:space="preserve">Who they say they are. 1,756 of the 3,238 requests (54%) carried one generic desktop-browser string; 608 (19%) named a crawler or AI agent; 406 (13%) identified themselves as scanners, such as l9scan, a scanner whose user-agent carries a link to its operator; 15 of the 77 addresses rotated through five or more different user-agents. A named crawler is not evidence of a crawler, and a generic browser string is not evidence of a person.</w:t>
+      </w:r>
+    </w:p>
+    <w:p>
+      <w:pPr>
+        <w:pStyle w:val="Heading2"/>
+        <w:pBdr>
+          <w:bottom w:val="single" w:color="1F3864" w:sz="6"/>
+        </w:pBdr>
+        <w:spacing w:after="120" w:before="240"/>
+      </w:pPr>
+      <w:r>
+        <w:t xml:space="preserve">4.7 Anatomy of two bursts</w:t>
+      </w:r>
+    </w:p>
+    <w:p>
+      <w:pPr>
+        <w:spacing w:after="120"/>
+        <w:jc w:val="left"/>
+      </w:pPr>
+      <w:r>
+        <w:rPr>
+          <w:sz w:val="20"/>
+          <w:szCs w:val="20"/>
+        </w:rPr>
+        <w:t xml:space="preserve">Both bursts were stopped without reaching an application beyond the first few seconds; the difference is the detector.</w:t>
+      </w:r>
+    </w:p>
+    <w:tbl>
+      <w:tblPr>
+        <w:tblW w:type="dxa" w:w="9500"/>
+        <w:tblBorders>
+          <w:top w:val="single" w:color="auto" w:sz="4"/>
+          <w:left w:val="single" w:color="auto" w:sz="4"/>
+          <w:bottom w:val="single" w:color="auto" w:sz="4"/>
+          <w:right w:val="single" w:color="auto" w:sz="4"/>
+          <w:insideH w:val="single" w:color="auto" w:sz="4"/>
+          <w:insideV w:val="single" w:color="auto" w:sz="4"/>
+        </w:tblBorders>
+        <w:tblLayout w:type="fixed"/>
+        <w:tblCellMar>
+          <w:top w:type="dxa" w:w="60"/>
+          <w:left w:type="dxa" w:w="80"/>
+          <w:bottom w:type="dxa" w:w="60"/>
+          <w:right w:type="dxa" w:w="80"/>
+        </w:tblCellMar>
+      </w:tblPr>
+      <w:tblGrid>
+        <w:gridCol w:w="2800"/>
+        <w:gridCol w:w="3350"/>
+        <w:gridCol w:w="3350"/>
+      </w:tblGrid>
+      <w:tr>
+        <w:trPr>
+          <w:tblHeader/>
+        </w:trPr>
+        <w:tc>
+          <w:tcPr>
+            <w:tcW w:w="2800" w:type="dxa"/>
+            <w:shd w:fill="1F3864" w:color="1F3864" w:val="solid"/>
+            <w:tcMar>
+              <w:top w:type="dxa" w:w="60"/>
+              <w:left w:type="dxa" w:w="80"/>
+              <w:bottom w:type="dxa" w:w="60"/>
+              <w:right w:type="dxa" w:w="80"/>
+            </w:tcMar>
+          </w:tcPr>
+          <w:p>
+            <w:pPr>
+              <w:jc w:val="center"/>
+            </w:pPr>
+            <w:r>
+              <w:rPr>
+                <w:b/>
+                <w:bCs/>
+                <w:color w:val="FFFFFF"/>
+                <w:sz w:val="18"/>
+                <w:szCs w:val="18"/>
+              </w:rPr>
+              <w:t xml:space="preserve"/>
+            </w:r>
+          </w:p>
+        </w:tc>
+        <w:tc>
+          <w:tcPr>
+            <w:tcW w:w="3350" w:type="dxa"/>
+            <w:shd w:fill="1F3864" w:color="1F3864" w:val="solid"/>
+            <w:tcMar>
+              <w:top w:type="dxa" w:w="60"/>
+              <w:left w:type="dxa" w:w="80"/>
+              <w:bottom w:type="dxa" w:w="60"/>
+              <w:right w:type="dxa" w:w="80"/>
+            </w:tcMar>
+          </w:tcPr>
+          <w:p>
+            <w:pPr>
+              <w:jc w:val="center"/>
+            </w:pPr>
+            <w:r>
+              <w:rPr>
+                <w:b/>
+                <w:bCs/>
+                <w:color w:val="FFFFFF"/>
+                <w:sz w:val="18"/>
+                <w:szCs w:val="18"/>
+              </w:rPr>
+              <w:t xml:space="preserve">16 October, 34.104.188.100 (nettools)</w:t>
+            </w:r>
+          </w:p>
+        </w:tc>
+        <w:tc>
+          <w:tcPr>
+            <w:tcW w:w="3350" w:type="dxa"/>
+            <w:shd w:fill="1F3864" w:color="1F3864" w:val="solid"/>
+            <w:tcMar>
+              <w:top w:type="dxa" w:w="60"/>
+              <w:left w:type="dxa" w:w="80"/>
+              <w:bottom w:type="dxa" w:w="60"/>
+              <w:right w:type="dxa" w:w="80"/>
+            </w:tcMar>
+          </w:tcPr>
+          <w:p>
+            <w:pPr>
+              <w:jc w:val="center"/>
+            </w:pPr>
+            <w:r>
+              <w:rPr>
+                <w:b/>
+                <w:bCs/>
+                <w:color w:val="FFFFFF"/>
+                <w:sz w:val="18"/>
+                <w:szCs w:val="18"/>
+              </w:rPr>
+              <w:t xml:space="preserve">18 October, 34.89.214.5 (bentopdf)</w:t>
+            </w:r>
+          </w:p>
+        </w:tc>
+      </w:tr>
+      <w:tr>
+        <w:tc>
+          <w:tcPr>
+            <w:tcW w:w="2800" w:type="dxa"/>
+            <w:tcMar>
+              <w:top w:type="dxa" w:w="60"/>
+              <w:left w:type="dxa" w:w="80"/>
+              <w:bottom w:type="dxa" w:w="60"/>
+              <w:right w:type="dxa" w:w="80"/>
+            </w:tcMar>
+          </w:tcPr>
+          <w:p>
+            <w:pPr>
+              <w:jc w:val="left"/>
+            </w:pPr>
+            <w:r>
+              <w:rPr>
+                <w:b w:val="false"/>
+                <w:bCs w:val="false"/>
+                <w:sz w:val="18"/>
+                <w:szCs w:val="18"/>
+              </w:rPr>
+              <w:t xml:space="preserve">Detector</w:t>
+            </w:r>
+          </w:p>
+        </w:tc>
+        <w:tc>
+          <w:tcPr>
+            <w:tcW w:w="3350" w:type="dxa"/>
+            <w:tcMar>
+              <w:top w:type="dxa" w:w="60"/>
+              <w:left w:type="dxa" w:w="80"/>
+              <w:bottom w:type="dxa" w:w="60"/>
+              <w:right w:type="dxa" w:w="80"/>
+            </w:tcMar>
+          </w:tcPr>
+          <w:p>
+            <w:pPr>
+              <w:jc w:val="left"/>
+            </w:pPr>
+            <w:r>
+              <w:rPr>
+                <w:b w:val="false"/>
+                <w:bCs w:val="false"/>
+                <w:sz w:val="18"/>
+                <w:szCs w:val="18"/>
+              </w:rPr>
+              <w:t xml:space="preserve">Error burst: more than 30 errors in 60 seconds</w:t>
+            </w:r>
+          </w:p>
+        </w:tc>
+        <w:tc>
+          <w:tcPr>
+            <w:tcW w:w="3350" w:type="dxa"/>
+            <w:tcMar>
+              <w:top w:type="dxa" w:w="60"/>
+              <w:left w:type="dxa" w:w="80"/>
+              <w:bottom w:type="dxa" w:w="60"/>
+              <w:right w:type="dxa" w:w="80"/>
+            </w:tcMar>
+          </w:tcPr>
+          <w:p>
+            <w:pPr>
+              <w:jc w:val="left"/>
+            </w:pPr>
+            <w:r>
+              <w:rPr>
+                <w:b w:val="false"/>
+                <w:bCs w:val="false"/>
+                <w:sz w:val="18"/>
+                <w:szCs w:val="18"/>
+              </w:rPr>
+              <w:t xml:space="preserve">Sensitive-path probe: a private-key file name</w:t>
+            </w:r>
+          </w:p>
+        </w:tc>
+      </w:tr>
+      <w:tr>
+        <w:tc>
+          <w:tcPr>
+            <w:tcW w:w="2800" w:type="dxa"/>
+            <w:tcMar>
+              <w:top w:type="dxa" w:w="60"/>
+              <w:left w:type="dxa" w:w="80"/>
+              <w:bottom w:type="dxa" w:w="60"/>
+              <w:right w:type="dxa" w:w="80"/>
+            </w:tcMar>
+          </w:tcPr>
+          <w:p>
+            <w:pPr>
+              <w:jc w:val="left"/>
+            </w:pPr>
+            <w:r>
+              <w:rPr>
+                <w:b w:val="false"/>
+                <w:bCs w:val="false"/>
+                <w:sz w:val="18"/>
+                <w:szCs w:val="18"/>
+              </w:rPr>
+              <w:t xml:space="preserve">Total requests</w:t>
+            </w:r>
+          </w:p>
+        </w:tc>
+        <w:tc>
+          <w:tcPr>
+            <w:tcW w:w="3350" w:type="dxa"/>
+            <w:tcMar>
+              <w:top w:type="dxa" w:w="60"/>
+              <w:left w:type="dxa" w:w="80"/>
+              <w:bottom w:type="dxa" w:w="60"/>
+              <w:right w:type="dxa" w:w="80"/>
+            </w:tcMar>
+          </w:tcPr>
+          <w:p>
+            <w:pPr>
+              <w:jc w:val="left"/>
+            </w:pPr>
+            <w:r>
+              <w:rPr>
+                <w:b w:val="false"/>
+                <w:bCs w:val="false"/>
+                <w:sz w:val="18"/>
+                <w:szCs w:val="18"/>
+              </w:rPr>
+              <w:t xml:space="preserve">221</w:t>
+            </w:r>
+          </w:p>
+        </w:tc>
+        <w:tc>
+          <w:tcPr>
+            <w:tcW w:w="3350" w:type="dxa"/>
+            <w:tcMar>
+              <w:top w:type="dxa" w:w="60"/>
+              <w:left w:type="dxa" w:w="80"/>
+              <w:bottom w:type="dxa" w:w="60"/>
+              <w:right w:type="dxa" w:w="80"/>
+            </w:tcMar>
+          </w:tcPr>
+          <w:p>
+            <w:pPr>
+              <w:jc w:val="left"/>
+            </w:pPr>
+            <w:r>
+              <w:rPr>
+                <w:b w:val="false"/>
+                <w:bCs w:val="false"/>
+                <w:sz w:val="18"/>
+                <w:szCs w:val="18"/>
+              </w:rPr>
+              <w:t xml:space="preserve">144</w:t>
+            </w:r>
+          </w:p>
+        </w:tc>
+      </w:tr>
+      <w:tr>
+        <w:tc>
+          <w:tcPr>
+            <w:tcW w:w="2800" w:type="dxa"/>
+            <w:tcMar>
+              <w:top w:type="dxa" w:w="60"/>
+              <w:left w:type="dxa" w:w="80"/>
+              <w:bottom w:type="dxa" w:w="60"/>
+              <w:right w:type="dxa" w:w="80"/>
+            </w:tcMar>
+          </w:tcPr>
+          <w:p>
+            <w:pPr>
+              <w:jc w:val="left"/>
+            </w:pPr>
+            <w:r>
+              <w:rPr>
+                <w:b w:val="false"/>
+                <w:bCs w:val="false"/>
+                <w:sz w:val="18"/>
+                <w:szCs w:val="18"/>
+              </w:rPr>
+              <w:t xml:space="preserve">First request to ban</w:t>
+            </w:r>
+          </w:p>
+        </w:tc>
+        <w:tc>
+          <w:tcPr>
+            <w:tcW w:w="3350" w:type="dxa"/>
+            <w:tcMar>
+              <w:top w:type="dxa" w:w="60"/>
+              <w:left w:type="dxa" w:w="80"/>
+              <w:bottom w:type="dxa" w:w="60"/>
+              <w:right w:type="dxa" w:w="80"/>
+            </w:tcMar>
+          </w:tcPr>
+          <w:p>
+            <w:pPr>
+              <w:jc w:val="left"/>
+            </w:pPr>
+            <w:r>
+              <w:rPr>
+                <w:b w:val="false"/>
+                <w:bCs w:val="false"/>
+                <w:sz w:val="18"/>
+                <w:szCs w:val="18"/>
+              </w:rPr>
+              <w:t xml:space="preserve">10 seconds</w:t>
+            </w:r>
+          </w:p>
+        </w:tc>
+        <w:tc>
+          <w:tcPr>
+            <w:tcW w:w="3350" w:type="dxa"/>
+            <w:tcMar>
+              <w:top w:type="dxa" w:w="60"/>
+              <w:left w:type="dxa" w:w="80"/>
+              <w:bottom w:type="dxa" w:w="60"/>
+              <w:right w:type="dxa" w:w="80"/>
+            </w:tcMar>
+          </w:tcPr>
+          <w:p>
+            <w:pPr>
+              <w:jc w:val="left"/>
+            </w:pPr>
+            <w:r>
+              <w:rPr>
+                <w:b w:val="false"/>
+                <w:bCs w:val="false"/>
+                <w:sz w:val="18"/>
+                <w:szCs w:val="18"/>
+              </w:rPr>
+              <w:t xml:space="preserve">7 seconds</w:t>
+            </w:r>
+          </w:p>
+        </w:tc>
+      </w:tr>
+      <w:tr>
+        <w:tc>
+          <w:tcPr>
+            <w:tcW w:w="2800" w:type="dxa"/>
+            <w:tcMar>
+              <w:top w:type="dxa" w:w="60"/>
+              <w:left w:type="dxa" w:w="80"/>
+              <w:bottom w:type="dxa" w:w="60"/>
+              <w:right w:type="dxa" w:w="80"/>
+            </w:tcMar>
+          </w:tcPr>
+          <w:p>
+            <w:pPr>
+              <w:jc w:val="left"/>
+            </w:pPr>
+            <w:r>
+              <w:rPr>
+                <w:b w:val="false"/>
+                <w:bCs w:val="false"/>
+                <w:sz w:val="18"/>
+                <w:szCs w:val="18"/>
+              </w:rPr>
+              <w:t xml:space="preserve">Reached an application before the ban</w:t>
+            </w:r>
+          </w:p>
+        </w:tc>
+        <w:tc>
+          <w:tcPr>
+            <w:tcW w:w="3350" w:type="dxa"/>
+            <w:tcMar>
+              <w:top w:type="dxa" w:w="60"/>
+              <w:left w:type="dxa" w:w="80"/>
+              <w:bottom w:type="dxa" w:w="60"/>
+              <w:right w:type="dxa" w:w="80"/>
+            </w:tcMar>
+          </w:tcPr>
+          <w:p>
+            <w:pPr>
+              <w:jc w:val="left"/>
+            </w:pPr>
+            <w:r>
+              <w:rPr>
+                <w:b w:val="false"/>
+                <w:bCs w:val="false"/>
+                <w:sz w:val="18"/>
+                <w:szCs w:val="18"/>
+              </w:rPr>
+              <w:t xml:space="preserve">38 (all 404s, 2 to 5 a second)</w:t>
+            </w:r>
+          </w:p>
+        </w:tc>
+        <w:tc>
+          <w:tcPr>
+            <w:tcW w:w="3350" w:type="dxa"/>
+            <w:tcMar>
+              <w:top w:type="dxa" w:w="60"/>
+              <w:left w:type="dxa" w:w="80"/>
+              <w:bottom w:type="dxa" w:w="60"/>
+              <w:right w:type="dxa" w:w="80"/>
+            </w:tcMar>
+          </w:tcPr>
+          <w:p>
+            <w:pPr>
+              <w:jc w:val="left"/>
+            </w:pPr>
+            <w:r>
+              <w:rPr>
+                <w:b w:val="false"/>
+                <w:bCs w:val="false"/>
+                <w:sz w:val="18"/>
+                <w:szCs w:val="18"/>
+              </w:rPr>
+              <w:t xml:space="preserve">53 (46 were 404s, 7 were 200s)</w:t>
+            </w:r>
+          </w:p>
+        </w:tc>
+      </w:tr>
+      <w:tr>
+        <w:tc>
+          <w:tcPr>
+            <w:tcW w:w="2800" w:type="dxa"/>
+            <w:tcMar>
+              <w:top w:type="dxa" w:w="60"/>
+              <w:left w:type="dxa" w:w="80"/>
+              <w:bottom w:type="dxa" w:w="60"/>
+              <w:right w:type="dxa" w:w="80"/>
+            </w:tcMar>
+          </w:tcPr>
+          <w:p>
+            <w:pPr>
+              <w:jc w:val="left"/>
+            </w:pPr>
+            <w:r>
+              <w:rPr>
+                <w:b w:val="false"/>
+                <w:bCs w:val="false"/>
+                <w:sz w:val="18"/>
+                <w:szCs w:val="18"/>
+              </w:rPr>
+              <w:t xml:space="preserve">Refused by the proxy’s exploit detection</w:t>
+            </w:r>
+          </w:p>
+        </w:tc>
+        <w:tc>
+          <w:tcPr>
+            <w:tcW w:w="3350" w:type="dxa"/>
+            <w:tcMar>
+              <w:top w:type="dxa" w:w="60"/>
+              <w:left w:type="dxa" w:w="80"/>
+              <w:bottom w:type="dxa" w:w="60"/>
+              <w:right w:type="dxa" w:w="80"/>
+            </w:tcMar>
+          </w:tcPr>
+          <w:p>
+            <w:pPr>
+              <w:jc w:val="left"/>
+            </w:pPr>
+            <w:r>
+              <w:rPr>
+                <w:b w:val="false"/>
+                <w:bCs w:val="false"/>
+                <w:sz w:val="18"/>
+                <w:szCs w:val="18"/>
+              </w:rPr>
+              <w:t xml:space="preserve">0</w:t>
+            </w:r>
+          </w:p>
+        </w:tc>
+        <w:tc>
+          <w:tcPr>
+            <w:tcW w:w="3350" w:type="dxa"/>
+            <w:tcMar>
+              <w:top w:type="dxa" w:w="60"/>
+              <w:left w:type="dxa" w:w="80"/>
+              <w:bottom w:type="dxa" w:w="60"/>
+              <w:right w:type="dxa" w:w="80"/>
+            </w:tcMar>
+          </w:tcPr>
+          <w:p>
+            <w:pPr>
+              <w:jc w:val="left"/>
+            </w:pPr>
+            <w:r>
+              <w:rPr>
+                <w:b w:val="false"/>
+                <w:bCs w:val="false"/>
+                <w:sz w:val="18"/>
+                <w:szCs w:val="18"/>
+              </w:rPr>
+              <w:t xml:space="preserve">60 (mostly in seconds 4 to 6)</w:t>
+            </w:r>
+          </w:p>
+        </w:tc>
+      </w:tr>
+      <w:tr>
+        <w:tc>
+          <w:tcPr>
+            <w:tcW w:w="2800" w:type="dxa"/>
+            <w:tcMar>
+              <w:top w:type="dxa" w:w="60"/>
+              <w:left w:type="dxa" w:w="80"/>
+              <w:bottom w:type="dxa" w:w="60"/>
+              <w:right w:type="dxa" w:w="80"/>
+            </w:tcMar>
+          </w:tcPr>
+          <w:p>
+            <w:pPr>
+              <w:jc w:val="left"/>
+            </w:pPr>
+            <w:r>
+              <w:rPr>
+                <w:b w:val="false"/>
+                <w:bCs w:val="false"/>
+                <w:sz w:val="18"/>
+                <w:szCs w:val="18"/>
+              </w:rPr>
+              <w:t xml:space="preserve">Refused by the proxy’s blacklist after the ban</w:t>
+            </w:r>
+          </w:p>
+        </w:tc>
+        <w:tc>
+          <w:tcPr>
+            <w:tcW w:w="3350" w:type="dxa"/>
+            <w:tcMar>
+              <w:top w:type="dxa" w:w="60"/>
+              <w:left w:type="dxa" w:w="80"/>
+              <w:bottom w:type="dxa" w:w="60"/>
+              <w:right w:type="dxa" w:w="80"/>
+            </w:tcMar>
+          </w:tcPr>
+          <w:p>
+            <w:pPr>
+              <w:jc w:val="left"/>
+            </w:pPr>
+            <w:r>
+              <w:rPr>
+                <w:b w:val="false"/>
+                <w:bCs w:val="false"/>
+                <w:sz w:val="18"/>
+                <w:szCs w:val="18"/>
+              </w:rPr>
+              <w:t xml:space="preserve">183 (4 to 7 a second, for 32 seconds, until the scanner gave up)</w:t>
+            </w:r>
+          </w:p>
+        </w:tc>
+        <w:tc>
+          <w:tcPr>
+            <w:tcW w:w="3350" w:type="dxa"/>
+            <w:tcMar>
+              <w:top w:type="dxa" w:w="60"/>
+              <w:left w:type="dxa" w:w="80"/>
+              <w:bottom w:type="dxa" w:w="60"/>
+              <w:right w:type="dxa" w:w="80"/>
+            </w:tcMar>
+          </w:tcPr>
+          <w:p>
+            <w:pPr>
+              <w:jc w:val="left"/>
+            </w:pPr>
+            <w:r>
+              <w:rPr>
+                <w:b w:val="false"/>
+                <w:bCs w:val="false"/>
+                <w:sz w:val="18"/>
+                <w:szCs w:val="18"/>
+              </w:rPr>
+              <w:t xml:space="preserve">31 (24 in the ban’s own second, 7 in the next)</w:t>
+            </w:r>
+          </w:p>
+        </w:tc>
+      </w:tr>
+      <w:tr>
+        <w:tc>
+          <w:tcPr>
+            <w:tcW w:w="2800" w:type="dxa"/>
+            <w:tcMar>
+              <w:top w:type="dxa" w:w="60"/>
+              <w:left w:type="dxa" w:w="80"/>
+              <w:bottom w:type="dxa" w:w="60"/>
+              <w:right w:type="dxa" w:w="80"/>
+            </w:tcMar>
+          </w:tcPr>
+          <w:p>
+            <w:pPr>
+              <w:jc w:val="left"/>
+            </w:pPr>
+            <w:r>
+              <w:rPr>
+                <w:b w:val="false"/>
+                <w:bCs w:val="false"/>
+                <w:sz w:val="18"/>
+                <w:szCs w:val="18"/>
+              </w:rPr>
+              <w:t xml:space="preserve">Reached an application after the ban</w:t>
+            </w:r>
+          </w:p>
+        </w:tc>
+        <w:tc>
+          <w:tcPr>
+            <w:tcW w:w="3350" w:type="dxa"/>
+            <w:tcMar>
+              <w:top w:type="dxa" w:w="60"/>
+              <w:left w:type="dxa" w:w="80"/>
+              <w:bottom w:type="dxa" w:w="60"/>
+              <w:right w:type="dxa" w:w="80"/>
+            </w:tcMar>
+          </w:tcPr>
+          <w:p>
+            <w:pPr>
+              <w:jc w:val="left"/>
+            </w:pPr>
+            <w:r>
+              <w:rPr>
+                <w:b w:val="false"/>
+                <w:bCs w:val="false"/>
+                <w:sz w:val="18"/>
+                <w:szCs w:val="18"/>
+              </w:rPr>
+              <w:t xml:space="preserve">0</w:t>
+            </w:r>
+          </w:p>
+        </w:tc>
+        <w:tc>
+          <w:tcPr>
+            <w:tcW w:w="3350" w:type="dxa"/>
+            <w:tcMar>
+              <w:top w:type="dxa" w:w="60"/>
+              <w:left w:type="dxa" w:w="80"/>
+              <w:bottom w:type="dxa" w:w="60"/>
+              <w:right w:type="dxa" w:w="80"/>
+            </w:tcMar>
+          </w:tcPr>
+          <w:p>
+            <w:pPr>
+              <w:jc w:val="left"/>
+            </w:pPr>
+            <w:r>
+              <w:rPr>
+                <w:b w:val="false"/>
+                <w:bCs w:val="false"/>
+                <w:sz w:val="18"/>
+                <w:szCs w:val="18"/>
+              </w:rPr>
+              <w:t xml:space="preserve">0</w:t>
+            </w:r>
+          </w:p>
+        </w:tc>
+      </w:tr>
+    </w:tbl>
+    <w:p>
+      <w:pPr>
+        <w:spacing w:after="60"/>
+      </w:pPr>
+    </w:p>
+    <w:p>
+      <w:pPr>
+        <w:spacing w:after="120"/>
+        <w:jc w:val="left"/>
+      </w:pPr>
+      <w:r>
+        <w:rPr>
+          <w:sz w:val="20"/>
+          <w:szCs w:val="20"/>
+        </w:rPr>
+        <w:t xml:space="preserve">The first burst shows the cost of an error-count rule: ten seconds of probing before the ban, because it had to wait for thirty errors. The second shows layering: the proxy’s built-in exploit detection refused 60 requests while the plugin was deciding, so the scanner was being blocked before it was banned.</w:t>
+      </w:r>
+    </w:p>
+    <w:p>
+      <w:pPr>
+        <w:pStyle w:val="Heading2"/>
+        <w:pBdr>
+          <w:bottom w:val="single" w:color="1F3864" w:sz="6"/>
+        </w:pBdr>
+        <w:spacing w:after="120" w:before="240"/>
+      </w:pPr>
+      <w:r>
+        <w:t xml:space="preserve">4.8 Waves, not a steady trickle</w:t>
+      </w:r>
+    </w:p>
+    <w:tbl>
+      <w:tblPr>
+        <w:tblW w:type="dxa" w:w="9500"/>
+        <w:tblBorders>
+          <w:top w:val="single" w:color="auto" w:sz="4"/>
+          <w:left w:val="single" w:color="auto" w:sz="4"/>
+          <w:bottom w:val="single" w:color="auto" w:sz="4"/>
+          <w:right w:val="single" w:color="auto" w:sz="4"/>
+          <w:insideH w:val="single" w:color="auto" w:sz="4"/>
+          <w:insideV w:val="single" w:color="auto" w:sz="4"/>
+        </w:tblBorders>
+        <w:tblLayout w:type="fixed"/>
+        <w:tblCellMar>
+          <w:top w:type="dxa" w:w="60"/>
+          <w:left w:type="dxa" w:w="80"/>
+          <w:bottom w:type="dxa" w:w="60"/>
+          <w:right w:type="dxa" w:w="80"/>
+        </w:tblCellMar>
+      </w:tblPr>
+      <w:tblGrid>
+        <w:gridCol w:w="1200"/>
+        <w:gridCol w:w="2000"/>
+        <w:gridCol w:w="1200"/>
+        <w:gridCol w:w="2000"/>
+        <w:gridCol w:w="1200"/>
+        <w:gridCol w:w="1900"/>
+      </w:tblGrid>
+      <w:tr>
+        <w:trPr>
+          <w:tblHeader/>
+        </w:trPr>
+        <w:tc>
+          <w:tcPr>
+            <w:tcW w:w="1200" w:type="dxa"/>
+            <w:shd w:fill="1F3864" w:color="1F3864" w:val="solid"/>
+            <w:tcMar>
+              <w:top w:type="dxa" w:w="60"/>
+              <w:left w:type="dxa" w:w="80"/>
+              <w:bottom w:type="dxa" w:w="60"/>
+              <w:right w:type="dxa" w:w="80"/>
+            </w:tcMar>
+          </w:tcPr>
+          <w:p>
+            <w:pPr>
+              <w:jc w:val="center"/>
+            </w:pPr>
+            <w:r>
+              <w:rPr>
+                <w:b/>
+                <w:bCs/>
+                <w:color w:val="FFFFFF"/>
+                <w:sz w:val="18"/>
+                <w:szCs w:val="18"/>
+              </w:rPr>
+              <w:t xml:space="preserve">Day</w:t>
+            </w:r>
+          </w:p>
+        </w:tc>
+        <w:tc>
+          <w:tcPr>
+            <w:tcW w:w="2000" w:type="dxa"/>
+            <w:shd w:fill="1F3864" w:color="1F3864" w:val="solid"/>
+            <w:tcMar>
+              <w:top w:type="dxa" w:w="60"/>
+              <w:left w:type="dxa" w:w="80"/>
+              <w:bottom w:type="dxa" w:w="60"/>
+              <w:right w:type="dxa" w:w="80"/>
+            </w:tcMar>
+          </w:tcPr>
+          <w:p>
+            <w:pPr>
+              <w:jc w:val="center"/>
+            </w:pPr>
+            <w:r>
+              <w:rPr>
+                <w:b/>
+                <w:bCs/>
+                <w:color w:val="FFFFFF"/>
+                <w:sz w:val="18"/>
+                <w:szCs w:val="18"/>
+              </w:rPr>
+              <w:t xml:space="preserve">Addresses banned</w:t>
+            </w:r>
+          </w:p>
+        </w:tc>
+        <w:tc>
+          <w:tcPr>
+            <w:tcW w:w="1200" w:type="dxa"/>
+            <w:shd w:fill="1F3864" w:color="1F3864" w:val="solid"/>
+            <w:tcMar>
+              <w:top w:type="dxa" w:w="60"/>
+              <w:left w:type="dxa" w:w="80"/>
+              <w:bottom w:type="dxa" w:w="60"/>
+              <w:right w:type="dxa" w:w="80"/>
+            </w:tcMar>
+          </w:tcPr>
+          <w:p>
+            <w:pPr>
+              <w:jc w:val="center"/>
+            </w:pPr>
+            <w:r>
+              <w:rPr>
+                <w:b/>
+                <w:bCs/>
+                <w:color w:val="FFFFFF"/>
+                <w:sz w:val="18"/>
+                <w:szCs w:val="18"/>
+              </w:rPr>
+              <w:t xml:space="preserve">Day</w:t>
+            </w:r>
+          </w:p>
+        </w:tc>
+        <w:tc>
+          <w:tcPr>
+            <w:tcW w:w="2000" w:type="dxa"/>
+            <w:shd w:fill="1F3864" w:color="1F3864" w:val="solid"/>
+            <w:tcMar>
+              <w:top w:type="dxa" w:w="60"/>
+              <w:left w:type="dxa" w:w="80"/>
+              <w:bottom w:type="dxa" w:w="60"/>
+              <w:right w:type="dxa" w:w="80"/>
+            </w:tcMar>
+          </w:tcPr>
+          <w:p>
+            <w:pPr>
+              <w:jc w:val="center"/>
+            </w:pPr>
+            <w:r>
+              <w:rPr>
+                <w:b/>
+                <w:bCs/>
+                <w:color w:val="FFFFFF"/>
+                <w:sz w:val="18"/>
+                <w:szCs w:val="18"/>
+              </w:rPr>
+              <w:t xml:space="preserve">Addresses banned</w:t>
+            </w:r>
+          </w:p>
+        </w:tc>
+        <w:tc>
+          <w:tcPr>
+            <w:tcW w:w="1200" w:type="dxa"/>
+            <w:shd w:fill="1F3864" w:color="1F3864" w:val="solid"/>
+            <w:tcMar>
+              <w:top w:type="dxa" w:w="60"/>
+              <w:left w:type="dxa" w:w="80"/>
+              <w:bottom w:type="dxa" w:w="60"/>
+              <w:right w:type="dxa" w:w="80"/>
+            </w:tcMar>
+          </w:tcPr>
+          <w:p>
+            <w:pPr>
+              <w:jc w:val="center"/>
+            </w:pPr>
+            <w:r>
+              <w:rPr>
+                <w:b/>
+                <w:bCs/>
+                <w:color w:val="FFFFFF"/>
+                <w:sz w:val="18"/>
+                <w:szCs w:val="18"/>
+              </w:rPr>
+              <w:t xml:space="preserve">Day</w:t>
+            </w:r>
+          </w:p>
+        </w:tc>
+        <w:tc>
+          <w:tcPr>
+            <w:tcW w:w="1900" w:type="dxa"/>
+            <w:shd w:fill="1F3864" w:color="1F3864" w:val="solid"/>
+            <w:tcMar>
+              <w:top w:type="dxa" w:w="60"/>
+              <w:left w:type="dxa" w:w="80"/>
+              <w:bottom w:type="dxa" w:w="60"/>
+              <w:right w:type="dxa" w:w="80"/>
+            </w:tcMar>
+          </w:tcPr>
+          <w:p>
+            <w:pPr>
+              <w:jc w:val="center"/>
+            </w:pPr>
+            <w:r>
+              <w:rPr>
+                <w:b/>
+                <w:bCs/>
+                <w:color w:val="FFFFFF"/>
+                <w:sz w:val="18"/>
+                <w:szCs w:val="18"/>
+              </w:rPr>
+              <w:t xml:space="preserve">Addresses banned</w:t>
+            </w:r>
+          </w:p>
+        </w:tc>
+      </w:tr>
+      <w:tr>
+        <w:tc>
+          <w:tcPr>
+            <w:tcW w:w="1200" w:type="dxa"/>
+            <w:tcMar>
+              <w:top w:type="dxa" w:w="60"/>
+              <w:left w:type="dxa" w:w="80"/>
+              <w:bottom w:type="dxa" w:w="60"/>
+              <w:right w:type="dxa" w:w="80"/>
+            </w:tcMar>
+          </w:tcPr>
+          <w:p>
+            <w:pPr>
+              <w:jc w:val="left"/>
+            </w:pPr>
+            <w:r>
+              <w:rPr>
+                <w:b w:val="false"/>
+                <w:bCs w:val="false"/>
+                <w:sz w:val="18"/>
+                <w:szCs w:val="18"/>
+              </w:rPr>
+              <w:t xml:space="preserve">1 Oct</w:t>
+            </w:r>
+          </w:p>
+        </w:tc>
+        <w:tc>
+          <w:tcPr>
+            <w:tcW w:w="2000" w:type="dxa"/>
+            <w:tcMar>
+              <w:top w:type="dxa" w:w="60"/>
+              <w:left w:type="dxa" w:w="80"/>
+              <w:bottom w:type="dxa" w:w="60"/>
+              <w:right w:type="dxa" w:w="80"/>
+            </w:tcMar>
+          </w:tcPr>
+          <w:p>
+            <w:pPr>
+              <w:jc w:val="right"/>
+            </w:pPr>
+            <w:r>
+              <w:rPr>
+                <w:b w:val="false"/>
+                <w:bCs w:val="false"/>
+                <w:sz w:val="18"/>
+                <w:szCs w:val="18"/>
+              </w:rPr>
+              <w:t xml:space="preserve">10</w:t>
+            </w:r>
+          </w:p>
+        </w:tc>
+        <w:tc>
+          <w:tcPr>
+            <w:tcW w:w="1200" w:type="dxa"/>
+            <w:tcMar>
+              <w:top w:type="dxa" w:w="60"/>
+              <w:left w:type="dxa" w:w="80"/>
+              <w:bottom w:type="dxa" w:w="60"/>
+              <w:right w:type="dxa" w:w="80"/>
+            </w:tcMar>
+          </w:tcPr>
+          <w:p>
+            <w:pPr>
+              <w:jc w:val="left"/>
+            </w:pPr>
+            <w:r>
+              <w:rPr>
+                <w:b w:val="false"/>
+                <w:bCs w:val="false"/>
+                <w:sz w:val="18"/>
+                <w:szCs w:val="18"/>
+              </w:rPr>
+              <w:t xml:space="preserve">9 Oct</w:t>
+            </w:r>
+          </w:p>
+        </w:tc>
+        <w:tc>
+          <w:tcPr>
+            <w:tcW w:w="2000" w:type="dxa"/>
+            <w:tcMar>
+              <w:top w:type="dxa" w:w="60"/>
+              <w:left w:type="dxa" w:w="80"/>
+              <w:bottom w:type="dxa" w:w="60"/>
+              <w:right w:type="dxa" w:w="80"/>
+            </w:tcMar>
+          </w:tcPr>
+          <w:p>
+            <w:pPr>
+              <w:jc w:val="right"/>
+            </w:pPr>
+            <w:r>
+              <w:rPr>
+                <w:b w:val="false"/>
+                <w:bCs w:val="false"/>
+                <w:sz w:val="18"/>
+                <w:szCs w:val="18"/>
+              </w:rPr>
+              <w:t xml:space="preserve">19</w:t>
+            </w:r>
+          </w:p>
+        </w:tc>
+        <w:tc>
+          <w:tcPr>
+            <w:tcW w:w="1200" w:type="dxa"/>
+            <w:tcMar>
+              <w:top w:type="dxa" w:w="60"/>
+              <w:left w:type="dxa" w:w="80"/>
+              <w:bottom w:type="dxa" w:w="60"/>
+              <w:right w:type="dxa" w:w="80"/>
+            </w:tcMar>
+          </w:tcPr>
+          <w:p>
+            <w:pPr>
+              <w:jc w:val="left"/>
+            </w:pPr>
+            <w:r>
+              <w:rPr>
+                <w:b w:val="false"/>
+                <w:bCs w:val="false"/>
+                <w:sz w:val="18"/>
+                <w:szCs w:val="18"/>
+              </w:rPr>
+              <w:t xml:space="preserve">17 Oct</w:t>
+            </w:r>
+          </w:p>
+        </w:tc>
+        <w:tc>
+          <w:tcPr>
+            <w:tcW w:w="1900" w:type="dxa"/>
+            <w:tcMar>
+              <w:top w:type="dxa" w:w="60"/>
+              <w:left w:type="dxa" w:w="80"/>
+              <w:bottom w:type="dxa" w:w="60"/>
+              <w:right w:type="dxa" w:w="80"/>
+            </w:tcMar>
+          </w:tcPr>
+          <w:p>
+            <w:pPr>
+              <w:jc w:val="right"/>
+            </w:pPr>
+            <w:r>
+              <w:rPr>
+                <w:b w:val="false"/>
+                <w:bCs w:val="false"/>
+                <w:sz w:val="18"/>
+                <w:szCs w:val="18"/>
+              </w:rPr>
+              <w:t xml:space="preserve">6</w:t>
+            </w:r>
+          </w:p>
+        </w:tc>
+      </w:tr>
+      <w:tr>
+        <w:tc>
+          <w:tcPr>
+            <w:tcW w:w="1200" w:type="dxa"/>
+            <w:tcMar>
+              <w:top w:type="dxa" w:w="60"/>
+              <w:left w:type="dxa" w:w="80"/>
+              <w:bottom w:type="dxa" w:w="60"/>
+              <w:right w:type="dxa" w:w="80"/>
+            </w:tcMar>
+          </w:tcPr>
+          <w:p>
+            <w:pPr>
+              <w:jc w:val="left"/>
+            </w:pPr>
+            <w:r>
+              <w:rPr>
+                <w:b w:val="false"/>
+                <w:bCs w:val="false"/>
+                <w:sz w:val="18"/>
+                <w:szCs w:val="18"/>
+              </w:rPr>
+              <w:t xml:space="preserve">2 Oct</w:t>
+            </w:r>
+          </w:p>
+        </w:tc>
+        <w:tc>
+          <w:tcPr>
+            <w:tcW w:w="2000" w:type="dxa"/>
+            <w:tcMar>
+              <w:top w:type="dxa" w:w="60"/>
+              <w:left w:type="dxa" w:w="80"/>
+              <w:bottom w:type="dxa" w:w="60"/>
+              <w:right w:type="dxa" w:w="80"/>
+            </w:tcMar>
+          </w:tcPr>
+          <w:p>
+            <w:pPr>
+              <w:jc w:val="right"/>
+            </w:pPr>
+            <w:r>
+              <w:rPr>
+                <w:b w:val="false"/>
+                <w:bCs w:val="false"/>
+                <w:sz w:val="18"/>
+                <w:szCs w:val="18"/>
+              </w:rPr>
+              <w:t xml:space="preserve">10</w:t>
+            </w:r>
+          </w:p>
+        </w:tc>
+        <w:tc>
+          <w:tcPr>
+            <w:tcW w:w="1200" w:type="dxa"/>
+            <w:tcMar>
+              <w:top w:type="dxa" w:w="60"/>
+              <w:left w:type="dxa" w:w="80"/>
+              <w:bottom w:type="dxa" w:w="60"/>
+              <w:right w:type="dxa" w:w="80"/>
+            </w:tcMar>
+          </w:tcPr>
+          <w:p>
+            <w:pPr>
+              <w:jc w:val="left"/>
+            </w:pPr>
+            <w:r>
+              <w:rPr>
+                <w:b w:val="false"/>
+                <w:bCs w:val="false"/>
+                <w:sz w:val="18"/>
+                <w:szCs w:val="18"/>
+              </w:rPr>
+              <w:t xml:space="preserve">10 Oct</w:t>
+            </w:r>
+          </w:p>
+        </w:tc>
+        <w:tc>
+          <w:tcPr>
+            <w:tcW w:w="2000" w:type="dxa"/>
+            <w:tcMar>
+              <w:top w:type="dxa" w:w="60"/>
+              <w:left w:type="dxa" w:w="80"/>
+              <w:bottom w:type="dxa" w:w="60"/>
+              <w:right w:type="dxa" w:w="80"/>
+            </w:tcMar>
+          </w:tcPr>
+          <w:p>
+            <w:pPr>
+              <w:jc w:val="right"/>
+            </w:pPr>
+            <w:r>
+              <w:rPr>
+                <w:b w:val="false"/>
+                <w:bCs w:val="false"/>
+                <w:sz w:val="18"/>
+                <w:szCs w:val="18"/>
+              </w:rPr>
+              <w:t xml:space="preserve">4</w:t>
+            </w:r>
+          </w:p>
+        </w:tc>
+        <w:tc>
+          <w:tcPr>
+            <w:tcW w:w="1200" w:type="dxa"/>
+            <w:tcMar>
+              <w:top w:type="dxa" w:w="60"/>
+              <w:left w:type="dxa" w:w="80"/>
+              <w:bottom w:type="dxa" w:w="60"/>
+              <w:right w:type="dxa" w:w="80"/>
+            </w:tcMar>
+          </w:tcPr>
+          <w:p>
+            <w:pPr>
+              <w:jc w:val="left"/>
+            </w:pPr>
+            <w:r>
+              <w:rPr>
+                <w:b w:val="false"/>
+                <w:bCs w:val="false"/>
+                <w:sz w:val="18"/>
+                <w:szCs w:val="18"/>
+              </w:rPr>
+              <w:t xml:space="preserve">18 Oct</w:t>
+            </w:r>
+          </w:p>
+        </w:tc>
+        <w:tc>
+          <w:tcPr>
+            <w:tcW w:w="1900" w:type="dxa"/>
+            <w:tcMar>
+              <w:top w:type="dxa" w:w="60"/>
+              <w:left w:type="dxa" w:w="80"/>
+              <w:bottom w:type="dxa" w:w="60"/>
+              <w:right w:type="dxa" w:w="80"/>
+            </w:tcMar>
+          </w:tcPr>
+          <w:p>
+            <w:pPr>
+              <w:jc w:val="right"/>
+            </w:pPr>
+            <w:r>
+              <w:rPr>
+                <w:b w:val="false"/>
+                <w:bCs w:val="false"/>
+                <w:sz w:val="18"/>
+                <w:szCs w:val="18"/>
+              </w:rPr>
+              <w:t xml:space="preserve">3</w:t>
+            </w:r>
+          </w:p>
+        </w:tc>
+      </w:tr>
+      <w:tr>
+        <w:tc>
+          <w:tcPr>
+            <w:tcW w:w="1200" w:type="dxa"/>
+            <w:tcMar>
+              <w:top w:type="dxa" w:w="60"/>
+              <w:left w:type="dxa" w:w="80"/>
+              <w:bottom w:type="dxa" w:w="60"/>
+              <w:right w:type="dxa" w:w="80"/>
+            </w:tcMar>
+          </w:tcPr>
+          <w:p>
+            <w:pPr>
+              <w:jc w:val="left"/>
+            </w:pPr>
+            <w:r>
+              <w:rPr>
+                <w:b w:val="false"/>
+                <w:bCs w:val="false"/>
+                <w:sz w:val="18"/>
+                <w:szCs w:val="18"/>
+              </w:rPr>
+              <w:t xml:space="preserve">3 Oct</w:t>
+            </w:r>
+          </w:p>
+        </w:tc>
+        <w:tc>
+          <w:tcPr>
+            <w:tcW w:w="2000" w:type="dxa"/>
+            <w:tcMar>
+              <w:top w:type="dxa" w:w="60"/>
+              <w:left w:type="dxa" w:w="80"/>
+              <w:bottom w:type="dxa" w:w="60"/>
+              <w:right w:type="dxa" w:w="80"/>
+            </w:tcMar>
+          </w:tcPr>
+          <w:p>
+            <w:pPr>
+              <w:jc w:val="right"/>
+            </w:pPr>
+            <w:r>
+              <w:rPr>
+                <w:b w:val="false"/>
+                <w:bCs w:val="false"/>
+                <w:sz w:val="18"/>
+                <w:szCs w:val="18"/>
+              </w:rPr>
+              <w:t xml:space="preserve">6</w:t>
+            </w:r>
+          </w:p>
+        </w:tc>
+        <w:tc>
+          <w:tcPr>
+            <w:tcW w:w="1200" w:type="dxa"/>
+            <w:tcMar>
+              <w:top w:type="dxa" w:w="60"/>
+              <w:left w:type="dxa" w:w="80"/>
+              <w:bottom w:type="dxa" w:w="60"/>
+              <w:right w:type="dxa" w:w="80"/>
+            </w:tcMar>
+          </w:tcPr>
+          <w:p>
+            <w:pPr>
+              <w:jc w:val="left"/>
+            </w:pPr>
+            <w:r>
+              <w:rPr>
+                <w:b w:val="false"/>
+                <w:bCs w:val="false"/>
+                <w:sz w:val="18"/>
+                <w:szCs w:val="18"/>
+              </w:rPr>
+              <w:t xml:space="preserve">11 Oct</w:t>
+            </w:r>
+          </w:p>
+        </w:tc>
+        <w:tc>
+          <w:tcPr>
+            <w:tcW w:w="2000" w:type="dxa"/>
+            <w:tcMar>
+              <w:top w:type="dxa" w:w="60"/>
+              <w:left w:type="dxa" w:w="80"/>
+              <w:bottom w:type="dxa" w:w="60"/>
+              <w:right w:type="dxa" w:w="80"/>
+            </w:tcMar>
+          </w:tcPr>
+          <w:p>
+            <w:pPr>
+              <w:jc w:val="right"/>
+            </w:pPr>
+            <w:r>
+              <w:rPr>
+                <w:b w:val="false"/>
+                <w:bCs w:val="false"/>
+                <w:sz w:val="18"/>
+                <w:szCs w:val="18"/>
+              </w:rPr>
+              <w:t xml:space="preserve">4</w:t>
+            </w:r>
+          </w:p>
+        </w:tc>
+        <w:tc>
+          <w:tcPr>
+            <w:tcW w:w="1200" w:type="dxa"/>
+            <w:tcMar>
+              <w:top w:type="dxa" w:w="60"/>
+              <w:left w:type="dxa" w:w="80"/>
+              <w:bottom w:type="dxa" w:w="60"/>
+              <w:right w:type="dxa" w:w="80"/>
+            </w:tcMar>
+          </w:tcPr>
+          <w:p>
+            <w:pPr>
+              <w:jc w:val="left"/>
+            </w:pPr>
+            <w:r>
+              <w:rPr>
+                <w:b w:val="false"/>
+                <w:bCs w:val="false"/>
+                <w:sz w:val="18"/>
+                <w:szCs w:val="18"/>
+              </w:rPr>
+              <w:t xml:space="preserve">19 Oct</w:t>
+            </w:r>
+          </w:p>
+        </w:tc>
+        <w:tc>
+          <w:tcPr>
+            <w:tcW w:w="1900" w:type="dxa"/>
+            <w:tcMar>
+              <w:top w:type="dxa" w:w="60"/>
+              <w:left w:type="dxa" w:w="80"/>
+              <w:bottom w:type="dxa" w:w="60"/>
+              <w:right w:type="dxa" w:w="80"/>
+            </w:tcMar>
+          </w:tcPr>
+          <w:p>
+            <w:pPr>
+              <w:jc w:val="right"/>
+            </w:pPr>
+            <w:r>
+              <w:rPr>
+                <w:b w:val="false"/>
+                <w:bCs w:val="false"/>
+                <w:sz w:val="18"/>
+                <w:szCs w:val="18"/>
+              </w:rPr>
+              <w:t xml:space="preserve">2</w:t>
+            </w:r>
+          </w:p>
+        </w:tc>
+      </w:tr>
+      <w:tr>
+        <w:tc>
+          <w:tcPr>
+            <w:tcW w:w="1200" w:type="dxa"/>
+            <w:tcMar>
+              <w:top w:type="dxa" w:w="60"/>
+              <w:left w:type="dxa" w:w="80"/>
+              <w:bottom w:type="dxa" w:w="60"/>
+              <w:right w:type="dxa" w:w="80"/>
+            </w:tcMar>
+          </w:tcPr>
+          <w:p>
+            <w:pPr>
+              <w:jc w:val="left"/>
+            </w:pPr>
+            <w:r>
+              <w:rPr>
+                <w:b w:val="false"/>
+                <w:bCs w:val="false"/>
+                <w:sz w:val="18"/>
+                <w:szCs w:val="18"/>
+              </w:rPr>
+              <w:t xml:space="preserve">4 Oct</w:t>
+            </w:r>
+          </w:p>
+        </w:tc>
+        <w:tc>
+          <w:tcPr>
+            <w:tcW w:w="2000" w:type="dxa"/>
+            <w:tcMar>
+              <w:top w:type="dxa" w:w="60"/>
+              <w:left w:type="dxa" w:w="80"/>
+              <w:bottom w:type="dxa" w:w="60"/>
+              <w:right w:type="dxa" w:w="80"/>
+            </w:tcMar>
+          </w:tcPr>
+          <w:p>
+            <w:pPr>
+              <w:jc w:val="right"/>
+            </w:pPr>
+            <w:r>
+              <w:rPr>
+                <w:b w:val="false"/>
+                <w:bCs w:val="false"/>
+                <w:sz w:val="18"/>
+                <w:szCs w:val="18"/>
+              </w:rPr>
+              <w:t xml:space="preserve">3</w:t>
+            </w:r>
+          </w:p>
+        </w:tc>
+        <w:tc>
+          <w:tcPr>
+            <w:tcW w:w="1200" w:type="dxa"/>
+            <w:tcMar>
+              <w:top w:type="dxa" w:w="60"/>
+              <w:left w:type="dxa" w:w="80"/>
+              <w:bottom w:type="dxa" w:w="60"/>
+              <w:right w:type="dxa" w:w="80"/>
+            </w:tcMar>
+          </w:tcPr>
+          <w:p>
+            <w:pPr>
+              <w:jc w:val="left"/>
+            </w:pPr>
+            <w:r>
+              <w:rPr>
+                <w:b w:val="false"/>
+                <w:bCs w:val="false"/>
+                <w:sz w:val="18"/>
+                <w:szCs w:val="18"/>
+              </w:rPr>
+              <w:t xml:space="preserve">13 Oct</w:t>
+            </w:r>
+          </w:p>
+        </w:tc>
+        <w:tc>
+          <w:tcPr>
+            <w:tcW w:w="2000" w:type="dxa"/>
+            <w:tcMar>
+              <w:top w:type="dxa" w:w="60"/>
+              <w:left w:type="dxa" w:w="80"/>
+              <w:bottom w:type="dxa" w:w="60"/>
+              <w:right w:type="dxa" w:w="80"/>
+            </w:tcMar>
+          </w:tcPr>
+          <w:p>
+            <w:pPr>
+              <w:jc w:val="right"/>
+            </w:pPr>
+            <w:r>
+              <w:rPr>
+                <w:b w:val="false"/>
+                <w:bCs w:val="false"/>
+                <w:sz w:val="18"/>
+                <w:szCs w:val="18"/>
+              </w:rPr>
+              <w:t xml:space="preserve">8</w:t>
+            </w:r>
+          </w:p>
+        </w:tc>
+        <w:tc>
+          <w:tcPr>
+            <w:tcW w:w="1200" w:type="dxa"/>
+            <w:tcMar>
+              <w:top w:type="dxa" w:w="60"/>
+              <w:left w:type="dxa" w:w="80"/>
+              <w:bottom w:type="dxa" w:w="60"/>
+              <w:right w:type="dxa" w:w="80"/>
+            </w:tcMar>
+          </w:tcPr>
+          <w:p>
+            <w:pPr>
+              <w:jc w:val="left"/>
+            </w:pPr>
+            <w:r>
+              <w:rPr>
+                <w:b w:val="false"/>
+                <w:bCs w:val="false"/>
+                <w:sz w:val="18"/>
+                <w:szCs w:val="18"/>
+              </w:rPr>
+              <w:t xml:space="preserve">20 Oct</w:t>
+            </w:r>
+          </w:p>
+        </w:tc>
+        <w:tc>
+          <w:tcPr>
+            <w:tcW w:w="1900" w:type="dxa"/>
+            <w:tcMar>
+              <w:top w:type="dxa" w:w="60"/>
+              <w:left w:type="dxa" w:w="80"/>
+              <w:bottom w:type="dxa" w:w="60"/>
+              <w:right w:type="dxa" w:w="80"/>
+            </w:tcMar>
+          </w:tcPr>
+          <w:p>
+            <w:pPr>
+              <w:jc w:val="right"/>
+            </w:pPr>
+            <w:r>
+              <w:rPr>
+                <w:b w:val="false"/>
+                <w:bCs w:val="false"/>
+                <w:sz w:val="18"/>
+                <w:szCs w:val="18"/>
+              </w:rPr>
+              <w:t xml:space="preserve">2</w:t>
+            </w:r>
+          </w:p>
+        </w:tc>
+      </w:tr>
+      <w:tr>
+        <w:tc>
+          <w:tcPr>
+            <w:tcW w:w="1200" w:type="dxa"/>
+            <w:tcMar>
+              <w:top w:type="dxa" w:w="60"/>
+              <w:left w:type="dxa" w:w="80"/>
+              <w:bottom w:type="dxa" w:w="60"/>
+              <w:right w:type="dxa" w:w="80"/>
+            </w:tcMar>
+          </w:tcPr>
+          <w:p>
+            <w:pPr>
+              <w:jc w:val="left"/>
+            </w:pPr>
+            <w:r>
+              <w:rPr>
+                <w:b w:val="false"/>
+                <w:bCs w:val="false"/>
+                <w:sz w:val="18"/>
+                <w:szCs w:val="18"/>
+              </w:rPr>
+              <w:t xml:space="preserve">5 Oct</w:t>
+            </w:r>
+          </w:p>
+        </w:tc>
+        <w:tc>
+          <w:tcPr>
+            <w:tcW w:w="2000" w:type="dxa"/>
+            <w:tcMar>
+              <w:top w:type="dxa" w:w="60"/>
+              <w:left w:type="dxa" w:w="80"/>
+              <w:bottom w:type="dxa" w:w="60"/>
+              <w:right w:type="dxa" w:w="80"/>
+            </w:tcMar>
+          </w:tcPr>
+          <w:p>
+            <w:pPr>
+              <w:jc w:val="right"/>
+            </w:pPr>
+            <w:r>
+              <w:rPr>
+                <w:b w:val="false"/>
+                <w:bCs w:val="false"/>
+                <w:sz w:val="18"/>
+                <w:szCs w:val="18"/>
+              </w:rPr>
+              <w:t xml:space="preserve">6</w:t>
+            </w:r>
+          </w:p>
+        </w:tc>
+        <w:tc>
+          <w:tcPr>
+            <w:tcW w:w="1200" w:type="dxa"/>
+            <w:tcMar>
+              <w:top w:type="dxa" w:w="60"/>
+              <w:left w:type="dxa" w:w="80"/>
+              <w:bottom w:type="dxa" w:w="60"/>
+              <w:right w:type="dxa" w:w="80"/>
+            </w:tcMar>
+          </w:tcPr>
+          <w:p>
+            <w:pPr>
+              <w:jc w:val="left"/>
+            </w:pPr>
+            <w:r>
+              <w:rPr>
+                <w:b w:val="false"/>
+                <w:bCs w:val="false"/>
+                <w:sz w:val="18"/>
+                <w:szCs w:val="18"/>
+              </w:rPr>
+              <w:t xml:space="preserve">16 Oct</w:t>
+            </w:r>
+          </w:p>
+        </w:tc>
+        <w:tc>
+          <w:tcPr>
+            <w:tcW w:w="2000" w:type="dxa"/>
+            <w:tcMar>
+              <w:top w:type="dxa" w:w="60"/>
+              <w:left w:type="dxa" w:w="80"/>
+              <w:bottom w:type="dxa" w:w="60"/>
+              <w:right w:type="dxa" w:w="80"/>
+            </w:tcMar>
+          </w:tcPr>
+          <w:p>
+            <w:pPr>
+              <w:jc w:val="right"/>
+            </w:pPr>
+            <w:r>
+              <w:rPr>
+                <w:b w:val="false"/>
+                <w:bCs w:val="false"/>
+                <w:sz w:val="18"/>
+                <w:szCs w:val="18"/>
+              </w:rPr>
+              <w:t xml:space="preserve">10</w:t>
+            </w:r>
+          </w:p>
+        </w:tc>
+        <w:tc>
+          <w:tcPr>
+            <w:tcW w:w="1200" w:type="dxa"/>
+            <w:tcMar>
+              <w:top w:type="dxa" w:w="60"/>
+              <w:left w:type="dxa" w:w="80"/>
+              <w:bottom w:type="dxa" w:w="60"/>
+              <w:right w:type="dxa" w:w="80"/>
+            </w:tcMar>
+          </w:tcPr>
+          <w:p>
+            <w:pPr>
+              <w:jc w:val="left"/>
+            </w:pPr>
+            <w:r>
+              <w:rPr>
+                <w:b w:val="false"/>
+                <w:bCs w:val="false"/>
+                <w:sz w:val="18"/>
+                <w:szCs w:val="18"/>
+              </w:rPr>
+              <w:t xml:space="preserve">21 Oct</w:t>
+            </w:r>
+          </w:p>
+        </w:tc>
+        <w:tc>
+          <w:tcPr>
+            <w:tcW w:w="1900" w:type="dxa"/>
+            <w:tcMar>
+              <w:top w:type="dxa" w:w="60"/>
+              <w:left w:type="dxa" w:w="80"/>
+              <w:bottom w:type="dxa" w:w="60"/>
+              <w:right w:type="dxa" w:w="80"/>
+            </w:tcMar>
+          </w:tcPr>
+          <w:p>
+            <w:pPr>
+              <w:jc w:val="right"/>
+            </w:pPr>
+            <w:r>
+              <w:rPr>
+                <w:b w:val="false"/>
+                <w:bCs w:val="false"/>
+                <w:sz w:val="18"/>
+                <w:szCs w:val="18"/>
+              </w:rPr>
+              <w:t xml:space="preserve">1</w:t>
+            </w:r>
+          </w:p>
+        </w:tc>
+      </w:tr>
+    </w:tbl>
+    <w:p>
+      <w:pPr>
+        <w:spacing w:after="60"/>
+      </w:pPr>
+    </w:p>
+    <w:p>
+      <w:pPr>
+        <w:spacing w:after="120"/>
+        <w:jc w:val="left"/>
+      </w:pPr>
+      <w:r>
+        <w:rPr>
+          <w:sz w:val="20"/>
+          <w:szCs w:val="20"/>
+        </w:rPr>
+        <w:t xml:space="preserve">Days not listed (6 to 8, 12, 14 and 15 October) had no new bans. The busiest day, 9 October, accounted for 19 of the 94. Bans are spread across 22 of the 24 hours of the day with no working-hours pattern, which fits automation rather than people.</w:t>
+      </w:r>
+    </w:p>
+    <w:p>
+      <w:pPr>
         <w:pStyle w:val="Heading1"/>
         <w:shd w:fill="1F3864" w:color="1F3864" w:val="solid"/>
         <w:spacing w:after="160" w:before="320"/>
@@ -9204,7 +12993,7 @@
           <w:sz w:val="20"/>
           <w:szCs w:val="20"/>
         </w:rPr>
-        <w:t xml:space="preserve">In production the plugin made 97 ban actions: 81 from sensitive-path probes, 10 from error bursts, 5 relayed from the proxy’s own blacklist and 1 from an exploit pattern; the ban typically landed within one to two seconds of the first probe. Source and test notes are in the plugin repository.</w:t>
+        <w:t xml:space="preserve">In production the plugin made 97 ban actions: 81 from sensitive-path probes, 10 from error bursts, 5 relayed from the proxy’s own blacklist and 1 from an exploit pattern. From the triggering request to the ban the median was 3 seconds, and 1 to 4 seconds for the path detector, which does most of the work (Section 4.5). Source and test notes are in the plugin repository.</w:t>
       </w:r>
     </w:p>
     <w:p>
@@ -9623,7 +13412,154 @@
         </w:rPr>
       </w:pPr>
       <w:r>
-        <w:t xml:space="preserve">8. Method and limits</w:t>
+        <w:t xml:space="preserve">8. Questions administrators ask</w:t>
+      </w:r>
+    </w:p>
+    <w:p>
+      <w:pPr>
+        <w:spacing w:after="120"/>
+        <w:jc w:val="left"/>
+      </w:pPr>
+      <w:r>
+        <w:rPr>
+          <w:b/>
+          <w:bCs/>
+          <w:sz w:val="20"/>
+          <w:szCs w:val="20"/>
+        </w:rPr>
+        <w:t xml:space="preserve">Is the edge not enough on its own? </w:t>
+      </w:r>
+      <w:r>
+        <w:rPr>
+          <w:sz w:val="20"/>
+          <w:szCs w:val="20"/>
+        </w:rPr>
+        <w:t xml:space="preserve">It stops most of it, but it never sees your application’s own logs, so it cannot react to what a scanner does once a request gets through. The proxy sees that, and acting on it at the edge is the point of the plugin.</w:t>
+      </w:r>
+    </w:p>
+    <w:p>
+      <w:pPr>
+        <w:spacing w:after="120"/>
+        <w:jc w:val="left"/>
+      </w:pPr>
+      <w:r>
+        <w:rPr>
+          <w:b/>
+          <w:bCs/>
+          <w:sz w:val="20"/>
+          <w:szCs w:val="20"/>
+        </w:rPr>
+        <w:t xml:space="preserve">Why not ban anything that returns a 404? </w:t>
+      </w:r>
+      <w:r>
+        <w:rPr>
+          <w:sz w:val="20"/>
+          <w:szCs w:val="20"/>
+        </w:rPr>
+        <w:t xml:space="preserve">Because legitimate clients get 404s too, and a ban on one locks someone out. The detectors look for requests only a scanner makes, or for a sustained burst of errors.</w:t>
+      </w:r>
+    </w:p>
+    <w:p>
+      <w:pPr>
+        <w:spacing w:after="120"/>
+        <w:jc w:val="left"/>
+      </w:pPr>
+      <w:r>
+        <w:rPr>
+          <w:b/>
+          <w:bCs/>
+          <w:sz w:val="20"/>
+          <w:szCs w:val="20"/>
+        </w:rPr>
+        <w:t xml:space="preserve">Why do bans expire? </w:t>
+      </w:r>
+      <w:r>
+        <w:rPr>
+          <w:sz w:val="20"/>
+          <w:szCs w:val="20"/>
+        </w:rPr>
+        <w:t xml:space="preserve">Cloud and relay addresses are recycled. A permanent list slowly fills with innocent tenants, and the free plan’s list quota is small. Fourteen days has worked; two addresses did come back after expiry and were caught again within seconds.</w:t>
+      </w:r>
+    </w:p>
+    <w:p>
+      <w:pPr>
+        <w:spacing w:after="120"/>
+        <w:jc w:val="left"/>
+      </w:pPr>
+      <w:r>
+        <w:rPr>
+          <w:b/>
+          <w:bCs/>
+          <w:sz w:val="20"/>
+          <w:szCs w:val="20"/>
+        </w:rPr>
+        <w:t xml:space="preserve">Did it ever ban something it should not have? </w:t>
+      </w:r>
+      <w:r>
+        <w:rPr>
+          <w:sz w:val="20"/>
+          <w:szCs w:val="20"/>
+        </w:rPr>
+        <w:t xml:space="preserve">Not that we found. One application’s own front-end file looks like a credential probe and would have banned its own users; it is allow-listed by exact path, with tests that lookalikes are still flagged.</w:t>
+      </w:r>
+    </w:p>
+    <w:p>
+      <w:pPr>
+        <w:spacing w:after="120"/>
+        <w:jc w:val="left"/>
+      </w:pPr>
+      <w:r>
+        <w:rPr>
+          <w:b/>
+          <w:bCs/>
+          <w:sz w:val="20"/>
+          <w:szCs w:val="20"/>
+        </w:rPr>
+        <w:t xml:space="preserve">Can I do this without Cloudflare? </w:t>
+      </w:r>
+      <w:r>
+        <w:rPr>
+          <w:sz w:val="20"/>
+          <w:szCs w:val="20"/>
+        </w:rPr>
+        <w:t xml:space="preserve">The proxy-side layer works on its own (the plugin can run with only Zoraxy’s blacklist), but you lose the earlier edge block and the free reputation-based rules.</w:t>
+      </w:r>
+    </w:p>
+    <w:p>
+      <w:pPr>
+        <w:spacing w:after="120"/>
+        <w:jc w:val="left"/>
+      </w:pPr>
+      <w:r>
+        <w:rPr>
+          <w:b/>
+          <w:bCs/>
+          <w:sz w:val="20"/>
+          <w:szCs w:val="20"/>
+        </w:rPr>
+        <w:t xml:space="preserve">Is my own traffic at risk? </w:t>
+      </w:r>
+      <w:r>
+        <w:rPr>
+          <w:sz w:val="20"/>
+          <w:szCs w:val="20"/>
+        </w:rPr>
+        <w:t xml:space="preserve">Private, loopback and Cloudflare’s published proxy addresses are never banned. Start in dry run for a day or two and compare what it would do with your own logs before you let it act.</w:t>
+      </w:r>
+    </w:p>
+    <w:p>
+      <w:pPr>
+        <w:pStyle w:val="Heading1"/>
+        <w:shd w:fill="1F3864" w:color="1F3864" w:val="solid"/>
+        <w:spacing w:after="160" w:before="320"/>
+        <w:rPr>
+          <w:b/>
+          <w:bCs/>
+          <w:color w:val="FFFFFF"/>
+        </w:rPr>
+      </w:pPr>
+      <w:r>
+        <w:t xml:space="preserve">9. Method and limits</w:t>
       </w:r>
     </w:p>
     <w:p>
@@ -9636,7 +13572,7 @@
           <w:sz w:val="20"/>
           <w:szCs w:val="20"/>
         </w:rPr>
-        <w:t xml:space="preserve">Source: Zoraxy’s monthly access log summarised by a weekly script (October from the scheduled run of 18 October 23:00; April to September from re-runs of the complete monthly logs). Request totals exclude a few user-interface noise patterns. “Outside” counts every address outside the private networks. The ban counts come from the plugin’s journal.</w:t>
+        <w:t xml:space="preserve">Source: Zoraxy’s monthly access log summarised by a weekly script (October from the scheduled run of 18 October 23:00; April to September from re-runs of the complete monthly logs). Request totals exclude a few user-interface noise patterns. “Outside” counts every address outside the private networks. The ban counts and ban times come from the plugin’s journal. Latency in Section 4.5 is from the triggering request in the access log to the plugin’s ban time (both in local time, one-second resolution); network operators in Section 4.4 come from public routing data.</w:t>
       </w:r>
     </w:p>
     <w:p>

</xml_diff>